<commit_message>
Se agregó precondición del correo electronico a RN y CU02
</commit_message>
<xml_diff>
--- a/Casos de Uso/CU-02-Registro_de_Caso.docx
+++ b/Casos de Uso/CU-02-Registro_de_Caso.docx
@@ -155,12 +155,6 @@
         <w:gridCol w:w="1035"/>
       </w:tblGrid>
       <w:tr>
-        <w:tblPrEx>
-          <w:tblCellMar>
-            <w:top w:w="0" w:type="dxa"/>
-            <w:bottom w:w="0" w:type="dxa"/>
-          </w:tblCellMar>
-        </w:tblPrEx>
         <w:tc>
           <w:tcPr>
             <w:tcW w:w="1705" w:type="pct"/>
@@ -277,12 +271,6 @@
         </w:tc>
       </w:tr>
       <w:tr>
-        <w:tblPrEx>
-          <w:tblCellMar>
-            <w:top w:w="0" w:type="dxa"/>
-            <w:bottom w:w="0" w:type="dxa"/>
-          </w:tblCellMar>
-        </w:tblPrEx>
         <w:tc>
           <w:tcPr>
             <w:tcW w:w="1705" w:type="pct"/>
@@ -387,12 +375,6 @@
         </w:tc>
       </w:tr>
       <w:tr>
-        <w:tblPrEx>
-          <w:tblCellMar>
-            <w:top w:w="0" w:type="dxa"/>
-            <w:bottom w:w="0" w:type="dxa"/>
-          </w:tblCellMar>
-        </w:tblPrEx>
         <w:tc>
           <w:tcPr>
             <w:tcW w:w="1705" w:type="pct"/>
@@ -453,12 +435,6 @@
         </w:tc>
       </w:tr>
       <w:tr>
-        <w:tblPrEx>
-          <w:tblCellMar>
-            <w:top w:w="0" w:type="dxa"/>
-            <w:bottom w:w="0" w:type="dxa"/>
-          </w:tblCellMar>
-        </w:tblPrEx>
         <w:tc>
           <w:tcPr>
             <w:tcW w:w="1705" w:type="pct"/>
@@ -525,12 +501,6 @@
         </w:tc>
       </w:tr>
       <w:tr>
-        <w:tblPrEx>
-          <w:tblCellMar>
-            <w:top w:w="0" w:type="dxa"/>
-            <w:bottom w:w="0" w:type="dxa"/>
-          </w:tblCellMar>
-        </w:tblPrEx>
         <w:tc>
           <w:tcPr>
             <w:tcW w:w="1705" w:type="pct"/>
@@ -597,12 +567,6 @@
         </w:tc>
       </w:tr>
       <w:tr>
-        <w:tblPrEx>
-          <w:tblCellMar>
-            <w:top w:w="0" w:type="dxa"/>
-            <w:bottom w:w="0" w:type="dxa"/>
-          </w:tblCellMar>
-        </w:tblPrEx>
         <w:tc>
           <w:tcPr>
             <w:tcW w:w="1705" w:type="pct"/>
@@ -685,12 +649,6 @@
         </w:tc>
       </w:tr>
       <w:tr>
-        <w:tblPrEx>
-          <w:tblCellMar>
-            <w:top w:w="0" w:type="dxa"/>
-            <w:bottom w:w="0" w:type="dxa"/>
-          </w:tblCellMar>
-        </w:tblPrEx>
         <w:tc>
           <w:tcPr>
             <w:tcW w:w="1705" w:type="pct"/>
@@ -773,12 +731,6 @@
         </w:tc>
       </w:tr>
       <w:tr>
-        <w:tblPrEx>
-          <w:tblCellMar>
-            <w:top w:w="0" w:type="dxa"/>
-            <w:bottom w:w="0" w:type="dxa"/>
-          </w:tblCellMar>
-        </w:tblPrEx>
         <w:tc>
           <w:tcPr>
             <w:tcW w:w="1705" w:type="pct"/>
@@ -1017,16 +969,7 @@
           <w:sz w:val="24"/>
           <w:szCs w:val="24"/>
         </w:rPr>
-        <w:t xml:space="preserve">Definición Caso </w:t>
-      </w:r>
-      <w:r>
-        <w:rPr>
-          <w:b/>
-          <w:bCs/>
-          <w:sz w:val="24"/>
-          <w:szCs w:val="24"/>
-        </w:rPr>
-        <w:t>de Uso</w:t>
+        <w:t>Definición Caso de Uso</w:t>
       </w:r>
     </w:p>
     <w:p>
@@ -1146,7 +1089,21 @@
           <w:sz w:val="24"/>
           <w:szCs w:val="24"/>
         </w:rPr>
-        <w:t xml:space="preserve">2. Que el ciudadano se encuentre registrado en la base precargada de ciudadanos de la Municipalidad </w:t>
+        <w:t>2. Que el ciudadano se encuentre registrado en la base precargada de ciudadanos de la Municipalidad</w:t>
+      </w:r>
+      <w:r>
+        <w:rPr>
+          <w:sz w:val="24"/>
+          <w:szCs w:val="24"/>
+        </w:rPr>
+        <w:t xml:space="preserve"> y tenga acceso a su correo electrónico.</w:t>
+      </w:r>
+      <w:r>
+        <w:rPr>
+          <w:sz w:val="24"/>
+          <w:szCs w:val="24"/>
+        </w:rPr>
+        <w:t xml:space="preserve"> </w:t>
       </w:r>
       <w:r>
         <w:rPr>
@@ -1212,14 +1169,7 @@
           <w:sz w:val="24"/>
           <w:szCs w:val="24"/>
         </w:rPr>
-        <w:t>2.</w:t>
-      </w:r>
-      <w:r>
-        <w:rPr>
-          <w:sz w:val="24"/>
-          <w:szCs w:val="24"/>
-        </w:rPr>
-        <w:t xml:space="preserve">3 </w:t>
+        <w:t xml:space="preserve">2.3 </w:t>
       </w:r>
       <w:r>
         <w:rPr>
@@ -1322,14 +1272,7 @@
           <w:sz w:val="24"/>
           <w:szCs w:val="24"/>
         </w:rPr>
-        <w:t>(DP</w:t>
-      </w:r>
-      <w:r>
-        <w:rPr>
-          <w:sz w:val="24"/>
-          <w:szCs w:val="24"/>
-        </w:rPr>
-        <w:t>I</w:t>
+        <w:t>(DPI</w:t>
       </w:r>
       <w:r>
         <w:rPr>
@@ -1394,21 +1337,7 @@
           <w:sz w:val="24"/>
           <w:szCs w:val="24"/>
         </w:rPr>
-        <w:t>2.</w:t>
-      </w:r>
-      <w:r>
-        <w:rPr>
-          <w:sz w:val="24"/>
-          <w:szCs w:val="24"/>
-        </w:rPr>
-        <w:t xml:space="preserve">3.3. El ciudadano </w:t>
-      </w:r>
-      <w:r>
-        <w:rPr>
-          <w:sz w:val="24"/>
-          <w:szCs w:val="24"/>
-        </w:rPr>
-        <w:t xml:space="preserve">ingresa el número de identificación. </w:t>
+        <w:t xml:space="preserve">2.3.3. El ciudadano ingresa el número de identificación. </w:t>
       </w:r>
       <w:r>
         <w:rPr>
@@ -1511,14 +1440,7 @@
           <w:sz w:val="24"/>
           <w:szCs w:val="24"/>
         </w:rPr>
-        <w:t xml:space="preserve"> automáticamente el nombre del ciuda</w:t>
-      </w:r>
-      <w:r>
-        <w:rPr>
-          <w:sz w:val="24"/>
-          <w:szCs w:val="24"/>
-        </w:rPr>
-        <w:t>dano</w:t>
+        <w:t xml:space="preserve"> automáticamente el nombre del ciudadano</w:t>
       </w:r>
       <w:r>
         <w:rPr>
@@ -1624,14 +1546,7 @@
           <w:sz w:val="24"/>
           <w:szCs w:val="24"/>
         </w:rPr>
-        <w:t>2.3.7. El ciudadano selecciona el tipo de caso y la categoría del problema: campo obli</w:t>
-      </w:r>
-      <w:r>
-        <w:rPr>
-          <w:sz w:val="24"/>
-          <w:szCs w:val="24"/>
-        </w:rPr>
-        <w:t xml:space="preserve">gatorio, </w:t>
+        <w:t xml:space="preserve">2.3.7. El ciudadano selecciona el tipo de caso y la categoría del problema: campo obligatorio, </w:t>
       </w:r>
       <w:r>
         <w:rPr>
@@ -1711,14 +1626,7 @@
           <w:sz w:val="24"/>
           <w:szCs w:val="24"/>
         </w:rPr>
-        <w:t xml:space="preserve">2.3.9. El ciudadano ingresa la dirección o ubicación del problema: </w:t>
-      </w:r>
-      <w:r>
-        <w:rPr>
-          <w:sz w:val="24"/>
-          <w:szCs w:val="24"/>
-        </w:rPr>
-        <w:t>campo obligatorio, texto de hasta 250 caracteres.</w:t>
+        <w:t>2.3.9. El ciudadano ingresa la dirección o ubicación del problema: campo obligatorio, texto de hasta 250 caracteres.</w:t>
       </w:r>
     </w:p>
     <w:p>
@@ -1781,14 +1689,7 @@
           <w:sz w:val="24"/>
           <w:szCs w:val="24"/>
         </w:rPr>
-        <w:t>M</w:t>
-      </w:r>
-      <w:r>
-        <w:rPr>
-          <w:sz w:val="24"/>
-          <w:szCs w:val="24"/>
-        </w:rPr>
-        <w:t xml:space="preserve">B </w:t>
+        <w:t xml:space="preserve">MB </w:t>
       </w:r>
       <w:r>
         <w:rPr>
@@ -1905,14 +1806,7 @@
           <w:sz w:val="24"/>
           <w:szCs w:val="24"/>
         </w:rPr>
-        <w:t>2.3.14. El sistema genera el código de segu</w:t>
-      </w:r>
-      <w:r>
-        <w:rPr>
-          <w:sz w:val="24"/>
-          <w:szCs w:val="24"/>
-        </w:rPr>
-        <w:t>imiento, único, con formato</w:t>
+        <w:t>2.3.14. El sistema genera el código de seguimiento, único, con formato</w:t>
       </w:r>
       <w:r>
         <w:rPr>
@@ -2317,16 +2211,7 @@
           <w:sz w:val="24"/>
           <w:szCs w:val="24"/>
         </w:rPr>
-        <w:t>[FA02] Ciudada</w:t>
-      </w:r>
-      <w:r>
-        <w:rPr>
-          <w:b/>
-          <w:bCs/>
-          <w:sz w:val="24"/>
-          <w:szCs w:val="24"/>
-        </w:rPr>
-        <w:t>no no encontrado en la base precargada</w:t>
+        <w:t>[FA02] Ciudadano no encontrado en la base precargada</w:t>
       </w:r>
     </w:p>
     <w:p>
@@ -2429,14 +2314,7 @@
           <w:sz w:val="24"/>
           <w:szCs w:val="24"/>
         </w:rPr>
-        <w:t>1. El sistema valida el tamaño y el formato del arch</w:t>
-      </w:r>
-      <w:r>
-        <w:rPr>
-          <w:sz w:val="24"/>
-          <w:szCs w:val="24"/>
-        </w:rPr>
-        <w:t>ivo adjunto.</w:t>
+        <w:t>1. El sistema valida el tamaño y el formato del archivo adjunto.</w:t>
       </w:r>
     </w:p>
     <w:p>
@@ -2544,14 +2422,7 @@
           <w:sz w:val="24"/>
           <w:szCs w:val="24"/>
         </w:rPr>
-        <w:t>El sistema valida que los campos obligatorios del form</w:t>
-      </w:r>
-      <w:r>
-        <w:rPr>
-          <w:sz w:val="24"/>
-          <w:szCs w:val="24"/>
-        </w:rPr>
-        <w:t xml:space="preserve">ulario contengan información </w:t>
+        <w:t xml:space="preserve">El sistema valida que los campos obligatorios del formulario contengan información </w:t>
       </w:r>
       <w:r>
         <w:rPr>
@@ -2740,14 +2611,7 @@
           <w:sz w:val="24"/>
           <w:szCs w:val="24"/>
         </w:rPr>
-        <w:t>1. El caso queda registrado en estado Registrado, con un código de seguimiento único asigna</w:t>
-      </w:r>
-      <w:r>
-        <w:rPr>
-          <w:sz w:val="24"/>
-          <w:szCs w:val="24"/>
-        </w:rPr>
-        <w:t>do.</w:t>
+        <w:t>1. El caso queda registrado en estado Registrado, con un código de seguimiento único asignado.</w:t>
       </w:r>
     </w:p>
     <w:p>
@@ -2906,14 +2770,7 @@
           <w:sz w:val="24"/>
           <w:szCs w:val="24"/>
         </w:rPr>
-        <w:t>3. Los catálogos utilizados en el formulario deberán consultarse d</w:t>
-      </w:r>
-      <w:r>
-        <w:rPr>
-          <w:sz w:val="24"/>
-          <w:szCs w:val="24"/>
-        </w:rPr>
-        <w:t xml:space="preserve">esde memoria caché, sin afectar el tiempo de respuesta del registro </w:t>
+        <w:t xml:space="preserve">3. Los catálogos utilizados en el formulario deberán consultarse desde memoria caché, sin afectar el tiempo de respuesta del registro </w:t>
       </w:r>
       <w:r>
         <w:rPr>
@@ -3018,12 +2875,6 @@
         <w:gridCol w:w="1835"/>
       </w:tblGrid>
       <w:tr>
-        <w:tblPrEx>
-          <w:tblCellMar>
-            <w:top w:w="0" w:type="dxa"/>
-            <w:bottom w:w="0" w:type="dxa"/>
-          </w:tblCellMar>
-        </w:tblPrEx>
         <w:tc>
           <w:tcPr>
             <w:tcW w:w="0" w:type="auto"/>
@@ -3116,12 +2967,6 @@
         </w:tc>
       </w:tr>
       <w:tr>
-        <w:tblPrEx>
-          <w:tblCellMar>
-            <w:top w:w="0" w:type="dxa"/>
-            <w:bottom w:w="0" w:type="dxa"/>
-          </w:tblCellMar>
-        </w:tblPrEx>
         <w:tc>
           <w:tcPr>
             <w:tcW w:w="0" w:type="auto"/>
@@ -3188,12 +3033,6 @@
         </w:tc>
       </w:tr>
       <w:tr>
-        <w:tblPrEx>
-          <w:tblCellMar>
-            <w:top w:w="0" w:type="dxa"/>
-            <w:bottom w:w="0" w:type="dxa"/>
-          </w:tblCellMar>
-        </w:tblPrEx>
         <w:tc>
           <w:tcPr>
             <w:tcW w:w="0" w:type="auto"/>

</xml_diff>

<commit_message>
Se implementa CU-02 registro de caso y se agrega el tipo Reclamo
El ciudadano registra queja, reclamo, denuncia o sugerencia desde el portal, con DPI, verificacion y codigo de seguimiento.
</commit_message>
<xml_diff>
--- a/Casos de Uso/CU-02-Registro_de_Caso.docx
+++ b/Casos de Uso/CU-02-Registro_de_Caso.docx
@@ -79,7 +79,7 @@
         <w:rPr>
           <w:lang w:val="es-ES"/>
         </w:rPr>
-        <w:t>Versión 1.0</w:t>
+        <w:t>Versión 1.1</w:t>
       </w:r>
     </w:p>
     <w:p>
@@ -387,7 +387,18 @@
           <w:p>
             <w:pPr>
               <w:spacing w:before="40" w:after="40"/>
+              <w:rPr>
+                <w:noProof/>
+                <w:lang w:val="es-GT"/>
+              </w:rPr>
             </w:pPr>
+            <w:r>
+              <w:rPr>
+                <w:noProof/>
+                <w:lang w:val="es-GT"/>
+              </w:rPr>
+              <w:t>grupo 1 Análisis de Sistemas 2</w:t>
+            </w:r>
           </w:p>
         </w:tc>
         <w:tc>
@@ -401,7 +412,18 @@
           <w:p>
             <w:pPr>
               <w:spacing w:before="40" w:after="40"/>
+              <w:rPr>
+                <w:noProof/>
+                <w:lang w:val="es-GT"/>
+              </w:rPr>
             </w:pPr>
+            <w:r>
+              <w:rPr>
+                <w:noProof/>
+                <w:lang w:val="es-GT"/>
+              </w:rPr>
+              <w:t>30/08/2026</w:t>
+            </w:r>
           </w:p>
         </w:tc>
         <w:tc>
@@ -415,7 +437,18 @@
           <w:p>
             <w:pPr>
               <w:spacing w:before="40" w:after="40"/>
+              <w:rPr>
+                <w:noProof/>
+                <w:lang w:val="es-GT"/>
+              </w:rPr>
             </w:pPr>
+            <w:r>
+              <w:rPr>
+                <w:noProof/>
+                <w:lang w:val="es-GT"/>
+              </w:rPr>
+              <w:t>Se agrega el tipo de caso Reclamo y se distingue de Queja</w:t>
+            </w:r>
           </w:p>
         </w:tc>
         <w:tc>
@@ -430,7 +463,18 @@
           <w:p>
             <w:pPr>
               <w:spacing w:before="40" w:after="40"/>
+              <w:rPr>
+                <w:noProof/>
+                <w:lang w:val="es-GT"/>
+              </w:rPr>
             </w:pPr>
+            <w:r>
+              <w:rPr>
+                <w:noProof/>
+                <w:lang w:val="es-GT"/>
+              </w:rPr>
+              <w:t>1.1</w:t>
+            </w:r>
           </w:p>
         </w:tc>
       </w:tr>
@@ -927,7 +971,7 @@
           <w:sz w:val="24"/>
           <w:szCs w:val="24"/>
         </w:rPr>
-        <w:t xml:space="preserve">Permitir que el ciudadano registre una queja, denuncia o sugerencia sobre un servicio municipal, identificándose contra la base precargada de ciudadanos, para que el caso quede disponible para su revisión por parte del Auxiliar </w:t>
+        <w:t xml:space="preserve">Permitir que el ciudadano registre una queja, reclamo, denuncia o sugerencia sobre un servicio municipal, identificándose contra la base precargada de ciudadanos, para que el caso quede disponible para su revisión por parte del Auxiliar </w:t>
       </w:r>
       <w:r>
         <w:rPr>
@@ -1513,7 +1557,7 @@
           <w:sz w:val="24"/>
           <w:szCs w:val="24"/>
         </w:rPr>
-        <w:t xml:space="preserve"> lista (Queja, Denuncia, Sugerencia) </w:t>
+        <w:t xml:space="preserve"> lista (Queja, Reclamo, Denuncia, Sugerencia) </w:t>
       </w:r>
       <w:r>
         <w:rPr>
@@ -1529,7 +1573,7 @@
           <w:sz w:val="24"/>
           <w:szCs w:val="24"/>
         </w:rPr>
-        <w:t>.</w:t>
+        <w:t>. La Queja expresa insatisfacción por la atención recibida o por un servicio municipal y no exige, por sí sola, el incumplimiento de un contrato o compra; el Reclamo exige una solución directa ante el incumplimiento de lo contratado o comprado (servicio, trámite, cobro o bien con la Municipalidad).</w:t>
       </w:r>
     </w:p>
     <w:p>

</xml_diff>

<commit_message>
Actualización CU y RN
</commit_message>
<xml_diff>
--- a/Casos de Uso/CU-02-Registro_de_Caso.docx
+++ b/Casos de Uso/CU-02-Registro_de_Caso.docx
@@ -1,6 +1,6 @@
 
 <file path=word/document.xml><?xml version="1.0" encoding="utf-8"?>
-<w:document xmlns:wpc="http://schemas.microsoft.com/office/word/2010/wordprocessingCanvas" xmlns:cx="http://schemas.microsoft.com/office/drawing/2014/chartex" xmlns:cx1="http://schemas.microsoft.com/office/drawing/2015/9/8/chartex" xmlns:cx2="http://schemas.microsoft.com/office/drawing/2015/10/21/chartex" xmlns:cx3="http://schemas.microsoft.com/office/drawing/2016/5/9/chartex" xmlns:cx4="http://schemas.microsoft.com/office/drawing/2016/5/10/chartex" xmlns:cx5="http://schemas.microsoft.com/office/drawing/2016/5/11/chartex" xmlns:cx6="http://schemas.microsoft.com/office/drawing/2016/5/12/chartex" xmlns:cx7="http://schemas.microsoft.com/office/drawing/2016/5/13/chartex" xmlns:cx8="http://schemas.microsoft.com/office/drawing/2016/5/14/chartex" xmlns:mc="http://schemas.openxmlformats.org/markup-compatibility/2006" xmlns:aink="http://schemas.microsoft.com/office/drawing/2016/ink" xmlns:am3d="http://schemas.microsoft.com/office/drawing/2017/model3d" xmlns:o="urn:schemas-microsoft-com:office:office" xmlns:oel="http://schemas.microsoft.com/office/2019/extlst" xmlns:r="http://schemas.openxmlformats.org/officeDocument/2006/relationships" xmlns:m="http://schemas.openxmlformats.org/officeDocument/2006/math" xmlns:v="urn:schemas-microsoft-com:vml" xmlns:wp14="http://schemas.microsoft.com/office/word/2010/wordprocessingDrawing" xmlns:wp="http://schemas.openxmlformats.org/drawingml/2006/wordprocessingDrawing" xmlns:w10="urn:schemas-microsoft-com:office:word" xmlns:w="http://schemas.openxmlformats.org/wordprocessingml/2006/main" xmlns:w14="http://schemas.microsoft.com/office/word/2010/wordml" xmlns:w15="http://schemas.microsoft.com/office/word/2012/wordml" xmlns:w16cei="http://schemas.microsoft.com/office/word/2026/wordml/cei" xmlns:w16cex="http://schemas.microsoft.com/office/word/2018/wordml/cex" xmlns:w16cid="http://schemas.microsoft.com/office/word/2016/wordml/cid" xmlns:w16="http://schemas.microsoft.com/office/word/2018/wordml" xmlns:w16du="http://schemas.microsoft.com/office/word/2023/wordml/word16du" xmlns:w16sdtdh="http://schemas.microsoft.com/office/word/2020/wordml/sdtdatahash" xmlns:w16sdtfl="http://schemas.microsoft.com/office/word/2024/wordml/sdtformatlock" xmlns:w16se="http://schemas.microsoft.com/office/word/2015/wordml/symex" xmlns:wpg="http://schemas.microsoft.com/office/word/2010/wordprocessingGroup" xmlns:wpi="http://schemas.microsoft.com/office/word/2010/wordprocessingInk" xmlns:wne="http://schemas.microsoft.com/office/word/2006/wordml" xmlns:wps="http://schemas.microsoft.com/office/word/2010/wordprocessingShape" mc:Ignorable="w14 w15 w16se w16cid w16 w16cex w16sdtdh w16sdtfl w16du wp14">
+<w:document xmlns:wpc="http://schemas.microsoft.com/office/word/2010/wordprocessingCanvas" xmlns:cx="http://schemas.microsoft.com/office/drawing/2014/chartex" xmlns:cx1="http://schemas.microsoft.com/office/drawing/2015/9/8/chartex" xmlns:cx2="http://schemas.microsoft.com/office/drawing/2015/10/21/chartex" xmlns:cx3="http://schemas.microsoft.com/office/drawing/2016/5/9/chartex" xmlns:cx4="http://schemas.microsoft.com/office/drawing/2016/5/10/chartex" xmlns:cx5="http://schemas.microsoft.com/office/drawing/2016/5/11/chartex" xmlns:cx6="http://schemas.microsoft.com/office/drawing/2016/5/12/chartex" xmlns:cx7="http://schemas.microsoft.com/office/drawing/2016/5/13/chartex" xmlns:cx8="http://schemas.microsoft.com/office/drawing/2016/5/14/chartex" xmlns:mc="http://schemas.openxmlformats.org/markup-compatibility/2006" xmlns:aink="http://schemas.microsoft.com/office/drawing/2016/ink" xmlns:am3d="http://schemas.microsoft.com/office/drawing/2017/model3d" xmlns:o="urn:schemas-microsoft-com:office:office" xmlns:oel="http://schemas.microsoft.com/office/2019/extlst" xmlns:r="http://schemas.openxmlformats.org/officeDocument/2006/relationships" xmlns:m="http://schemas.openxmlformats.org/officeDocument/2006/math" xmlns:v="urn:schemas-microsoft-com:vml" xmlns:wp14="http://schemas.microsoft.com/office/word/2010/wordprocessingDrawing" xmlns:wp="http://schemas.openxmlformats.org/drawingml/2006/wordprocessingDrawing" xmlns:w10="urn:schemas-microsoft-com:office:word" xmlns:w="http://schemas.openxmlformats.org/wordprocessingml/2006/main" xmlns:w14="http://schemas.microsoft.com/office/word/2010/wordml" xmlns:w15="http://schemas.microsoft.com/office/word/2012/wordml" xmlns:w16cex="http://schemas.microsoft.com/office/word/2018/wordml/cex" xmlns:w16cid="http://schemas.microsoft.com/office/word/2016/wordml/cid" xmlns:w16="http://schemas.microsoft.com/office/word/2018/wordml" xmlns:w16du="http://schemas.microsoft.com/office/word/2023/wordml/word16du" xmlns:w16sdtdh="http://schemas.microsoft.com/office/word/2020/wordml/sdtdatahash" xmlns:w16sdtfl="http://schemas.microsoft.com/office/word/2024/wordml/sdtformatlock" xmlns:w16se="http://schemas.microsoft.com/office/word/2015/wordml/symex" xmlns:wpg="http://schemas.microsoft.com/office/word/2010/wordprocessingGroup" xmlns:wpi="http://schemas.microsoft.com/office/word/2010/wordprocessingInk" xmlns:wne="http://schemas.microsoft.com/office/word/2006/wordml" xmlns:wps="http://schemas.microsoft.com/office/word/2010/wordprocessingShape" mc:Ignorable="w14 w15 w16se w16cid w16 w16cex w16sdtdh w16sdtfl w16du wp14">
   <w:body>
     <w:p>
       <w:pPr>
@@ -857,144 +857,1081 @@
     </w:p>
     <w:p>
       <w:pPr>
-        <w:pStyle w:val="NormalWeb"/>
+        <w:pStyle w:val="Ttulo1"/>
         <w:numPr>
           <w:ilvl w:val="0"/>
-          <w:numId w:val="7"/>
+          <w:numId w:val="24"/>
         </w:numPr>
-        <w:spacing w:line="360" w:lineRule="auto"/>
-        <w:ind w:right="300"/>
+        <w:rPr>
+          <w:sz w:val="28"/>
+          <w:szCs w:val="28"/>
+          <w:lang w:val="es-ES_tradnl"/>
+        </w:rPr>
+      </w:pPr>
+      <w:r>
+        <w:rPr>
+          <w:rFonts w:ascii="Arial" w:hAnsi="Arial" w:cs="Arial"/>
+          <w:lang w:val="es-ES_tradnl"/>
+        </w:rPr>
+        <w:br w:type="page"/>
+      </w:r>
+      <w:r>
+        <w:rPr>
+          <w:sz w:val="28"/>
+          <w:szCs w:val="28"/>
+          <w:lang w:val="es-ES_tradnl"/>
+        </w:rPr>
+        <w:lastRenderedPageBreak/>
+        <w:t>Introducción</w:t>
+      </w:r>
+    </w:p>
+    <w:p>
+      <w:pPr>
+        <w:pStyle w:val="Ttulo1"/>
+        <w:numPr>
+          <w:ilvl w:val="1"/>
+          <w:numId w:val="24"/>
+        </w:numPr>
+        <w:rPr>
+          <w:sz w:val="24"/>
+          <w:szCs w:val="24"/>
+          <w:lang w:val="es-ES_tradnl"/>
+        </w:rPr>
+      </w:pPr>
+      <w:r>
+        <w:rPr>
+          <w:sz w:val="24"/>
+          <w:szCs w:val="24"/>
+          <w:lang w:val="es-ES_tradnl"/>
+        </w:rPr>
+        <w:t>Objetivo</w:t>
+      </w:r>
+    </w:p>
+    <w:p>
+      <w:pPr>
+        <w:rPr>
+          <w:sz w:val="20"/>
+          <w:szCs w:val="20"/>
+          <w:lang w:val="es-ES_tradnl"/>
+        </w:rPr>
+      </w:pPr>
+      <w:r>
+        <w:rPr>
+          <w:sz w:val="20"/>
+          <w:szCs w:val="20"/>
+          <w:lang w:val="es-ES_tradnl"/>
+        </w:rPr>
+        <w:t>Permitir que el ciudadano registre una queja, reclamo, denuncia o sugerencia sobre un servicio municipal, identificándose contra la base precargada de ciudadanos.</w:t>
+      </w:r>
+    </w:p>
+    <w:p>
+      <w:pPr>
+        <w:pStyle w:val="Ttulo1"/>
+        <w:numPr>
+          <w:ilvl w:val="0"/>
+          <w:numId w:val="24"/>
+        </w:numPr>
+        <w:rPr>
+          <w:sz w:val="28"/>
+          <w:szCs w:val="28"/>
+          <w:lang w:val="es-ES_tradnl"/>
+        </w:rPr>
+      </w:pPr>
+      <w:r>
+        <w:rPr>
+          <w:sz w:val="28"/>
+          <w:szCs w:val="28"/>
+          <w:lang w:val="es-ES_tradnl"/>
+        </w:rPr>
+        <w:t xml:space="preserve">Definición </w:t>
+      </w:r>
+      <w:r>
+        <w:rPr>
+          <w:sz w:val="28"/>
+          <w:szCs w:val="28"/>
+          <w:lang w:val="es-ES_tradnl"/>
+        </w:rPr>
+        <w:t>Caso de Uso</w:t>
+      </w:r>
+    </w:p>
+    <w:p>
+      <w:pPr>
+        <w:pStyle w:val="Ttulo1"/>
+        <w:numPr>
+          <w:ilvl w:val="1"/>
+          <w:numId w:val="24"/>
+        </w:numPr>
+        <w:rPr>
+          <w:sz w:val="24"/>
+          <w:szCs w:val="24"/>
+          <w:lang w:val="es-ES_tradnl"/>
+        </w:rPr>
+      </w:pPr>
+      <w:r>
+        <w:rPr>
+          <w:sz w:val="24"/>
+          <w:szCs w:val="24"/>
+          <w:lang w:val="es-ES_tradnl"/>
+        </w:rPr>
+        <w:t>Actores</w:t>
+      </w:r>
+    </w:p>
+    <w:p>
+      <w:pPr>
+        <w:numPr>
+          <w:ilvl w:val="2"/>
+          <w:numId w:val="24"/>
+        </w:numPr>
+        <w:rPr>
+          <w:sz w:val="20"/>
+          <w:szCs w:val="20"/>
+          <w:lang w:val="es-ES_tradnl"/>
+        </w:rPr>
+      </w:pPr>
+      <w:r>
+        <w:rPr>
+          <w:sz w:val="20"/>
+          <w:szCs w:val="20"/>
+          <w:lang w:val="es-ES_tradnl"/>
+        </w:rPr>
+        <w:t xml:space="preserve">Sistema </w:t>
+      </w:r>
+      <w:r>
+        <w:rPr>
+          <w:sz w:val="20"/>
+          <w:szCs w:val="20"/>
+          <w:lang w:val="es-ES_tradnl"/>
+        </w:rPr>
+        <w:t>web</w:t>
+      </w:r>
+    </w:p>
+    <w:p>
+      <w:pPr>
+        <w:numPr>
+          <w:ilvl w:val="2"/>
+          <w:numId w:val="24"/>
+        </w:numPr>
+        <w:rPr>
+          <w:sz w:val="20"/>
+          <w:szCs w:val="20"/>
+          <w:lang w:val="es-ES_tradnl"/>
+        </w:rPr>
+      </w:pPr>
+      <w:r>
+        <w:rPr>
+          <w:sz w:val="20"/>
+          <w:szCs w:val="20"/>
+          <w:lang w:val="es-ES_tradnl"/>
+        </w:rPr>
+        <w:t>Usuario c</w:t>
+      </w:r>
+      <w:r>
+        <w:rPr>
+          <w:sz w:val="20"/>
+          <w:szCs w:val="20"/>
+          <w:lang w:val="es-ES_tradnl"/>
+        </w:rPr>
+        <w:t>iudadano</w:t>
+      </w:r>
+    </w:p>
+    <w:p>
+      <w:pPr>
+        <w:pStyle w:val="Ttulo1"/>
+        <w:numPr>
+          <w:ilvl w:val="1"/>
+          <w:numId w:val="24"/>
+        </w:numPr>
+        <w:rPr>
+          <w:sz w:val="24"/>
+          <w:szCs w:val="24"/>
+          <w:lang w:val="es-ES_tradnl"/>
+        </w:rPr>
+      </w:pPr>
+      <w:r>
+        <w:rPr>
+          <w:sz w:val="24"/>
+          <w:szCs w:val="24"/>
+          <w:lang w:val="es-ES_tradnl"/>
+        </w:rPr>
+        <w:t>Precondiciones</w:t>
+      </w:r>
+    </w:p>
+    <w:p>
+      <w:pPr>
+        <w:numPr>
+          <w:ilvl w:val="2"/>
+          <w:numId w:val="24"/>
+        </w:numPr>
+        <w:rPr>
+          <w:sz w:val="20"/>
+          <w:szCs w:val="20"/>
+          <w:lang w:val="es-ES_tradnl"/>
+        </w:rPr>
+      </w:pPr>
+      <w:r>
+        <w:rPr>
+          <w:sz w:val="20"/>
+          <w:szCs w:val="20"/>
+          <w:lang w:val="es-ES_tradnl"/>
+        </w:rPr>
+        <w:t>Que el sistema web se encuentre disponible.</w:t>
+      </w:r>
+    </w:p>
+    <w:p>
+      <w:pPr>
+        <w:numPr>
+          <w:ilvl w:val="2"/>
+          <w:numId w:val="24"/>
+        </w:numPr>
+        <w:rPr>
+          <w:sz w:val="20"/>
+          <w:szCs w:val="20"/>
+          <w:lang w:val="es-ES_tradnl"/>
+        </w:rPr>
+      </w:pPr>
+      <w:r>
+        <w:rPr>
+          <w:sz w:val="20"/>
+          <w:szCs w:val="20"/>
+          <w:lang w:val="es-ES_tradnl"/>
+        </w:rPr>
+        <w:t xml:space="preserve">Que el </w:t>
+      </w:r>
+      <w:r>
+        <w:rPr>
+          <w:sz w:val="20"/>
+          <w:szCs w:val="20"/>
+          <w:lang w:val="es-ES_tradnl"/>
+        </w:rPr>
+        <w:t>usuario</w:t>
+      </w:r>
+      <w:r>
+        <w:rPr>
+          <w:sz w:val="20"/>
+          <w:szCs w:val="20"/>
+          <w:lang w:val="es-ES_tradnl"/>
+        </w:rPr>
+        <w:t xml:space="preserve"> se encuentre registrado en la base precargada de ciudadanos de la Municipalidad y tenga acceso a su correo electrónico. La actualización del correo electrónico solo puede efectuarse de manera presencial, ya que no forma parte de este sistema.</w:t>
+      </w:r>
+    </w:p>
+    <w:p>
+      <w:pPr>
+        <w:pStyle w:val="Ttulo1"/>
+        <w:numPr>
+          <w:ilvl w:val="1"/>
+          <w:numId w:val="24"/>
+        </w:numPr>
+        <w:rPr>
+          <w:sz w:val="24"/>
+          <w:szCs w:val="24"/>
+          <w:lang w:val="es-ES_tradnl"/>
+        </w:rPr>
+      </w:pPr>
+      <w:r>
+        <w:rPr>
+          <w:sz w:val="24"/>
+          <w:szCs w:val="24"/>
+          <w:lang w:val="es-ES_tradnl"/>
+        </w:rPr>
+        <w:t xml:space="preserve">Flujo </w:t>
+      </w:r>
+      <w:r>
+        <w:rPr>
+          <w:sz w:val="24"/>
+          <w:szCs w:val="24"/>
+          <w:lang w:val="es-ES_tradnl"/>
+        </w:rPr>
+        <w:t>Normal Básico</w:t>
+      </w:r>
+    </w:p>
+    <w:p>
+      <w:pPr>
+        <w:numPr>
+          <w:ilvl w:val="0"/>
+          <w:numId w:val="26"/>
+        </w:numPr>
+        <w:rPr>
+          <w:sz w:val="20"/>
+          <w:szCs w:val="20"/>
+          <w:lang w:val="es-ES_tradnl"/>
+        </w:rPr>
+      </w:pPr>
+      <w:r>
+        <w:rPr>
+          <w:sz w:val="20"/>
+          <w:szCs w:val="20"/>
+          <w:lang w:val="es-ES_tradnl"/>
+        </w:rPr>
+        <w:t xml:space="preserve">El </w:t>
+      </w:r>
+      <w:r>
+        <w:rPr>
+          <w:sz w:val="20"/>
+          <w:szCs w:val="20"/>
+          <w:lang w:val="es-ES_tradnl"/>
+        </w:rPr>
+        <w:t xml:space="preserve">usuario inicia sesión. </w:t>
+      </w:r>
+      <w:r>
         <w:rPr>
           <w:b/>
           <w:bCs/>
-          <w:sz w:val="27"/>
-          <w:szCs w:val="27"/>
-          <w:lang w:val="es-ES_tradnl"/>
-        </w:rPr>
-      </w:pPr>
-      <w:r>
-        <w:rPr>
-          <w:rFonts w:ascii="Arial" w:hAnsi="Arial" w:cs="Arial"/>
+          <w:sz w:val="20"/>
+          <w:szCs w:val="20"/>
+          <w:lang w:val="es-ES_tradnl"/>
+        </w:rPr>
+        <w:t>Ver CU</w:t>
+      </w:r>
+      <w:r>
+        <w:rPr>
           <w:b/>
           <w:bCs/>
-          <w:sz w:val="27"/>
-          <w:szCs w:val="27"/>
-          <w:lang w:val="es-ES_tradnl"/>
-        </w:rPr>
-        <w:br w:type="page"/>
+          <w:sz w:val="20"/>
+          <w:szCs w:val="20"/>
+          <w:lang w:val="es-ES_tradnl"/>
+        </w:rPr>
+        <w:t>01</w:t>
+      </w:r>
+    </w:p>
+    <w:p>
+      <w:pPr>
+        <w:numPr>
+          <w:ilvl w:val="0"/>
+          <w:numId w:val="26"/>
+        </w:numPr>
+        <w:rPr>
+          <w:sz w:val="20"/>
+          <w:szCs w:val="20"/>
+          <w:lang w:val="es-ES_tradnl"/>
+        </w:rPr>
+      </w:pPr>
+      <w:r>
+        <w:rPr>
+          <w:sz w:val="20"/>
+          <w:szCs w:val="20"/>
+          <w:lang w:val="es-ES_tradnl"/>
+        </w:rPr>
+        <w:t>El sistema muestra la bandeja principal</w:t>
+      </w:r>
+      <w:r>
+        <w:rPr>
+          <w:sz w:val="20"/>
+          <w:szCs w:val="20"/>
+          <w:lang w:val="es-ES_tradnl"/>
+        </w:rPr>
+        <w:t xml:space="preserve"> con los siguientes menús.</w:t>
+      </w:r>
+    </w:p>
+    <w:p>
+      <w:pPr>
+        <w:numPr>
+          <w:ilvl w:val="1"/>
+          <w:numId w:val="26"/>
+        </w:numPr>
+        <w:rPr>
+          <w:sz w:val="20"/>
+          <w:szCs w:val="20"/>
+          <w:lang w:val="es-ES_tradnl"/>
+        </w:rPr>
+      </w:pPr>
+      <w:r>
+        <w:rPr>
+          <w:sz w:val="20"/>
+          <w:szCs w:val="20"/>
+          <w:lang w:val="es-ES_tradnl"/>
+        </w:rPr>
+        <w:t>Ingresar</w:t>
+      </w:r>
+      <w:r>
+        <w:rPr>
+          <w:sz w:val="20"/>
+          <w:szCs w:val="20"/>
+          <w:lang w:val="es-ES_tradnl"/>
+        </w:rPr>
+        <w:t xml:space="preserve"> Caso</w:t>
+      </w:r>
+    </w:p>
+    <w:p>
+      <w:pPr>
+        <w:numPr>
+          <w:ilvl w:val="1"/>
+          <w:numId w:val="26"/>
+        </w:numPr>
+        <w:rPr>
+          <w:sz w:val="20"/>
+          <w:szCs w:val="20"/>
+          <w:lang w:val="es-ES_tradnl"/>
+        </w:rPr>
+      </w:pPr>
+      <w:r>
+        <w:rPr>
+          <w:sz w:val="20"/>
+          <w:szCs w:val="20"/>
+          <w:lang w:val="es-ES_tradnl"/>
+        </w:rPr>
+        <w:t>Consultar Caso</w:t>
+      </w:r>
+      <w:r>
+        <w:rPr>
+          <w:sz w:val="20"/>
+          <w:szCs w:val="20"/>
+          <w:lang w:val="es-ES_tradnl"/>
+        </w:rPr>
+        <w:t xml:space="preserve"> </w:t>
       </w:r>
       <w:r>
         <w:rPr>
           <w:b/>
           <w:bCs/>
-          <w:sz w:val="27"/>
-          <w:szCs w:val="27"/>
-          <w:lang w:val="es-ES_tradnl"/>
-        </w:rPr>
-        <w:lastRenderedPageBreak/>
-        <w:t>Introducción</w:t>
+          <w:sz w:val="20"/>
+          <w:szCs w:val="20"/>
+          <w:lang w:val="es-ES_tradnl"/>
+        </w:rPr>
+        <w:t>Ver CU</w:t>
+      </w:r>
+      <w:r>
+        <w:rPr>
+          <w:b/>
+          <w:bCs/>
+          <w:sz w:val="20"/>
+          <w:szCs w:val="20"/>
+          <w:lang w:val="es-ES_tradnl"/>
+        </w:rPr>
+        <w:t>03</w:t>
       </w:r>
     </w:p>
     <w:p>
       <w:pPr>
-        <w:pStyle w:val="NormalWeb"/>
         <w:numPr>
           <w:ilvl w:val="1"/>
-          <w:numId w:val="7"/>
+          <w:numId w:val="26"/>
         </w:numPr>
-        <w:spacing w:line="360" w:lineRule="auto"/>
-        <w:ind w:right="300"/>
+        <w:rPr>
+          <w:sz w:val="20"/>
+          <w:szCs w:val="20"/>
+          <w:lang w:val="es-ES_tradnl"/>
+        </w:rPr>
+      </w:pPr>
+      <w:r>
+        <w:rPr>
+          <w:sz w:val="20"/>
+          <w:szCs w:val="20"/>
+          <w:lang w:val="es-ES_tradnl"/>
+        </w:rPr>
+        <w:t>Ampliar Caso</w:t>
+      </w:r>
+      <w:r>
+        <w:rPr>
+          <w:sz w:val="20"/>
+          <w:szCs w:val="20"/>
+          <w:lang w:val="es-ES_tradnl"/>
+        </w:rPr>
+        <w:t xml:space="preserve"> </w:t>
+      </w:r>
+      <w:r>
         <w:rPr>
           <w:b/>
           <w:bCs/>
-          <w:sz w:val="27"/>
-          <w:szCs w:val="27"/>
-          <w:lang w:val="es-ES_tradnl"/>
-        </w:rPr>
-      </w:pPr>
+          <w:sz w:val="20"/>
+          <w:szCs w:val="20"/>
+          <w:highlight w:val="yellow"/>
+          <w:lang w:val="es-ES_tradnl"/>
+        </w:rPr>
+        <w:t>Ver CU</w:t>
+      </w:r>
+    </w:p>
+    <w:p>
+      <w:pPr>
+        <w:numPr>
+          <w:ilvl w:val="1"/>
+          <w:numId w:val="26"/>
+        </w:numPr>
+        <w:rPr>
+          <w:sz w:val="20"/>
+          <w:szCs w:val="20"/>
+          <w:lang w:val="es-ES_tradnl"/>
+        </w:rPr>
+      </w:pPr>
+      <w:r>
+        <w:rPr>
+          <w:sz w:val="20"/>
+          <w:szCs w:val="20"/>
+          <w:lang w:val="es-ES_tradnl"/>
+        </w:rPr>
+        <w:t xml:space="preserve">Cerrar </w:t>
+      </w:r>
+      <w:r>
+        <w:rPr>
+          <w:sz w:val="20"/>
+          <w:szCs w:val="20"/>
+          <w:lang w:val="es-ES_tradnl"/>
+        </w:rPr>
+        <w:t>Sesión</w:t>
+      </w:r>
+      <w:r>
+        <w:rPr>
+          <w:sz w:val="20"/>
+          <w:szCs w:val="20"/>
+          <w:lang w:val="es-ES_tradnl"/>
+        </w:rPr>
+        <w:t xml:space="preserve"> </w:t>
+      </w:r>
       <w:r>
         <w:rPr>
           <w:b/>
           <w:bCs/>
-          <w:sz w:val="27"/>
-          <w:szCs w:val="27"/>
-          <w:lang w:val="es-ES_tradnl"/>
-        </w:rPr>
-        <w:t>Objetivo</w:t>
+          <w:sz w:val="20"/>
+          <w:szCs w:val="20"/>
+          <w:lang w:val="es-ES_tradnl"/>
+        </w:rPr>
+        <w:t>FA</w:t>
+      </w:r>
+      <w:r>
+        <w:rPr>
+          <w:b/>
+          <w:bCs/>
+          <w:sz w:val="20"/>
+          <w:szCs w:val="20"/>
+          <w:lang w:val="es-ES_tradnl"/>
+        </w:rPr>
+        <w:t>01</w:t>
       </w:r>
     </w:p>
     <w:p>
       <w:pPr>
-        <w:pStyle w:val="NormalWeb"/>
-        <w:spacing w:line="360" w:lineRule="auto"/>
-        <w:ind w:left="360" w:right="300"/>
-        <w:rPr>
-          <w:sz w:val="20"/>
-          <w:szCs w:val="20"/>
-          <w:lang w:val="es-ES_tradnl"/>
-        </w:rPr>
-      </w:pPr>
-      <w:r>
-        <w:rPr>
-          <w:sz w:val="20"/>
-          <w:szCs w:val="20"/>
-          <w:lang w:val="es-ES_tradnl"/>
-        </w:rPr>
-        <w:t>Permitir que el ciudadano registre una queja, reclamo, denuncia o sugerencia sobre un servicio municipal, identificándose contra la base precargada de ciudadanos.</w:t>
+        <w:numPr>
+          <w:ilvl w:val="0"/>
+          <w:numId w:val="26"/>
+        </w:numPr>
+        <w:rPr>
+          <w:sz w:val="20"/>
+          <w:szCs w:val="20"/>
+          <w:lang w:val="es-ES_tradnl"/>
+        </w:rPr>
+      </w:pPr>
+      <w:r>
+        <w:rPr>
+          <w:sz w:val="20"/>
+          <w:szCs w:val="20"/>
+          <w:lang w:val="es-ES_tradnl"/>
+        </w:rPr>
+        <w:t>El usuario selecciona el menú “</w:t>
+      </w:r>
+      <w:r>
+        <w:rPr>
+          <w:sz w:val="20"/>
+          <w:szCs w:val="20"/>
+          <w:lang w:val="es-ES_tradnl"/>
+        </w:rPr>
+        <w:t>Ingresar</w:t>
+      </w:r>
+      <w:r>
+        <w:rPr>
+          <w:sz w:val="20"/>
+          <w:szCs w:val="20"/>
+          <w:lang w:val="es-ES_tradnl"/>
+        </w:rPr>
+        <w:t xml:space="preserve"> Caso”</w:t>
       </w:r>
     </w:p>
     <w:p>
       <w:pPr>
-        <w:pStyle w:val="NormalWeb"/>
         <w:numPr>
           <w:ilvl w:val="0"/>
-          <w:numId w:val="7"/>
+          <w:numId w:val="26"/>
         </w:numPr>
-        <w:spacing w:line="360" w:lineRule="auto"/>
-        <w:ind w:right="300"/>
+        <w:rPr>
+          <w:sz w:val="20"/>
+          <w:szCs w:val="20"/>
+          <w:lang w:val="es-ES_tradnl"/>
+        </w:rPr>
+      </w:pPr>
+      <w:r>
+        <w:rPr>
+          <w:sz w:val="20"/>
+          <w:szCs w:val="20"/>
+          <w:lang w:val="es-ES_tradnl"/>
+        </w:rPr>
+        <w:t xml:space="preserve">El sistema muestra el formulario </w:t>
+      </w:r>
+      <w:r>
+        <w:rPr>
+          <w:sz w:val="20"/>
+          <w:szCs w:val="20"/>
+          <w:lang w:val="es-ES_tradnl"/>
+        </w:rPr>
+        <w:t>r</w:t>
+      </w:r>
+      <w:r>
+        <w:rPr>
+          <w:sz w:val="20"/>
+          <w:szCs w:val="20"/>
+          <w:lang w:val="es-ES_tradnl"/>
+        </w:rPr>
+        <w:t xml:space="preserve">egistro de </w:t>
+      </w:r>
+      <w:r>
+        <w:rPr>
+          <w:sz w:val="20"/>
+          <w:szCs w:val="20"/>
+          <w:lang w:val="es-ES_tradnl"/>
+        </w:rPr>
+        <w:t>c</w:t>
+      </w:r>
+      <w:r>
+        <w:rPr>
+          <w:sz w:val="20"/>
+          <w:szCs w:val="20"/>
+          <w:lang w:val="es-ES_tradnl"/>
+        </w:rPr>
+        <w:t xml:space="preserve">aso. </w:t>
+      </w:r>
+      <w:r>
         <w:rPr>
           <w:b/>
           <w:bCs/>
-          <w:sz w:val="27"/>
-          <w:szCs w:val="27"/>
-          <w:lang w:val="es-ES_tradnl"/>
-        </w:rPr>
-      </w:pPr>
+          <w:sz w:val="20"/>
+          <w:szCs w:val="20"/>
+          <w:lang w:val="es-ES_tradnl"/>
+        </w:rPr>
+        <w:t>RN13</w:t>
+      </w:r>
+    </w:p>
+    <w:p>
+      <w:pPr>
+        <w:numPr>
+          <w:ilvl w:val="0"/>
+          <w:numId w:val="26"/>
+        </w:numPr>
+        <w:rPr>
+          <w:sz w:val="20"/>
+          <w:szCs w:val="20"/>
+          <w:lang w:val="es-ES_tradnl"/>
+        </w:rPr>
+      </w:pPr>
+      <w:r>
+        <w:rPr>
+          <w:sz w:val="20"/>
+          <w:szCs w:val="20"/>
+          <w:lang w:val="es-ES_tradnl"/>
+        </w:rPr>
+        <w:t xml:space="preserve">El sistema muestra </w:t>
+      </w:r>
+      <w:r>
+        <w:rPr>
+          <w:sz w:val="20"/>
+          <w:szCs w:val="20"/>
+          <w:lang w:val="es-ES_tradnl"/>
+        </w:rPr>
+        <w:t>los siguientes botones.</w:t>
+      </w:r>
+    </w:p>
+    <w:p>
+      <w:pPr>
+        <w:numPr>
+          <w:ilvl w:val="1"/>
+          <w:numId w:val="26"/>
+        </w:numPr>
+        <w:rPr>
+          <w:sz w:val="20"/>
+          <w:szCs w:val="20"/>
+          <w:lang w:val="es-ES_tradnl"/>
+        </w:rPr>
+      </w:pPr>
+      <w:r>
+        <w:rPr>
+          <w:sz w:val="20"/>
+          <w:szCs w:val="20"/>
+          <w:lang w:val="es-ES_tradnl"/>
+        </w:rPr>
+        <w:t>Registrar</w:t>
+      </w:r>
+    </w:p>
+    <w:p>
+      <w:pPr>
+        <w:numPr>
+          <w:ilvl w:val="1"/>
+          <w:numId w:val="26"/>
+        </w:numPr>
+        <w:rPr>
+          <w:sz w:val="20"/>
+          <w:szCs w:val="20"/>
+          <w:lang w:val="es-ES_tradnl"/>
+        </w:rPr>
+      </w:pPr>
+      <w:r>
+        <w:rPr>
+          <w:sz w:val="20"/>
+          <w:szCs w:val="20"/>
+          <w:lang w:val="es-ES_tradnl"/>
+        </w:rPr>
+        <w:t xml:space="preserve">Cancelar </w:t>
+      </w:r>
       <w:r>
         <w:rPr>
           <w:b/>
           <w:bCs/>
-          <w:sz w:val="27"/>
-          <w:szCs w:val="27"/>
-          <w:lang w:val="es-ES_tradnl"/>
-        </w:rPr>
-        <w:t xml:space="preserve">Definición </w:t>
+          <w:sz w:val="20"/>
+          <w:szCs w:val="20"/>
+          <w:lang w:val="es-ES_tradnl"/>
+        </w:rPr>
+        <w:t>FA</w:t>
       </w:r>
       <w:r>
         <w:rPr>
           <w:b/>
           <w:bCs/>
-          <w:sz w:val="27"/>
-          <w:szCs w:val="27"/>
-          <w:lang w:val="es-ES_tradnl"/>
-        </w:rPr>
-        <w:t>Caso de Uso</w:t>
+          <w:sz w:val="20"/>
+          <w:szCs w:val="20"/>
+          <w:lang w:val="es-ES_tradnl"/>
+        </w:rPr>
+        <w:t>02</w:t>
       </w:r>
     </w:p>
     <w:p>
       <w:pPr>
-        <w:pStyle w:val="NormalWeb"/>
+        <w:numPr>
+          <w:ilvl w:val="0"/>
+          <w:numId w:val="26"/>
+        </w:numPr>
+        <w:rPr>
+          <w:sz w:val="20"/>
+          <w:szCs w:val="20"/>
+          <w:lang w:val="es-ES_tradnl"/>
+        </w:rPr>
+      </w:pPr>
+      <w:r>
+        <w:rPr>
+          <w:sz w:val="20"/>
+          <w:szCs w:val="20"/>
+          <w:lang w:val="es-ES_tradnl"/>
+        </w:rPr>
+        <w:t>El us</w:t>
+      </w:r>
+      <w:r>
+        <w:rPr>
+          <w:sz w:val="20"/>
+          <w:szCs w:val="20"/>
+          <w:lang w:val="es-ES_tradnl"/>
+        </w:rPr>
+        <w:t>uario llena el formulario registro de caso.</w:t>
+      </w:r>
+    </w:p>
+    <w:p>
+      <w:pPr>
+        <w:numPr>
+          <w:ilvl w:val="0"/>
+          <w:numId w:val="26"/>
+        </w:numPr>
+        <w:rPr>
+          <w:sz w:val="20"/>
+          <w:szCs w:val="20"/>
+          <w:lang w:val="es-ES_tradnl"/>
+        </w:rPr>
+      </w:pPr>
+      <w:r>
+        <w:rPr>
+          <w:sz w:val="20"/>
+          <w:szCs w:val="20"/>
+          <w:lang w:val="es-ES_tradnl"/>
+        </w:rPr>
+        <w:t xml:space="preserve">El </w:t>
+      </w:r>
+      <w:r>
+        <w:rPr>
+          <w:sz w:val="20"/>
+          <w:szCs w:val="20"/>
+          <w:lang w:val="es-ES_tradnl"/>
+        </w:rPr>
+        <w:t>usuario</w:t>
+      </w:r>
+      <w:r>
+        <w:rPr>
+          <w:sz w:val="20"/>
+          <w:szCs w:val="20"/>
+          <w:lang w:val="es-ES_tradnl"/>
+        </w:rPr>
+        <w:t xml:space="preserve"> selecciona</w:t>
+      </w:r>
+      <w:r>
+        <w:rPr>
+          <w:sz w:val="20"/>
+          <w:szCs w:val="20"/>
+          <w:lang w:val="es-ES_tradnl"/>
+        </w:rPr>
+        <w:t xml:space="preserve"> el botón</w:t>
+      </w:r>
+      <w:r>
+        <w:rPr>
+          <w:sz w:val="20"/>
+          <w:szCs w:val="20"/>
+          <w:lang w:val="es-ES_tradnl"/>
+        </w:rPr>
+        <w:t xml:space="preserve"> "Registrar ".</w:t>
+      </w:r>
+    </w:p>
+    <w:p>
+      <w:pPr>
+        <w:numPr>
+          <w:ilvl w:val="0"/>
+          <w:numId w:val="26"/>
+        </w:numPr>
+        <w:rPr>
+          <w:sz w:val="20"/>
+          <w:szCs w:val="20"/>
+          <w:lang w:val="es-ES_tradnl"/>
+        </w:rPr>
+      </w:pPr>
+      <w:r>
+        <w:rPr>
+          <w:sz w:val="20"/>
+          <w:szCs w:val="20"/>
+          <w:lang w:val="es-ES_tradnl"/>
+        </w:rPr>
+        <w:t xml:space="preserve">El sistema </w:t>
+      </w:r>
+      <w:r>
+        <w:rPr>
+          <w:sz w:val="20"/>
+          <w:szCs w:val="20"/>
+          <w:lang w:val="es-ES_tradnl"/>
+        </w:rPr>
+        <w:t>crea el caso</w:t>
+      </w:r>
+      <w:r>
+        <w:rPr>
+          <w:sz w:val="20"/>
+          <w:szCs w:val="20"/>
+          <w:lang w:val="es-ES_tradnl"/>
+        </w:rPr>
+        <w:t xml:space="preserve">. </w:t>
+      </w:r>
+      <w:r>
+        <w:rPr>
+          <w:b/>
+          <w:bCs/>
+          <w:sz w:val="20"/>
+          <w:szCs w:val="20"/>
+          <w:lang w:val="es-ES_tradnl"/>
+        </w:rPr>
+        <w:t>RN04</w:t>
+      </w:r>
+      <w:r>
+        <w:rPr>
+          <w:b/>
+          <w:bCs/>
+          <w:sz w:val="20"/>
+          <w:szCs w:val="20"/>
+          <w:lang w:val="es-ES_tradnl"/>
+        </w:rPr>
+        <w:t>, RN10</w:t>
+      </w:r>
+    </w:p>
+    <w:p>
+      <w:pPr>
+        <w:numPr>
+          <w:ilvl w:val="0"/>
+          <w:numId w:val="26"/>
+        </w:numPr>
+        <w:rPr>
+          <w:sz w:val="20"/>
+          <w:szCs w:val="20"/>
+          <w:lang w:val="es-ES_tradnl"/>
+        </w:rPr>
+      </w:pPr>
+      <w:r>
+        <w:rPr>
+          <w:sz w:val="20"/>
+          <w:szCs w:val="20"/>
+          <w:lang w:val="es-ES_tradnl"/>
+        </w:rPr>
+        <w:t xml:space="preserve">El sistema </w:t>
+      </w:r>
+      <w:r>
+        <w:rPr>
+          <w:sz w:val="20"/>
+          <w:szCs w:val="20"/>
+          <w:lang w:val="es-ES_tradnl"/>
+        </w:rPr>
+        <w:t xml:space="preserve">envía correo electrónico </w:t>
+      </w:r>
+      <w:r>
+        <w:rPr>
+          <w:sz w:val="20"/>
+          <w:szCs w:val="20"/>
+          <w:lang w:val="es-ES_tradnl"/>
+        </w:rPr>
+        <w:t xml:space="preserve">de confirmación </w:t>
+      </w:r>
+      <w:r>
+        <w:rPr>
+          <w:sz w:val="20"/>
+          <w:szCs w:val="20"/>
+          <w:lang w:val="es-ES_tradnl"/>
+        </w:rPr>
+        <w:t>al usuario</w:t>
+      </w:r>
+      <w:r>
+        <w:rPr>
+          <w:sz w:val="20"/>
+          <w:szCs w:val="20"/>
+          <w:lang w:val="es-ES_tradnl"/>
+        </w:rPr>
+        <w:t>.</w:t>
+      </w:r>
+    </w:p>
+    <w:p>
+      <w:pPr>
+        <w:numPr>
+          <w:ilvl w:val="0"/>
+          <w:numId w:val="26"/>
+        </w:numPr>
+        <w:rPr>
+          <w:sz w:val="20"/>
+          <w:szCs w:val="20"/>
+          <w:lang w:val="es-ES_tradnl"/>
+        </w:rPr>
+      </w:pPr>
+      <w:r>
+        <w:rPr>
+          <w:sz w:val="20"/>
+          <w:szCs w:val="20"/>
+          <w:lang w:val="es-ES_tradnl"/>
+        </w:rPr>
+        <w:t xml:space="preserve">El sistema muestra el mensaje de éxito. </w:t>
+      </w:r>
+      <w:r>
+        <w:rPr>
+          <w:b/>
+          <w:bCs/>
+          <w:sz w:val="20"/>
+          <w:szCs w:val="20"/>
+          <w:lang w:val="es-ES_tradnl"/>
+        </w:rPr>
+        <w:t xml:space="preserve">AN01 # </w:t>
+      </w:r>
+      <w:r>
+        <w:rPr>
+          <w:b/>
+          <w:bCs/>
+          <w:sz w:val="20"/>
+          <w:szCs w:val="20"/>
+          <w:lang w:val="es-ES_tradnl"/>
+        </w:rPr>
+        <w:t>2</w:t>
+      </w:r>
+    </w:p>
+    <w:p>
+      <w:pPr>
+        <w:numPr>
+          <w:ilvl w:val="0"/>
+          <w:numId w:val="26"/>
+        </w:numPr>
+        <w:rPr>
+          <w:sz w:val="20"/>
+          <w:szCs w:val="20"/>
+          <w:lang w:val="es-ES_tradnl"/>
+        </w:rPr>
+      </w:pPr>
+      <w:r>
+        <w:rPr>
+          <w:sz w:val="20"/>
+          <w:szCs w:val="20"/>
+          <w:lang w:val="es-ES_tradnl"/>
+        </w:rPr>
+        <w:t xml:space="preserve">El sistema </w:t>
+      </w:r>
+      <w:r>
+        <w:rPr>
+          <w:sz w:val="20"/>
+          <w:szCs w:val="20"/>
+          <w:lang w:val="es-ES_tradnl"/>
+        </w:rPr>
+        <w:t>registra</w:t>
+      </w:r>
+      <w:r>
+        <w:rPr>
+          <w:sz w:val="20"/>
+          <w:szCs w:val="20"/>
+          <w:lang w:val="es-ES_tradnl"/>
+        </w:rPr>
+        <w:t xml:space="preserve"> </w:t>
+      </w:r>
+      <w:r>
+        <w:rPr>
+          <w:sz w:val="20"/>
+          <w:szCs w:val="20"/>
+          <w:lang w:val="es-ES_tradnl"/>
+        </w:rPr>
+        <w:t xml:space="preserve">el ingreso </w:t>
+      </w:r>
+      <w:r>
+        <w:rPr>
+          <w:sz w:val="20"/>
+          <w:szCs w:val="20"/>
+          <w:lang w:val="es-ES_tradnl"/>
+        </w:rPr>
+        <w:t>en bitácora</w:t>
+      </w:r>
+      <w:r>
+        <w:rPr>
+          <w:sz w:val="20"/>
+          <w:szCs w:val="20"/>
+          <w:lang w:val="es-ES_tradnl"/>
+        </w:rPr>
+        <w:t>.</w:t>
+      </w:r>
+    </w:p>
+    <w:p>
+      <w:pPr>
+        <w:numPr>
+          <w:ilvl w:val="0"/>
+          <w:numId w:val="26"/>
+        </w:numPr>
+        <w:rPr>
+          <w:sz w:val="20"/>
+          <w:szCs w:val="20"/>
+          <w:lang w:val="es-ES_tradnl"/>
+        </w:rPr>
+      </w:pPr>
+      <w:r>
+        <w:rPr>
+          <w:sz w:val="20"/>
+          <w:szCs w:val="20"/>
+          <w:lang w:val="es-ES_tradnl"/>
+        </w:rPr>
+        <w:t>Fin del caso de uso.</w:t>
+      </w:r>
+    </w:p>
+    <w:p>
+      <w:pPr>
+        <w:pStyle w:val="Ttulo1"/>
         <w:numPr>
           <w:ilvl w:val="1"/>
-          <w:numId w:val="7"/>
+          <w:numId w:val="24"/>
         </w:numPr>
-        <w:spacing w:line="360" w:lineRule="auto"/>
-        <w:ind w:right="300"/>
+        <w:rPr>
+          <w:sz w:val="24"/>
+          <w:szCs w:val="24"/>
+          <w:lang w:val="es-ES_tradnl"/>
+        </w:rPr>
+      </w:pPr>
+      <w:r>
+        <w:rPr>
+          <w:sz w:val="24"/>
+          <w:szCs w:val="24"/>
+          <w:lang w:val="es-ES_tradnl"/>
+        </w:rPr>
+        <w:t>Flujos Alternos</w:t>
+      </w:r>
+    </w:p>
+    <w:p>
+      <w:pPr>
         <w:rPr>
           <w:b/>
           <w:bCs/>
-          <w:sz w:val="27"/>
-          <w:szCs w:val="27"/>
+          <w:sz w:val="20"/>
+          <w:szCs w:val="20"/>
           <w:lang w:val="es-ES_tradnl"/>
         </w:rPr>
       </w:pPr>
@@ -1002,1765 +1939,438 @@
         <w:rPr>
           <w:b/>
           <w:bCs/>
-          <w:sz w:val="27"/>
-          <w:szCs w:val="27"/>
-          <w:lang w:val="es-ES_tradnl"/>
-        </w:rPr>
-        <w:t>Actores</w:t>
+          <w:sz w:val="20"/>
+          <w:szCs w:val="20"/>
+          <w:lang w:val="es-ES_tradnl"/>
+        </w:rPr>
+        <w:t xml:space="preserve">FA01 </w:t>
+      </w:r>
+      <w:r>
+        <w:rPr>
+          <w:b/>
+          <w:bCs/>
+          <w:sz w:val="20"/>
+          <w:szCs w:val="20"/>
+          <w:lang w:val="es-ES_tradnl"/>
+        </w:rPr>
+        <w:t>Cerrar sesión</w:t>
       </w:r>
     </w:p>
     <w:p>
       <w:pPr>
-        <w:pStyle w:val="NormalWeb"/>
         <w:numPr>
-          <w:ilvl w:val="2"/>
-          <w:numId w:val="7"/>
+          <w:ilvl w:val="0"/>
+          <w:numId w:val="27"/>
         </w:numPr>
-        <w:spacing w:line="360" w:lineRule="auto"/>
-        <w:ind w:right="300"/>
-        <w:rPr>
-          <w:sz w:val="20"/>
-          <w:szCs w:val="20"/>
-          <w:lang w:val="es-ES_tradnl"/>
-        </w:rPr>
-      </w:pPr>
-      <w:r>
-        <w:rPr>
-          <w:sz w:val="20"/>
-          <w:szCs w:val="20"/>
-          <w:lang w:val="es-ES_tradnl"/>
-        </w:rPr>
-        <w:t xml:space="preserve">Sistema </w:t>
-      </w:r>
-      <w:r>
-        <w:rPr>
-          <w:sz w:val="20"/>
-          <w:szCs w:val="20"/>
-          <w:lang w:val="es-ES_tradnl"/>
-        </w:rPr>
-        <w:t>web</w:t>
+        <w:rPr>
+          <w:sz w:val="20"/>
+          <w:szCs w:val="20"/>
+          <w:lang w:val="es-ES_tradnl"/>
+        </w:rPr>
+      </w:pPr>
+      <w:r>
+        <w:rPr>
+          <w:sz w:val="20"/>
+          <w:szCs w:val="20"/>
+          <w:lang w:val="es-ES_tradnl"/>
+        </w:rPr>
+        <w:t xml:space="preserve">El </w:t>
+      </w:r>
+      <w:r>
+        <w:rPr>
+          <w:sz w:val="20"/>
+          <w:szCs w:val="20"/>
+          <w:lang w:val="es-ES_tradnl"/>
+        </w:rPr>
+        <w:t xml:space="preserve">usuario selecciona el </w:t>
+      </w:r>
+      <w:r>
+        <w:rPr>
+          <w:sz w:val="20"/>
+          <w:szCs w:val="20"/>
+          <w:lang w:val="es-ES_tradnl"/>
+        </w:rPr>
+        <w:t>botón “Cerrar sesión”</w:t>
       </w:r>
     </w:p>
     <w:p>
       <w:pPr>
-        <w:pStyle w:val="NormalWeb"/>
         <w:numPr>
-          <w:ilvl w:val="2"/>
-          <w:numId w:val="7"/>
+          <w:ilvl w:val="0"/>
+          <w:numId w:val="27"/>
         </w:numPr>
-        <w:spacing w:line="360" w:lineRule="auto"/>
-        <w:ind w:right="300"/>
-        <w:rPr>
-          <w:sz w:val="20"/>
-          <w:szCs w:val="20"/>
-          <w:lang w:val="es-ES_tradnl"/>
-        </w:rPr>
-      </w:pPr>
-      <w:r>
-        <w:rPr>
-          <w:sz w:val="20"/>
-          <w:szCs w:val="20"/>
-          <w:lang w:val="es-ES_tradnl"/>
-        </w:rPr>
-        <w:t>Ciudadano</w:t>
+        <w:rPr>
+          <w:sz w:val="20"/>
+          <w:szCs w:val="20"/>
+          <w:lang w:val="es-ES_tradnl"/>
+        </w:rPr>
+      </w:pPr>
+      <w:r>
+        <w:rPr>
+          <w:sz w:val="20"/>
+          <w:szCs w:val="20"/>
+          <w:lang w:val="es-ES_tradnl"/>
+        </w:rPr>
+        <w:t>El sistema retorna al portal web.</w:t>
       </w:r>
     </w:p>
     <w:p>
       <w:pPr>
-        <w:pStyle w:val="NormalWeb"/>
+        <w:numPr>
+          <w:ilvl w:val="0"/>
+          <w:numId w:val="27"/>
+        </w:numPr>
+        <w:rPr>
+          <w:sz w:val="20"/>
+          <w:szCs w:val="20"/>
+          <w:lang w:val="es-ES_tradnl"/>
+        </w:rPr>
+      </w:pPr>
+      <w:r>
+        <w:rPr>
+          <w:sz w:val="20"/>
+          <w:szCs w:val="20"/>
+          <w:lang w:val="es-ES_tradnl"/>
+        </w:rPr>
+        <w:t xml:space="preserve">Fin </w:t>
+      </w:r>
+      <w:r>
+        <w:rPr>
+          <w:sz w:val="20"/>
+          <w:szCs w:val="20"/>
+          <w:lang w:val="es-ES_tradnl"/>
+        </w:rPr>
+        <w:t xml:space="preserve">de </w:t>
+      </w:r>
+      <w:r>
+        <w:rPr>
+          <w:sz w:val="20"/>
+          <w:szCs w:val="20"/>
+          <w:lang w:val="es-ES_tradnl"/>
+        </w:rPr>
+        <w:t>flujo alterno.</w:t>
+      </w:r>
+    </w:p>
+    <w:p>
+      <w:pPr>
+        <w:rPr>
+          <w:b/>
+          <w:bCs/>
+          <w:sz w:val="20"/>
+          <w:szCs w:val="20"/>
+          <w:lang w:val="es-ES_tradnl"/>
+        </w:rPr>
+      </w:pPr>
+    </w:p>
+    <w:p>
+      <w:pPr>
+        <w:rPr>
+          <w:b/>
+          <w:bCs/>
+          <w:sz w:val="20"/>
+          <w:szCs w:val="20"/>
+          <w:lang w:val="es-ES_tradnl"/>
+        </w:rPr>
+      </w:pPr>
+      <w:r>
+        <w:rPr>
+          <w:b/>
+          <w:bCs/>
+          <w:sz w:val="20"/>
+          <w:szCs w:val="20"/>
+          <w:lang w:val="es-ES_tradnl"/>
+        </w:rPr>
+        <w:t xml:space="preserve">FA02 </w:t>
+      </w:r>
+      <w:r>
+        <w:rPr>
+          <w:b/>
+          <w:bCs/>
+          <w:sz w:val="20"/>
+          <w:szCs w:val="20"/>
+          <w:lang w:val="es-ES_tradnl"/>
+        </w:rPr>
+        <w:t>Cancelar ingreso</w:t>
+      </w:r>
+    </w:p>
+    <w:p>
+      <w:pPr>
+        <w:numPr>
+          <w:ilvl w:val="0"/>
+          <w:numId w:val="28"/>
+        </w:numPr>
+        <w:rPr>
+          <w:sz w:val="20"/>
+          <w:szCs w:val="20"/>
+          <w:lang w:val="es-ES_tradnl"/>
+        </w:rPr>
+      </w:pPr>
+      <w:r>
+        <w:rPr>
+          <w:sz w:val="20"/>
+          <w:szCs w:val="20"/>
+          <w:lang w:val="es-ES_tradnl"/>
+        </w:rPr>
+        <w:t xml:space="preserve">El </w:t>
+      </w:r>
+      <w:r>
+        <w:rPr>
+          <w:sz w:val="20"/>
+          <w:szCs w:val="20"/>
+          <w:lang w:val="es-ES_tradnl"/>
+        </w:rPr>
+        <w:t>usuario selecciona el botón “Cancelar”</w:t>
+      </w:r>
+    </w:p>
+    <w:p>
+      <w:pPr>
+        <w:numPr>
+          <w:ilvl w:val="0"/>
+          <w:numId w:val="28"/>
+        </w:numPr>
+        <w:rPr>
+          <w:sz w:val="20"/>
+          <w:szCs w:val="20"/>
+          <w:lang w:val="es-ES_tradnl"/>
+        </w:rPr>
+      </w:pPr>
+      <w:r>
+        <w:rPr>
+          <w:sz w:val="20"/>
+          <w:szCs w:val="20"/>
+          <w:lang w:val="es-ES_tradnl"/>
+        </w:rPr>
+        <w:t>El sistema cierra el formulario registro de caso.</w:t>
+      </w:r>
+    </w:p>
+    <w:p>
+      <w:pPr>
+        <w:numPr>
+          <w:ilvl w:val="0"/>
+          <w:numId w:val="28"/>
+        </w:numPr>
+        <w:rPr>
+          <w:sz w:val="20"/>
+          <w:szCs w:val="20"/>
+          <w:lang w:val="es-ES_tradnl"/>
+        </w:rPr>
+      </w:pPr>
+      <w:r>
+        <w:rPr>
+          <w:sz w:val="20"/>
+          <w:szCs w:val="20"/>
+          <w:lang w:val="es-ES_tradnl"/>
+        </w:rPr>
+        <w:t>El sistema retorna a</w:t>
+      </w:r>
+      <w:r>
+        <w:rPr>
+          <w:sz w:val="20"/>
+          <w:szCs w:val="20"/>
+          <w:lang w:val="es-ES_tradnl"/>
+        </w:rPr>
+        <w:t>l paso 2 del flujo básico</w:t>
+      </w:r>
+      <w:r>
+        <w:rPr>
+          <w:sz w:val="20"/>
+          <w:szCs w:val="20"/>
+          <w:lang w:val="es-ES_tradnl"/>
+        </w:rPr>
+        <w:t>.</w:t>
+      </w:r>
+    </w:p>
+    <w:p>
+      <w:pPr>
+        <w:numPr>
+          <w:ilvl w:val="0"/>
+          <w:numId w:val="28"/>
+        </w:numPr>
+        <w:rPr>
+          <w:sz w:val="20"/>
+          <w:szCs w:val="20"/>
+          <w:lang w:val="es-ES_tradnl"/>
+        </w:rPr>
+      </w:pPr>
+      <w:r>
+        <w:rPr>
+          <w:sz w:val="20"/>
+          <w:szCs w:val="20"/>
+          <w:lang w:val="es-ES_tradnl"/>
+        </w:rPr>
+        <w:t xml:space="preserve">Fin </w:t>
+      </w:r>
+      <w:r>
+        <w:rPr>
+          <w:sz w:val="20"/>
+          <w:szCs w:val="20"/>
+          <w:lang w:val="es-ES_tradnl"/>
+        </w:rPr>
+        <w:t>de flujo alterno.</w:t>
+      </w:r>
+    </w:p>
+    <w:p>
+      <w:pPr>
+        <w:pStyle w:val="Ttulo1"/>
         <w:numPr>
           <w:ilvl w:val="1"/>
-          <w:numId w:val="7"/>
+          <w:numId w:val="24"/>
         </w:numPr>
-        <w:spacing w:line="360" w:lineRule="auto"/>
-        <w:ind w:right="300"/>
-        <w:rPr>
-          <w:b/>
-          <w:bCs/>
-          <w:sz w:val="27"/>
-          <w:szCs w:val="27"/>
-          <w:lang w:val="es-ES_tradnl"/>
-        </w:rPr>
-      </w:pPr>
-      <w:r>
-        <w:rPr>
-          <w:b/>
-          <w:bCs/>
-          <w:sz w:val="27"/>
-          <w:szCs w:val="27"/>
-          <w:lang w:val="es-ES_tradnl"/>
-        </w:rPr>
-        <w:t>Precondiciones</w:t>
+        <w:rPr>
+          <w:sz w:val="24"/>
+          <w:szCs w:val="24"/>
+          <w:lang w:val="es-ES_tradnl"/>
+        </w:rPr>
+      </w:pPr>
+      <w:r>
+        <w:rPr>
+          <w:sz w:val="24"/>
+          <w:szCs w:val="24"/>
+          <w:lang w:val="es-ES_tradnl"/>
+        </w:rPr>
+        <w:t>Postcondiciones</w:t>
       </w:r>
     </w:p>
     <w:p>
       <w:pPr>
-        <w:pStyle w:val="NormalWeb"/>
         <w:numPr>
-          <w:ilvl w:val="2"/>
-          <w:numId w:val="7"/>
+          <w:ilvl w:val="0"/>
+          <w:numId w:val="29"/>
         </w:numPr>
-        <w:spacing w:line="360" w:lineRule="auto"/>
-        <w:ind w:right="300"/>
-        <w:rPr>
-          <w:sz w:val="20"/>
-          <w:szCs w:val="20"/>
-          <w:lang w:val="es-ES_tradnl"/>
-        </w:rPr>
-      </w:pPr>
-      <w:r>
-        <w:rPr>
-          <w:sz w:val="20"/>
-          <w:szCs w:val="20"/>
-          <w:lang w:val="es-ES_tradnl"/>
-        </w:rPr>
-        <w:t>Que el sistema web se encuentre disponible.</w:t>
+        <w:rPr>
+          <w:sz w:val="20"/>
+          <w:szCs w:val="20"/>
+          <w:lang w:val="es-ES_tradnl"/>
+        </w:rPr>
+      </w:pPr>
+      <w:r>
+        <w:rPr>
+          <w:sz w:val="20"/>
+          <w:szCs w:val="20"/>
+          <w:lang w:val="es-ES_tradnl"/>
+        </w:rPr>
+        <w:t>El caso queda registrado en estado Registrado, con un código de seguimiento único asignado.</w:t>
       </w:r>
     </w:p>
     <w:p>
       <w:pPr>
-        <w:pStyle w:val="NormalWeb"/>
         <w:numPr>
-          <w:ilvl w:val="2"/>
-          <w:numId w:val="7"/>
+          <w:ilvl w:val="0"/>
+          <w:numId w:val="29"/>
         </w:numPr>
-        <w:spacing w:line="360" w:lineRule="auto"/>
-        <w:ind w:right="300"/>
-        <w:rPr>
-          <w:sz w:val="20"/>
-          <w:szCs w:val="20"/>
-          <w:lang w:val="es-ES_tradnl"/>
-        </w:rPr>
-      </w:pPr>
-      <w:r>
-        <w:rPr>
-          <w:sz w:val="20"/>
-          <w:szCs w:val="20"/>
-          <w:lang w:val="es-ES_tradnl"/>
-        </w:rPr>
-        <w:t>Que el ciudadano se encuentre registrado en la base precargada de ciudadanos de la Municipalidad y tenga acceso a su correo electrónico. La actualización del correo electrónico solo puede efectuarse de manera presencial, ya que no forma parte de este sistema.</w:t>
+        <w:rPr>
+          <w:sz w:val="20"/>
+          <w:szCs w:val="20"/>
+          <w:lang w:val="es-ES_tradnl"/>
+        </w:rPr>
+      </w:pPr>
+      <w:r>
+        <w:rPr>
+          <w:sz w:val="20"/>
+          <w:szCs w:val="20"/>
+          <w:lang w:val="es-ES_tradnl"/>
+        </w:rPr>
+        <w:t>El caso queda disponible en la bandeja del Auxiliar para su revisión CU-04.</w:t>
       </w:r>
     </w:p>
     <w:p>
       <w:pPr>
-        <w:pStyle w:val="NormalWeb"/>
+        <w:pStyle w:val="Ttulo1"/>
         <w:numPr>
-          <w:ilvl w:val="2"/>
-          <w:numId w:val="7"/>
+          <w:ilvl w:val="0"/>
+          <w:numId w:val="24"/>
         </w:numPr>
-        <w:spacing w:line="360" w:lineRule="auto"/>
-        <w:ind w:right="300"/>
-        <w:rPr>
-          <w:sz w:val="20"/>
-          <w:szCs w:val="20"/>
-          <w:lang w:val="es-ES_tradnl"/>
-        </w:rPr>
-      </w:pPr>
-      <w:r>
-        <w:rPr>
-          <w:sz w:val="20"/>
-          <w:szCs w:val="20"/>
-          <w:lang w:val="es-ES_tradnl"/>
-        </w:rPr>
-        <w:t>Que los catálogos de tipos de caso y categorías del problema se encuentren cargados en memoria caché.</w:t>
+        <w:rPr>
+          <w:sz w:val="28"/>
+          <w:szCs w:val="28"/>
+          <w:lang w:val="es-ES_tradnl"/>
+        </w:rPr>
+      </w:pPr>
+      <w:r>
+        <w:rPr>
+          <w:sz w:val="28"/>
+          <w:szCs w:val="28"/>
+          <w:lang w:val="es-ES_tradnl"/>
+        </w:rPr>
+        <w:lastRenderedPageBreak/>
+        <w:t xml:space="preserve">Requerimientos </w:t>
+      </w:r>
+      <w:r>
+        <w:rPr>
+          <w:sz w:val="28"/>
+          <w:szCs w:val="28"/>
+          <w:lang w:val="es-ES_tradnl"/>
+        </w:rPr>
+        <w:t xml:space="preserve">Suplementarios o no </w:t>
+      </w:r>
+      <w:r>
+        <w:rPr>
+          <w:sz w:val="28"/>
+          <w:szCs w:val="28"/>
+          <w:lang w:val="es-ES_tradnl"/>
+        </w:rPr>
+        <w:t>Funcionales</w:t>
       </w:r>
     </w:p>
     <w:p>
       <w:pPr>
-        <w:pStyle w:val="NormalWeb"/>
         <w:numPr>
-          <w:ilvl w:val="1"/>
-          <w:numId w:val="7"/>
+          <w:ilvl w:val="0"/>
+          <w:numId w:val="30"/>
         </w:numPr>
-        <w:spacing w:line="360" w:lineRule="auto"/>
-        <w:ind w:right="300"/>
-        <w:rPr>
-          <w:b/>
-          <w:bCs/>
-          <w:sz w:val="27"/>
-          <w:szCs w:val="27"/>
-          <w:lang w:val="es-ES_tradnl"/>
-        </w:rPr>
-      </w:pPr>
-      <w:r>
-        <w:rPr>
-          <w:b/>
-          <w:bCs/>
-          <w:sz w:val="27"/>
-          <w:szCs w:val="27"/>
-          <w:lang w:val="es-ES_tradnl"/>
-        </w:rPr>
-        <w:t xml:space="preserve">Flujo </w:t>
-      </w:r>
-      <w:r>
-        <w:rPr>
-          <w:b/>
-          <w:bCs/>
-          <w:sz w:val="27"/>
-          <w:szCs w:val="27"/>
-          <w:lang w:val="es-ES_tradnl"/>
-        </w:rPr>
-        <w:t>Normal Básico</w:t>
+        <w:rPr>
+          <w:sz w:val="20"/>
+          <w:szCs w:val="20"/>
+          <w:lang w:val="es-ES_tradnl"/>
+        </w:rPr>
+      </w:pPr>
+      <w:r>
+        <w:rPr>
+          <w:sz w:val="20"/>
+          <w:szCs w:val="20"/>
+          <w:lang w:val="es-ES_tradnl"/>
+        </w:rPr>
+        <w:t>El formulario deberá utilizar conexión segura HTTPS.</w:t>
       </w:r>
     </w:p>
     <w:p>
       <w:pPr>
-        <w:pStyle w:val="NormalWeb"/>
         <w:numPr>
-          <w:ilvl w:val="2"/>
-          <w:numId w:val="7"/>
+          <w:ilvl w:val="0"/>
+          <w:numId w:val="30"/>
         </w:numPr>
-        <w:spacing w:line="360" w:lineRule="auto"/>
-        <w:ind w:right="300"/>
-        <w:rPr>
-          <w:sz w:val="20"/>
-          <w:szCs w:val="20"/>
-          <w:lang w:val="es-ES_tradnl"/>
-        </w:rPr>
-      </w:pPr>
-      <w:r>
-        <w:rPr>
-          <w:sz w:val="20"/>
-          <w:szCs w:val="20"/>
-          <w:lang w:val="es-ES_tradnl"/>
-        </w:rPr>
-        <w:t xml:space="preserve">El ciudadano ingresa al </w:t>
-      </w:r>
-      <w:r>
-        <w:rPr>
-          <w:sz w:val="20"/>
-          <w:szCs w:val="20"/>
-          <w:lang w:val="es-ES_tradnl"/>
-        </w:rPr>
-        <w:t>portal</w:t>
-      </w:r>
-      <w:r>
-        <w:rPr>
-          <w:sz w:val="20"/>
-          <w:szCs w:val="20"/>
-          <w:lang w:val="es-ES_tradnl"/>
-        </w:rPr>
-        <w:t xml:space="preserve"> web. CU-00</w:t>
+        <w:rPr>
+          <w:sz w:val="20"/>
+          <w:szCs w:val="20"/>
+          <w:lang w:val="es-ES_tradnl"/>
+        </w:rPr>
+      </w:pPr>
+      <w:r>
+        <w:rPr>
+          <w:sz w:val="20"/>
+          <w:szCs w:val="20"/>
+          <w:lang w:val="es-ES_tradnl"/>
+        </w:rPr>
+        <w:t>Los catálogos utilizados en el formulario deberán consultarse desde memoria caché, sin afectar el tiempo de respuesta del registro.</w:t>
       </w:r>
     </w:p>
     <w:p>
       <w:pPr>
-        <w:pStyle w:val="NormalWeb"/>
-        <w:numPr>
-          <w:ilvl w:val="2"/>
-          <w:numId w:val="7"/>
-        </w:numPr>
-        <w:spacing w:line="360" w:lineRule="auto"/>
-        <w:ind w:right="300"/>
-        <w:rPr>
-          <w:sz w:val="20"/>
-          <w:szCs w:val="20"/>
-          <w:lang w:val="es-ES_tradnl"/>
-        </w:rPr>
-      </w:pPr>
-      <w:r>
-        <w:rPr>
-          <w:sz w:val="20"/>
-          <w:szCs w:val="20"/>
-          <w:lang w:val="es-ES_tradnl"/>
-        </w:rPr>
-        <w:t>El ciudadano selecciona el botón "Registrar Caso" en el portal de inicio.</w:t>
-      </w:r>
-    </w:p>
-    <w:p>
-      <w:pPr>
-        <w:pStyle w:val="NormalWeb"/>
-        <w:numPr>
-          <w:ilvl w:val="2"/>
-          <w:numId w:val="7"/>
-        </w:numPr>
-        <w:spacing w:line="360" w:lineRule="auto"/>
-        <w:ind w:right="300"/>
-        <w:rPr>
-          <w:sz w:val="20"/>
-          <w:szCs w:val="20"/>
-          <w:lang w:val="es-ES_tradnl"/>
-        </w:rPr>
-      </w:pPr>
-      <w:r>
-        <w:rPr>
-          <w:sz w:val="20"/>
-          <w:szCs w:val="20"/>
-          <w:lang w:val="es-ES_tradnl"/>
-        </w:rPr>
-        <w:t>El sistema muestra en el portal el formulario de verificación.</w:t>
-      </w:r>
-    </w:p>
-    <w:p>
-      <w:pPr>
-        <w:pStyle w:val="NormalWeb"/>
-        <w:numPr>
-          <w:ilvl w:val="3"/>
-          <w:numId w:val="7"/>
-        </w:numPr>
-        <w:spacing w:line="360" w:lineRule="auto"/>
-        <w:ind w:right="300"/>
-        <w:rPr>
-          <w:sz w:val="20"/>
-          <w:szCs w:val="20"/>
-          <w:lang w:val="es-ES_tradnl"/>
-        </w:rPr>
-      </w:pPr>
-      <w:r>
-        <w:rPr>
-          <w:sz w:val="20"/>
-          <w:szCs w:val="20"/>
-          <w:lang w:val="es-ES_tradnl"/>
-        </w:rPr>
-        <w:t>Se habilita el botón “Enviar código de verificación”</w:t>
-      </w:r>
-    </w:p>
-    <w:p>
-      <w:pPr>
-        <w:pStyle w:val="NormalWeb"/>
-        <w:numPr>
-          <w:ilvl w:val="3"/>
-          <w:numId w:val="7"/>
-        </w:numPr>
-        <w:spacing w:line="360" w:lineRule="auto"/>
-        <w:ind w:right="300"/>
-        <w:rPr>
-          <w:sz w:val="20"/>
-          <w:szCs w:val="20"/>
-          <w:lang w:val="es-ES_tradnl"/>
-        </w:rPr>
-      </w:pPr>
-      <w:r>
-        <w:rPr>
-          <w:sz w:val="20"/>
-          <w:szCs w:val="20"/>
-          <w:lang w:val="es-ES_tradnl"/>
-        </w:rPr>
-        <w:t>Se habilita el botón “Volver al portal” FA para ocular formularios</w:t>
-      </w:r>
-    </w:p>
-    <w:p>
-      <w:pPr>
-        <w:pStyle w:val="NormalWeb"/>
-        <w:numPr>
-          <w:ilvl w:val="2"/>
-          <w:numId w:val="7"/>
-        </w:numPr>
-        <w:spacing w:line="360" w:lineRule="auto"/>
-        <w:ind w:right="300"/>
-        <w:rPr>
-          <w:sz w:val="20"/>
-          <w:szCs w:val="20"/>
-          <w:lang w:val="es-ES_tradnl"/>
-        </w:rPr>
-      </w:pPr>
-      <w:r>
-        <w:rPr>
-          <w:sz w:val="20"/>
-          <w:szCs w:val="20"/>
-          <w:lang w:val="es-ES_tradnl"/>
-        </w:rPr>
-        <w:t>El ciudadano ingresa el número de identificación.</w:t>
-      </w:r>
-    </w:p>
-    <w:p>
-      <w:pPr>
-        <w:pStyle w:val="NormalWeb"/>
-        <w:numPr>
-          <w:ilvl w:val="2"/>
-          <w:numId w:val="7"/>
-        </w:numPr>
-        <w:spacing w:line="360" w:lineRule="auto"/>
-        <w:ind w:right="300"/>
-        <w:rPr>
-          <w:sz w:val="20"/>
-          <w:szCs w:val="20"/>
-          <w:lang w:val="es-ES_tradnl"/>
-        </w:rPr>
-      </w:pPr>
-      <w:r>
-        <w:rPr>
-          <w:sz w:val="20"/>
-          <w:szCs w:val="20"/>
-          <w:lang w:val="es-ES_tradnl"/>
-        </w:rPr>
-        <w:t>El ciudadano selecciona el botón “Enviar código de verificación”. FA01</w:t>
-      </w:r>
-    </w:p>
-    <w:p>
-      <w:pPr>
-        <w:pStyle w:val="NormalWeb"/>
-        <w:numPr>
-          <w:ilvl w:val="2"/>
-          <w:numId w:val="7"/>
-        </w:numPr>
-        <w:spacing w:line="360" w:lineRule="auto"/>
-        <w:ind w:right="300"/>
-        <w:rPr>
-          <w:sz w:val="20"/>
-          <w:szCs w:val="20"/>
-          <w:lang w:val="es-ES_tradnl"/>
-        </w:rPr>
-      </w:pPr>
-      <w:r>
-        <w:rPr>
-          <w:sz w:val="20"/>
-          <w:szCs w:val="20"/>
-          <w:lang w:val="es-ES_tradnl"/>
-        </w:rPr>
-        <w:t>El sistema busca al ciudadano en la base precargada de ciudadanos. FA02</w:t>
-      </w:r>
-    </w:p>
-    <w:p>
-      <w:pPr>
-        <w:pStyle w:val="NormalWeb"/>
-        <w:numPr>
-          <w:ilvl w:val="2"/>
-          <w:numId w:val="7"/>
-        </w:numPr>
-        <w:spacing w:line="360" w:lineRule="auto"/>
-        <w:ind w:right="300"/>
-        <w:rPr>
-          <w:sz w:val="20"/>
-          <w:szCs w:val="20"/>
-          <w:lang w:val="es-ES_tradnl"/>
-        </w:rPr>
-      </w:pPr>
-      <w:r>
-        <w:rPr>
-          <w:sz w:val="20"/>
-          <w:szCs w:val="20"/>
-          <w:lang w:val="es-ES_tradnl"/>
-        </w:rPr>
-        <w:t xml:space="preserve">El sistema envía automáticamente un código de verificación al correo electrónico asociado al DPI, la cual tiene un tiempo </w:t>
-      </w:r>
-      <w:r>
-        <w:rPr>
-          <w:sz w:val="20"/>
-          <w:szCs w:val="20"/>
-          <w:lang w:val="es-ES_tradnl"/>
-        </w:rPr>
-        <w:t>límite</w:t>
-      </w:r>
-      <w:r>
-        <w:rPr>
-          <w:sz w:val="20"/>
-          <w:szCs w:val="20"/>
-          <w:lang w:val="es-ES_tradnl"/>
-        </w:rPr>
-        <w:t xml:space="preserve"> de 5 minutos, para que el ciudadano ingrese el código de verificación.</w:t>
-      </w:r>
-    </w:p>
-    <w:p>
-      <w:pPr>
-        <w:pStyle w:val="NormalWeb"/>
-        <w:numPr>
-          <w:ilvl w:val="2"/>
-          <w:numId w:val="7"/>
-        </w:numPr>
-        <w:spacing w:line="360" w:lineRule="auto"/>
-        <w:ind w:right="300"/>
-        <w:rPr>
-          <w:sz w:val="20"/>
-          <w:szCs w:val="20"/>
-          <w:lang w:val="es-ES_tradnl"/>
-        </w:rPr>
-      </w:pPr>
-      <w:r>
-        <w:rPr>
-          <w:sz w:val="20"/>
-          <w:szCs w:val="20"/>
-          <w:lang w:val="es-ES_tradnl"/>
-        </w:rPr>
-        <w:t>El s</w:t>
-      </w:r>
-      <w:r>
-        <w:rPr>
-          <w:sz w:val="20"/>
-          <w:szCs w:val="20"/>
-          <w:lang w:val="es-ES_tradnl"/>
-        </w:rPr>
-        <w:t>istema bloque</w:t>
-      </w:r>
-      <w:r>
-        <w:rPr>
-          <w:sz w:val="20"/>
-          <w:szCs w:val="20"/>
-          <w:lang w:val="es-ES_tradnl"/>
-        </w:rPr>
-        <w:t>a</w:t>
-      </w:r>
-      <w:r>
-        <w:rPr>
-          <w:sz w:val="20"/>
-          <w:szCs w:val="20"/>
-          <w:lang w:val="es-ES_tradnl"/>
-        </w:rPr>
-        <w:t xml:space="preserve"> el botón “Enviar código de verificación”</w:t>
-      </w:r>
-    </w:p>
-    <w:p>
-      <w:pPr>
-        <w:pStyle w:val="NormalWeb"/>
-        <w:numPr>
-          <w:ilvl w:val="2"/>
-          <w:numId w:val="7"/>
-        </w:numPr>
-        <w:spacing w:line="360" w:lineRule="auto"/>
-        <w:ind w:right="300"/>
-        <w:rPr>
-          <w:sz w:val="20"/>
-          <w:szCs w:val="20"/>
-          <w:lang w:val="es-ES_tradnl"/>
-        </w:rPr>
-      </w:pPr>
-      <w:r>
-        <w:rPr>
-          <w:sz w:val="20"/>
-          <w:szCs w:val="20"/>
-          <w:lang w:val="es-ES_tradnl"/>
-        </w:rPr>
-        <w:t>Sistema muestra el formulario código de verificación. RN12</w:t>
-      </w:r>
-    </w:p>
-    <w:p>
-      <w:pPr>
-        <w:pStyle w:val="NormalWeb"/>
-        <w:numPr>
-          <w:ilvl w:val="3"/>
-          <w:numId w:val="7"/>
-        </w:numPr>
-        <w:spacing w:line="360" w:lineRule="auto"/>
-        <w:ind w:right="300"/>
-        <w:rPr>
-          <w:sz w:val="20"/>
-          <w:szCs w:val="20"/>
-          <w:lang w:val="es-ES_tradnl"/>
-        </w:rPr>
-      </w:pPr>
-      <w:r>
-        <w:rPr>
-          <w:sz w:val="20"/>
-          <w:szCs w:val="20"/>
-          <w:lang w:val="es-ES_tradnl"/>
-        </w:rPr>
-        <w:t>Se habilita el botón “Verificar código”</w:t>
-      </w:r>
-    </w:p>
-    <w:p>
-      <w:pPr>
-        <w:pStyle w:val="NormalWeb"/>
-        <w:numPr>
-          <w:ilvl w:val="3"/>
-          <w:numId w:val="7"/>
-        </w:numPr>
-        <w:spacing w:line="360" w:lineRule="auto"/>
-        <w:ind w:right="300"/>
-        <w:rPr>
-          <w:sz w:val="20"/>
-          <w:szCs w:val="20"/>
-          <w:lang w:val="es-ES_tradnl"/>
-        </w:rPr>
-      </w:pPr>
-      <w:r>
-        <w:rPr>
-          <w:sz w:val="20"/>
-          <w:szCs w:val="20"/>
-          <w:lang w:val="es-ES_tradnl"/>
-        </w:rPr>
-        <w:t>Se habilita el botón “Corregir DPI</w:t>
-      </w:r>
-      <w:r>
-        <w:rPr>
-          <w:sz w:val="20"/>
-          <w:szCs w:val="20"/>
-          <w:highlight w:val="yellow"/>
-          <w:lang w:val="es-ES_tradnl"/>
-        </w:rPr>
-        <w:t xml:space="preserve">”.  FA Para saber a </w:t>
-      </w:r>
-      <w:proofErr w:type="spellStart"/>
-      <w:r>
-        <w:rPr>
-          <w:sz w:val="20"/>
-          <w:szCs w:val="20"/>
-          <w:highlight w:val="yellow"/>
-          <w:lang w:val="es-ES_tradnl"/>
-        </w:rPr>
-        <w:t>donde</w:t>
-      </w:r>
-      <w:proofErr w:type="spellEnd"/>
-      <w:r>
-        <w:rPr>
-          <w:sz w:val="20"/>
-          <w:szCs w:val="20"/>
-          <w:highlight w:val="yellow"/>
-          <w:lang w:val="es-ES_tradnl"/>
-        </w:rPr>
-        <w:t xml:space="preserve"> te dirige</w:t>
-      </w:r>
-    </w:p>
-    <w:p>
-      <w:pPr>
-        <w:pStyle w:val="NormalWeb"/>
-        <w:numPr>
-          <w:ilvl w:val="2"/>
-          <w:numId w:val="7"/>
-        </w:numPr>
-        <w:spacing w:line="360" w:lineRule="auto"/>
-        <w:ind w:right="300"/>
-        <w:rPr>
-          <w:sz w:val="20"/>
-          <w:szCs w:val="20"/>
-          <w:lang w:val="es-ES_tradnl"/>
-        </w:rPr>
-      </w:pPr>
-      <w:r>
-        <w:rPr>
-          <w:sz w:val="20"/>
-          <w:szCs w:val="20"/>
-          <w:lang w:val="es-ES_tradnl"/>
-        </w:rPr>
-        <w:t xml:space="preserve">El ciudadano ingresa el número de identificación. </w:t>
-      </w:r>
-    </w:p>
-    <w:p>
-      <w:pPr>
-        <w:pStyle w:val="NormalWeb"/>
-        <w:numPr>
-          <w:ilvl w:val="2"/>
-          <w:numId w:val="7"/>
-        </w:numPr>
-        <w:spacing w:line="360" w:lineRule="auto"/>
-        <w:ind w:right="300"/>
-        <w:rPr>
-          <w:sz w:val="20"/>
-          <w:szCs w:val="20"/>
-          <w:lang w:val="es-ES_tradnl"/>
-        </w:rPr>
-      </w:pPr>
-      <w:r>
-        <w:rPr>
-          <w:sz w:val="20"/>
-          <w:szCs w:val="20"/>
-          <w:lang w:val="es-ES_tradnl"/>
-        </w:rPr>
-        <w:t>El ciudadano selecciona el botón “Verificar código”. FA05</w:t>
-      </w:r>
-    </w:p>
-    <w:p>
-      <w:pPr>
-        <w:pStyle w:val="NormalWeb"/>
-        <w:numPr>
-          <w:ilvl w:val="2"/>
-          <w:numId w:val="7"/>
-        </w:numPr>
-        <w:spacing w:line="360" w:lineRule="auto"/>
-        <w:ind w:right="300"/>
-        <w:rPr>
-          <w:sz w:val="20"/>
-          <w:szCs w:val="20"/>
-          <w:lang w:val="es-ES_tradnl"/>
-        </w:rPr>
-      </w:pPr>
-      <w:r>
-        <w:rPr>
-          <w:sz w:val="20"/>
-          <w:szCs w:val="20"/>
-          <w:lang w:val="es-ES_tradnl"/>
-        </w:rPr>
-        <w:lastRenderedPageBreak/>
-        <w:t>El sistema muestra el formulario Registro de Caso. RN13</w:t>
-      </w:r>
-    </w:p>
-    <w:p>
-      <w:pPr>
-        <w:pStyle w:val="NormalWeb"/>
-        <w:numPr>
-          <w:ilvl w:val="3"/>
-          <w:numId w:val="7"/>
-        </w:numPr>
-        <w:spacing w:line="360" w:lineRule="auto"/>
-        <w:ind w:right="300"/>
-        <w:rPr>
-          <w:sz w:val="20"/>
-          <w:szCs w:val="20"/>
-          <w:lang w:val="es-ES_tradnl"/>
-        </w:rPr>
-      </w:pPr>
-      <w:r>
-        <w:rPr>
-          <w:sz w:val="20"/>
-          <w:szCs w:val="20"/>
-          <w:lang w:val="es-ES_tradnl"/>
-        </w:rPr>
-        <w:t>Se habilita el botón “Elegir archivo”.</w:t>
-      </w:r>
-    </w:p>
-    <w:p>
-      <w:pPr>
-        <w:pStyle w:val="NormalWeb"/>
-        <w:numPr>
-          <w:ilvl w:val="3"/>
-          <w:numId w:val="7"/>
-        </w:numPr>
-        <w:spacing w:line="360" w:lineRule="auto"/>
-        <w:ind w:right="300"/>
-        <w:rPr>
-          <w:sz w:val="20"/>
-          <w:szCs w:val="20"/>
-          <w:lang w:val="es-ES_tradnl"/>
-        </w:rPr>
-      </w:pPr>
-      <w:r>
-        <w:rPr>
-          <w:sz w:val="20"/>
-          <w:szCs w:val="20"/>
-          <w:lang w:val="es-ES_tradnl"/>
-        </w:rPr>
-        <w:t>Se habilita el botón “Registrar Caso”</w:t>
-      </w:r>
-    </w:p>
-    <w:p>
-      <w:pPr>
-        <w:pStyle w:val="NormalWeb"/>
-        <w:numPr>
-          <w:ilvl w:val="3"/>
-          <w:numId w:val="7"/>
-        </w:numPr>
-        <w:spacing w:line="360" w:lineRule="auto"/>
-        <w:ind w:right="300"/>
-        <w:rPr>
-          <w:sz w:val="20"/>
-          <w:szCs w:val="20"/>
-          <w:lang w:val="es-ES_tradnl"/>
-        </w:rPr>
-      </w:pPr>
-      <w:r>
-        <w:rPr>
-          <w:sz w:val="20"/>
-          <w:szCs w:val="20"/>
-          <w:lang w:val="es-ES_tradnl"/>
-        </w:rPr>
-        <w:t xml:space="preserve">Se habilita el botón “Volver al portal”. FA </w:t>
-      </w:r>
-    </w:p>
-    <w:p>
-      <w:pPr>
-        <w:pStyle w:val="NormalWeb"/>
-        <w:numPr>
-          <w:ilvl w:val="2"/>
-          <w:numId w:val="7"/>
-        </w:numPr>
-        <w:spacing w:line="360" w:lineRule="auto"/>
-        <w:ind w:right="300"/>
-        <w:rPr>
-          <w:sz w:val="20"/>
-          <w:szCs w:val="20"/>
-          <w:lang w:val="es-ES_tradnl"/>
-        </w:rPr>
-      </w:pPr>
-      <w:r>
-        <w:rPr>
-          <w:sz w:val="20"/>
-          <w:szCs w:val="20"/>
-          <w:lang w:val="es-ES_tradnl"/>
-        </w:rPr>
-        <w:t>El ciudadano selecciona el botón “Elegir archivo”. FA04</w:t>
-      </w:r>
-    </w:p>
-    <w:p>
-      <w:pPr>
-        <w:pStyle w:val="NormalWeb"/>
-        <w:numPr>
-          <w:ilvl w:val="2"/>
-          <w:numId w:val="7"/>
-        </w:numPr>
-        <w:spacing w:line="360" w:lineRule="auto"/>
-        <w:ind w:right="300"/>
-        <w:rPr>
-          <w:sz w:val="20"/>
-          <w:szCs w:val="20"/>
-          <w:lang w:val="es-ES_tradnl"/>
-        </w:rPr>
-      </w:pPr>
-      <w:r>
-        <w:rPr>
-          <w:sz w:val="20"/>
-          <w:szCs w:val="20"/>
-          <w:lang w:val="es-ES_tradnl"/>
-        </w:rPr>
-        <w:t>El ciudadano selecciona "Registrar Caso". FA03</w:t>
-      </w:r>
-    </w:p>
-    <w:p>
-      <w:pPr>
-        <w:pStyle w:val="NormalWeb"/>
-        <w:numPr>
-          <w:ilvl w:val="2"/>
-          <w:numId w:val="7"/>
-        </w:numPr>
-        <w:spacing w:line="360" w:lineRule="auto"/>
-        <w:ind w:right="300"/>
-        <w:rPr>
-          <w:sz w:val="20"/>
-          <w:szCs w:val="20"/>
-          <w:lang w:val="es-ES_tradnl"/>
-        </w:rPr>
-      </w:pPr>
-      <w:r>
-        <w:rPr>
-          <w:sz w:val="20"/>
-          <w:szCs w:val="20"/>
-          <w:lang w:val="es-ES_tradnl"/>
-        </w:rPr>
-        <w:t>El sistema genera el código de seguimiento.  Se genera con prefijo MG seguido de un guion (-), un correlativo de 4 dígitos, y el año de la fecha de ingreso.</w:t>
-      </w:r>
-    </w:p>
-    <w:p>
-      <w:pPr>
-        <w:pStyle w:val="NormalWeb"/>
-        <w:numPr>
-          <w:ilvl w:val="2"/>
-          <w:numId w:val="7"/>
-        </w:numPr>
-        <w:spacing w:line="360" w:lineRule="auto"/>
-        <w:ind w:right="300"/>
-        <w:rPr>
-          <w:sz w:val="20"/>
-          <w:szCs w:val="20"/>
-          <w:lang w:val="es-ES_tradnl"/>
-        </w:rPr>
-      </w:pPr>
-      <w:r>
-        <w:rPr>
-          <w:sz w:val="20"/>
-          <w:szCs w:val="20"/>
-          <w:lang w:val="es-ES_tradnl"/>
-        </w:rPr>
-        <w:t>El sistema cambia el estado del caso a Registrado. RN04</w:t>
-      </w:r>
-    </w:p>
-    <w:p>
-      <w:pPr>
-        <w:pStyle w:val="NormalWeb"/>
-        <w:numPr>
-          <w:ilvl w:val="2"/>
-          <w:numId w:val="7"/>
-        </w:numPr>
-        <w:spacing w:line="360" w:lineRule="auto"/>
-        <w:ind w:right="300"/>
-        <w:rPr>
-          <w:sz w:val="20"/>
-          <w:szCs w:val="20"/>
-          <w:lang w:val="es-ES_tradnl"/>
-        </w:rPr>
-      </w:pPr>
-      <w:r>
-        <w:rPr>
-          <w:sz w:val="20"/>
-          <w:szCs w:val="20"/>
-          <w:lang w:val="es-ES_tradnl"/>
-        </w:rPr>
-        <w:t>El sistema genera el informe inicial automático.</w:t>
-      </w:r>
-      <w:r>
-        <w:rPr>
-          <w:sz w:val="20"/>
-          <w:szCs w:val="20"/>
-          <w:lang w:val="es-ES_tradnl"/>
-        </w:rPr>
-        <w:t xml:space="preserve"> AN</w:t>
-      </w:r>
-      <w:r>
-        <w:rPr>
-          <w:sz w:val="20"/>
-          <w:szCs w:val="20"/>
-          <w:lang w:val="es-ES_tradnl"/>
-        </w:rPr>
-        <w:t>04 # 1</w:t>
-      </w:r>
-    </w:p>
-    <w:p>
-      <w:pPr>
-        <w:pStyle w:val="NormalWeb"/>
-        <w:numPr>
-          <w:ilvl w:val="2"/>
-          <w:numId w:val="7"/>
-        </w:numPr>
-        <w:spacing w:line="360" w:lineRule="auto"/>
-        <w:ind w:right="300"/>
-        <w:rPr>
-          <w:sz w:val="20"/>
-          <w:szCs w:val="20"/>
-          <w:lang w:val="es-ES_tradnl"/>
-        </w:rPr>
-      </w:pPr>
-      <w:r>
-        <w:rPr>
-          <w:sz w:val="20"/>
-          <w:szCs w:val="20"/>
-          <w:lang w:val="es-ES_tradnl"/>
-        </w:rPr>
-        <w:t>El sistema notifica al ciudadano el registro de su caso, al correo electrónico obtenido de la base precargada</w:t>
-      </w:r>
-      <w:r>
-        <w:rPr>
-          <w:sz w:val="20"/>
-          <w:szCs w:val="20"/>
-          <w:lang w:val="es-ES_tradnl"/>
-        </w:rPr>
-        <w:t>.</w:t>
-      </w:r>
-      <w:r>
-        <w:rPr>
-          <w:sz w:val="20"/>
-          <w:szCs w:val="20"/>
-          <w:lang w:val="es-ES_tradnl"/>
-        </w:rPr>
-        <w:t xml:space="preserve"> CU-09</w:t>
-      </w:r>
-    </w:p>
-    <w:p>
-      <w:pPr>
-        <w:pStyle w:val="NormalWeb"/>
-        <w:numPr>
-          <w:ilvl w:val="2"/>
-          <w:numId w:val="7"/>
-        </w:numPr>
-        <w:spacing w:line="360" w:lineRule="auto"/>
-        <w:ind w:right="300"/>
-        <w:rPr>
-          <w:sz w:val="20"/>
-          <w:szCs w:val="20"/>
-          <w:lang w:val="es-ES_tradnl"/>
-        </w:rPr>
-      </w:pPr>
-      <w:r>
-        <w:rPr>
-          <w:sz w:val="20"/>
-          <w:szCs w:val="20"/>
-          <w:lang w:val="es-ES_tradnl"/>
-        </w:rPr>
-        <w:t>El sistema muestra el mensaje de éxito con el código de seguimiento. AN01 # 3</w:t>
-      </w:r>
-    </w:p>
-    <w:p>
-      <w:pPr>
-        <w:pStyle w:val="NormalWeb"/>
-        <w:numPr>
-          <w:ilvl w:val="2"/>
-          <w:numId w:val="7"/>
-        </w:numPr>
-        <w:spacing w:line="360" w:lineRule="auto"/>
-        <w:ind w:right="300"/>
-        <w:rPr>
-          <w:sz w:val="20"/>
-          <w:szCs w:val="20"/>
-          <w:lang w:val="es-ES_tradnl"/>
-        </w:rPr>
-      </w:pPr>
-      <w:r>
-        <w:rPr>
-          <w:sz w:val="20"/>
-          <w:szCs w:val="20"/>
-          <w:lang w:val="es-ES_tradnl"/>
-        </w:rPr>
-        <w:t>El sistema almacena en bitácora el código de seguimiento. CU15</w:t>
-      </w:r>
-    </w:p>
-    <w:p>
-      <w:pPr>
-        <w:pStyle w:val="NormalWeb"/>
-        <w:numPr>
-          <w:ilvl w:val="2"/>
-          <w:numId w:val="7"/>
-        </w:numPr>
-        <w:spacing w:line="360" w:lineRule="auto"/>
-        <w:ind w:right="300"/>
-        <w:rPr>
-          <w:sz w:val="20"/>
-          <w:szCs w:val="20"/>
-          <w:lang w:val="es-ES_tradnl"/>
-        </w:rPr>
-      </w:pPr>
-      <w:r>
-        <w:rPr>
-          <w:sz w:val="20"/>
-          <w:szCs w:val="20"/>
-          <w:lang w:val="es-ES_tradnl"/>
-        </w:rPr>
-        <w:t>Fin del caso de uso.</w:t>
-      </w:r>
-    </w:p>
-    <w:p>
-      <w:pPr>
-        <w:pStyle w:val="NormalWeb"/>
-        <w:numPr>
-          <w:ilvl w:val="1"/>
-          <w:numId w:val="7"/>
-        </w:numPr>
-        <w:spacing w:line="360" w:lineRule="auto"/>
-        <w:ind w:right="300"/>
-        <w:rPr>
-          <w:b/>
-          <w:bCs/>
-          <w:sz w:val="27"/>
-          <w:szCs w:val="27"/>
-          <w:lang w:val="es-ES_tradnl"/>
-        </w:rPr>
-      </w:pPr>
-      <w:r>
-        <w:rPr>
-          <w:b/>
-          <w:bCs/>
-          <w:sz w:val="27"/>
-          <w:szCs w:val="27"/>
-          <w:lang w:val="es-ES_tradnl"/>
-        </w:rPr>
-        <w:t>Flujos Alternos</w:t>
-      </w:r>
-    </w:p>
-    <w:p>
-      <w:pPr>
-        <w:pStyle w:val="NormalWeb"/>
-        <w:spacing w:line="360" w:lineRule="auto"/>
-        <w:ind w:left="360" w:right="300"/>
-        <w:rPr>
-          <w:b/>
-          <w:bCs/>
-          <w:sz w:val="20"/>
-          <w:szCs w:val="20"/>
-          <w:lang w:val="es-ES_tradnl"/>
-        </w:rPr>
-      </w:pPr>
-      <w:r>
-        <w:rPr>
-          <w:b/>
-          <w:bCs/>
-          <w:sz w:val="20"/>
-          <w:szCs w:val="20"/>
-          <w:lang w:val="es-ES_tradnl"/>
-        </w:rPr>
-        <w:t>FA01 Número de identificación con formato no válido</w:t>
-      </w:r>
-    </w:p>
-    <w:p>
-      <w:pPr>
-        <w:pStyle w:val="NormalWeb"/>
+        <w:pStyle w:val="Ttulo1"/>
         <w:numPr>
           <w:ilvl w:val="0"/>
-          <w:numId w:val="10"/>
+          <w:numId w:val="24"/>
         </w:numPr>
-        <w:spacing w:before="0" w:beforeAutospacing="0" w:after="0" w:afterAutospacing="0" w:line="360" w:lineRule="auto"/>
-        <w:ind w:left="1066" w:right="301" w:hanging="357"/>
-        <w:rPr>
-          <w:sz w:val="20"/>
-          <w:szCs w:val="20"/>
-          <w:lang w:val="es-ES_tradnl"/>
-        </w:rPr>
-      </w:pPr>
-      <w:r>
-        <w:rPr>
-          <w:sz w:val="20"/>
-          <w:szCs w:val="20"/>
-          <w:lang w:val="es-ES_tradnl"/>
-        </w:rPr>
-        <w:t>El sistema despliega el mensaje de error. RN02 # 12</w:t>
-      </w:r>
-    </w:p>
-    <w:p>
-      <w:pPr>
-        <w:pStyle w:val="NormalWeb"/>
-        <w:numPr>
-          <w:ilvl w:val="0"/>
-          <w:numId w:val="10"/>
-        </w:numPr>
-        <w:spacing w:before="0" w:beforeAutospacing="0" w:after="0" w:afterAutospacing="0" w:line="360" w:lineRule="auto"/>
-        <w:ind w:left="1066" w:right="301" w:hanging="357"/>
-        <w:rPr>
-          <w:sz w:val="20"/>
-          <w:szCs w:val="20"/>
-          <w:lang w:val="es-ES_tradnl"/>
-        </w:rPr>
-      </w:pPr>
-      <w:r>
-        <w:rPr>
-          <w:sz w:val="20"/>
-          <w:szCs w:val="20"/>
-          <w:lang w:val="es-ES_tradnl"/>
-        </w:rPr>
-        <w:t xml:space="preserve">El sistema retorna al paso </w:t>
-      </w:r>
-      <w:r>
-        <w:rPr>
-          <w:sz w:val="20"/>
-          <w:szCs w:val="20"/>
-          <w:highlight w:val="yellow"/>
-          <w:lang w:val="es-ES_tradnl"/>
-        </w:rPr>
-        <w:t>2.3.3</w:t>
-      </w:r>
-      <w:r>
-        <w:rPr>
-          <w:sz w:val="20"/>
-          <w:szCs w:val="20"/>
-          <w:lang w:val="es-ES_tradnl"/>
-        </w:rPr>
-        <w:t>, para corregir.</w:t>
-      </w:r>
-    </w:p>
-    <w:p>
-      <w:pPr>
-        <w:pStyle w:val="NormalWeb"/>
-        <w:spacing w:line="360" w:lineRule="auto"/>
-        <w:ind w:left="360" w:right="300"/>
-        <w:rPr>
-          <w:b/>
-          <w:bCs/>
-          <w:sz w:val="20"/>
-          <w:szCs w:val="20"/>
-          <w:lang w:val="es-ES_tradnl"/>
-        </w:rPr>
-      </w:pPr>
-      <w:r>
-        <w:rPr>
-          <w:b/>
-          <w:bCs/>
-          <w:sz w:val="20"/>
-          <w:szCs w:val="20"/>
-          <w:lang w:val="es-ES_tradnl"/>
-        </w:rPr>
-        <w:t>FA02 Ciudadano no encontrado en la base precargada</w:t>
-      </w:r>
-    </w:p>
-    <w:p>
-      <w:pPr>
-        <w:pStyle w:val="NormalWeb"/>
-        <w:numPr>
-          <w:ilvl w:val="0"/>
-          <w:numId w:val="19"/>
-        </w:numPr>
-        <w:spacing w:before="0" w:beforeAutospacing="0" w:after="0" w:afterAutospacing="0" w:line="360" w:lineRule="auto"/>
-        <w:ind w:right="301"/>
-        <w:rPr>
-          <w:sz w:val="20"/>
-          <w:szCs w:val="20"/>
-          <w:lang w:val="es-ES_tradnl"/>
-        </w:rPr>
-      </w:pPr>
-      <w:r>
-        <w:rPr>
-          <w:sz w:val="20"/>
-          <w:szCs w:val="20"/>
-          <w:lang w:val="es-ES_tradnl"/>
-        </w:rPr>
-        <w:t>El sistema despliega el mensaje de error. RN02 # 14</w:t>
-      </w:r>
-    </w:p>
-    <w:p>
-      <w:pPr>
-        <w:pStyle w:val="NormalWeb"/>
-        <w:numPr>
-          <w:ilvl w:val="0"/>
-          <w:numId w:val="19"/>
-        </w:numPr>
-        <w:spacing w:before="0" w:beforeAutospacing="0" w:after="0" w:afterAutospacing="0" w:line="360" w:lineRule="auto"/>
-        <w:ind w:left="1066" w:right="301" w:hanging="357"/>
-        <w:rPr>
-          <w:sz w:val="20"/>
-          <w:szCs w:val="20"/>
-          <w:lang w:val="es-ES_tradnl"/>
-        </w:rPr>
-      </w:pPr>
-      <w:r>
-        <w:rPr>
-          <w:sz w:val="20"/>
-          <w:szCs w:val="20"/>
-          <w:lang w:val="es-ES_tradnl"/>
-        </w:rPr>
-        <w:t xml:space="preserve">El sistema retorna al paso </w:t>
-      </w:r>
-      <w:r>
-        <w:rPr>
-          <w:sz w:val="20"/>
-          <w:szCs w:val="20"/>
-          <w:highlight w:val="yellow"/>
-          <w:lang w:val="es-ES_tradnl"/>
-        </w:rPr>
-        <w:t>2.3.3,</w:t>
-      </w:r>
-      <w:r>
-        <w:rPr>
-          <w:sz w:val="20"/>
-          <w:szCs w:val="20"/>
-          <w:lang w:val="es-ES_tradnl"/>
-        </w:rPr>
-        <w:t xml:space="preserve"> para corregir.</w:t>
-      </w:r>
-    </w:p>
-    <w:p>
-      <w:pPr>
-        <w:pStyle w:val="NormalWeb"/>
-        <w:spacing w:line="360" w:lineRule="auto"/>
-        <w:ind w:left="360" w:right="300"/>
-        <w:rPr>
-          <w:b/>
-          <w:bCs/>
-          <w:sz w:val="20"/>
-          <w:szCs w:val="20"/>
-          <w:lang w:val="es-ES_tradnl"/>
-        </w:rPr>
-      </w:pPr>
-      <w:r>
-        <w:rPr>
-          <w:b/>
-          <w:bCs/>
-          <w:sz w:val="20"/>
-          <w:szCs w:val="20"/>
-          <w:lang w:val="es-ES_tradnl"/>
-        </w:rPr>
-        <w:t>FA03 Campos obligatorios</w:t>
-      </w:r>
-    </w:p>
-    <w:p>
-      <w:pPr>
-        <w:pStyle w:val="NormalWeb"/>
-        <w:numPr>
-          <w:ilvl w:val="0"/>
-          <w:numId w:val="20"/>
-        </w:numPr>
-        <w:spacing w:before="0" w:beforeAutospacing="0" w:after="0" w:afterAutospacing="0" w:line="360" w:lineRule="auto"/>
-        <w:ind w:right="301"/>
-        <w:rPr>
-          <w:sz w:val="20"/>
-          <w:szCs w:val="20"/>
-          <w:lang w:val="es-ES_tradnl"/>
-        </w:rPr>
-      </w:pPr>
-      <w:r>
-        <w:rPr>
-          <w:sz w:val="20"/>
-          <w:szCs w:val="20"/>
-          <w:lang w:val="es-ES_tradnl"/>
-        </w:rPr>
-        <w:t>El sistema valida los campos obligatorios.</w:t>
-      </w:r>
-    </w:p>
-    <w:p>
-      <w:pPr>
-        <w:pStyle w:val="NormalWeb"/>
-        <w:numPr>
-          <w:ilvl w:val="0"/>
-          <w:numId w:val="20"/>
-        </w:numPr>
-        <w:spacing w:before="0" w:beforeAutospacing="0" w:after="0" w:afterAutospacing="0" w:line="360" w:lineRule="auto"/>
-        <w:ind w:left="1066" w:right="301" w:hanging="357"/>
-        <w:rPr>
-          <w:sz w:val="20"/>
-          <w:szCs w:val="20"/>
-          <w:lang w:val="es-ES_tradnl"/>
-        </w:rPr>
-      </w:pPr>
-      <w:r>
-        <w:rPr>
-          <w:sz w:val="20"/>
-          <w:szCs w:val="20"/>
-          <w:lang w:val="es-ES_tradnl"/>
-        </w:rPr>
-        <w:t>El sistema muestra mensaje de error. AN02 # 7</w:t>
-      </w:r>
-    </w:p>
-    <w:p>
-      <w:pPr>
-        <w:pStyle w:val="NormalWeb"/>
-        <w:numPr>
-          <w:ilvl w:val="0"/>
-          <w:numId w:val="20"/>
-        </w:numPr>
-        <w:spacing w:before="0" w:beforeAutospacing="0" w:after="0" w:afterAutospacing="0" w:line="360" w:lineRule="auto"/>
-        <w:ind w:left="1066" w:right="301" w:hanging="357"/>
-        <w:rPr>
-          <w:sz w:val="20"/>
-          <w:szCs w:val="20"/>
-          <w:lang w:val="es-ES_tradnl"/>
-        </w:rPr>
-      </w:pPr>
-      <w:r>
-        <w:rPr>
-          <w:sz w:val="20"/>
-          <w:szCs w:val="20"/>
-          <w:lang w:val="es-ES_tradnl"/>
-        </w:rPr>
-        <w:t xml:space="preserve">El sistema retorna al </w:t>
-      </w:r>
-      <w:r>
-        <w:rPr>
-          <w:sz w:val="20"/>
-          <w:szCs w:val="20"/>
-          <w:highlight w:val="yellow"/>
-          <w:lang w:val="es-ES_tradnl"/>
-        </w:rPr>
-        <w:t>paso 2.3</w:t>
-      </w:r>
-      <w:r>
-        <w:rPr>
-          <w:sz w:val="20"/>
-          <w:szCs w:val="20"/>
-          <w:lang w:val="es-ES_tradnl"/>
-        </w:rPr>
-        <w:t>.</w:t>
-      </w:r>
-    </w:p>
-    <w:p>
-      <w:pPr>
-        <w:pStyle w:val="NormalWeb"/>
-        <w:spacing w:line="360" w:lineRule="auto"/>
-        <w:ind w:left="360" w:right="300"/>
-        <w:rPr>
-          <w:b/>
-          <w:bCs/>
-          <w:sz w:val="20"/>
-          <w:szCs w:val="20"/>
-          <w:lang w:val="es-ES_tradnl"/>
-        </w:rPr>
-      </w:pPr>
-      <w:r>
-        <w:rPr>
-          <w:b/>
-          <w:bCs/>
-          <w:sz w:val="20"/>
-          <w:szCs w:val="20"/>
-          <w:lang w:val="es-ES_tradnl"/>
-        </w:rPr>
-        <w:t>FA04 Evidencia no válida</w:t>
-      </w:r>
-    </w:p>
-    <w:p>
-      <w:pPr>
-        <w:pStyle w:val="NormalWeb"/>
-        <w:numPr>
-          <w:ilvl w:val="0"/>
-          <w:numId w:val="21"/>
-        </w:numPr>
-        <w:spacing w:before="0" w:beforeAutospacing="0" w:after="0" w:afterAutospacing="0" w:line="360" w:lineRule="auto"/>
-        <w:ind w:right="301"/>
-        <w:rPr>
-          <w:sz w:val="20"/>
-          <w:szCs w:val="20"/>
-          <w:lang w:val="es-ES_tradnl"/>
-        </w:rPr>
-      </w:pPr>
-      <w:r>
-        <w:rPr>
-          <w:sz w:val="20"/>
-          <w:szCs w:val="20"/>
-          <w:lang w:val="es-ES_tradnl"/>
-        </w:rPr>
-        <w:t>El sistema valida el tamaño y el formato del archivo adjunto.</w:t>
-      </w:r>
-    </w:p>
-    <w:p>
-      <w:pPr>
-        <w:pStyle w:val="NormalWeb"/>
-        <w:numPr>
-          <w:ilvl w:val="0"/>
-          <w:numId w:val="21"/>
-        </w:numPr>
-        <w:spacing w:before="0" w:beforeAutospacing="0" w:after="0" w:afterAutospacing="0" w:line="360" w:lineRule="auto"/>
-        <w:ind w:right="301"/>
-        <w:rPr>
-          <w:sz w:val="20"/>
-          <w:szCs w:val="20"/>
-          <w:lang w:val="es-ES_tradnl"/>
-        </w:rPr>
-      </w:pPr>
-      <w:r>
-        <w:rPr>
-          <w:sz w:val="20"/>
-          <w:szCs w:val="20"/>
-          <w:lang w:val="es-ES_tradnl"/>
-        </w:rPr>
-        <w:t>El sistema despliega el mensaje de error. AN02 # 8, 9</w:t>
-      </w:r>
-    </w:p>
-    <w:p>
-      <w:pPr>
-        <w:pStyle w:val="NormalWeb"/>
-        <w:numPr>
-          <w:ilvl w:val="0"/>
-          <w:numId w:val="21"/>
-        </w:numPr>
-        <w:spacing w:before="0" w:beforeAutospacing="0" w:after="0" w:afterAutospacing="0" w:line="360" w:lineRule="auto"/>
-        <w:ind w:right="301"/>
-        <w:rPr>
-          <w:sz w:val="20"/>
-          <w:szCs w:val="20"/>
-          <w:lang w:val="es-ES_tradnl"/>
-        </w:rPr>
-      </w:pPr>
-      <w:r>
-        <w:rPr>
-          <w:sz w:val="20"/>
-          <w:szCs w:val="20"/>
-          <w:lang w:val="es-ES_tradnl"/>
-        </w:rPr>
-        <w:t xml:space="preserve">El sistema retorna al paso </w:t>
-      </w:r>
-      <w:r>
-        <w:rPr>
-          <w:sz w:val="20"/>
-          <w:szCs w:val="20"/>
-          <w:highlight w:val="yellow"/>
-          <w:lang w:val="es-ES_tradnl"/>
-        </w:rPr>
-        <w:t>2.3.11</w:t>
-      </w:r>
-    </w:p>
-    <w:p>
-      <w:pPr>
-        <w:pStyle w:val="NormalWeb"/>
-        <w:spacing w:line="360" w:lineRule="auto"/>
-        <w:ind w:left="360" w:right="300"/>
-        <w:rPr>
-          <w:b/>
-          <w:bCs/>
-          <w:sz w:val="20"/>
-          <w:szCs w:val="20"/>
-          <w:lang w:val="es-ES_tradnl"/>
-        </w:rPr>
-      </w:pPr>
-      <w:r>
-        <w:rPr>
-          <w:b/>
-          <w:bCs/>
-          <w:sz w:val="20"/>
-          <w:szCs w:val="20"/>
-          <w:lang w:val="es-ES_tradnl"/>
-        </w:rPr>
-        <w:lastRenderedPageBreak/>
-        <w:t>FA05 Ingreso de código incorrecto</w:t>
-      </w:r>
-    </w:p>
-    <w:p>
-      <w:pPr>
-        <w:pStyle w:val="NormalWeb"/>
-        <w:numPr>
-          <w:ilvl w:val="0"/>
-          <w:numId w:val="22"/>
-        </w:numPr>
-        <w:spacing w:before="0" w:beforeAutospacing="0" w:after="0" w:afterAutospacing="0" w:line="360" w:lineRule="auto"/>
-        <w:ind w:right="301"/>
-        <w:rPr>
-          <w:sz w:val="20"/>
-          <w:szCs w:val="20"/>
-          <w:lang w:val="es-ES_tradnl"/>
-        </w:rPr>
-      </w:pPr>
-      <w:r>
-        <w:rPr>
-          <w:sz w:val="20"/>
-          <w:szCs w:val="20"/>
-          <w:lang w:val="es-ES_tradnl"/>
-        </w:rPr>
-        <w:t>El sistema muestra el mensaje AN02 # 6</w:t>
-      </w:r>
-    </w:p>
-    <w:p>
-      <w:pPr>
-        <w:pStyle w:val="NormalWeb"/>
-        <w:spacing w:before="0" w:beforeAutospacing="0" w:after="0" w:afterAutospacing="0" w:line="360" w:lineRule="auto"/>
-        <w:ind w:left="1068" w:right="301"/>
-        <w:rPr>
-          <w:sz w:val="20"/>
-          <w:szCs w:val="20"/>
-          <w:lang w:val="es-ES_tradnl"/>
-        </w:rPr>
-      </w:pPr>
-      <w:r>
-        <w:rPr>
-          <w:sz w:val="20"/>
-          <w:szCs w:val="20"/>
-          <w:lang w:val="es-ES_tradnl"/>
-        </w:rPr>
-        <w:t>S</w:t>
-      </w:r>
-      <w:r>
-        <w:rPr>
-          <w:sz w:val="20"/>
-          <w:szCs w:val="20"/>
-          <w:lang w:val="es-ES_tradnl"/>
-        </w:rPr>
-        <w:t>e permiten intentos ilimitados, mientras transcurran los 5 minutos</w:t>
-      </w:r>
-    </w:p>
-    <w:p>
-      <w:pPr>
-        <w:pStyle w:val="NormalWeb"/>
-        <w:numPr>
-          <w:ilvl w:val="0"/>
-          <w:numId w:val="7"/>
-        </w:numPr>
-        <w:spacing w:line="360" w:lineRule="auto"/>
-        <w:ind w:right="300"/>
-        <w:rPr>
-          <w:b/>
-          <w:bCs/>
-          <w:sz w:val="27"/>
-          <w:szCs w:val="27"/>
-          <w:lang w:val="es-ES_tradnl"/>
-        </w:rPr>
-      </w:pPr>
-      <w:r>
-        <w:rPr>
-          <w:b/>
-          <w:bCs/>
-          <w:sz w:val="27"/>
-          <w:szCs w:val="27"/>
-          <w:lang w:val="es-ES_tradnl"/>
-        </w:rPr>
-        <w:t>Postcondiciones</w:t>
-      </w:r>
-    </w:p>
-    <w:p>
-      <w:pPr>
-        <w:pStyle w:val="NormalWeb"/>
-        <w:numPr>
-          <w:ilvl w:val="1"/>
-          <w:numId w:val="7"/>
-        </w:numPr>
-        <w:spacing w:line="360" w:lineRule="auto"/>
-        <w:ind w:right="300"/>
-        <w:rPr>
-          <w:sz w:val="20"/>
-          <w:szCs w:val="20"/>
-          <w:lang w:val="es-ES_tradnl"/>
-        </w:rPr>
-      </w:pPr>
-      <w:r>
-        <w:rPr>
-          <w:sz w:val="20"/>
-          <w:szCs w:val="20"/>
-          <w:lang w:val="es-ES_tradnl"/>
-        </w:rPr>
-        <w:t>El caso queda registrado en estado Registrado, con un código de seguimiento único asignado.</w:t>
-      </w:r>
-    </w:p>
-    <w:p>
-      <w:pPr>
-        <w:pStyle w:val="NormalWeb"/>
-        <w:numPr>
-          <w:ilvl w:val="1"/>
-          <w:numId w:val="7"/>
-        </w:numPr>
-        <w:spacing w:line="360" w:lineRule="auto"/>
-        <w:ind w:right="300"/>
-        <w:rPr>
-          <w:sz w:val="20"/>
-          <w:szCs w:val="20"/>
-          <w:lang w:val="es-ES_tradnl"/>
-        </w:rPr>
-      </w:pPr>
-      <w:r>
-        <w:rPr>
-          <w:sz w:val="20"/>
-          <w:szCs w:val="20"/>
-          <w:lang w:val="es-ES_tradnl"/>
-        </w:rPr>
-        <w:t>El caso queda disponible en la bandeja del Auxiliar para su revisión CU-04.</w:t>
-      </w:r>
-    </w:p>
-    <w:p>
-      <w:pPr>
-        <w:pStyle w:val="NormalWeb"/>
-        <w:numPr>
-          <w:ilvl w:val="1"/>
-          <w:numId w:val="7"/>
-        </w:numPr>
-        <w:spacing w:line="360" w:lineRule="auto"/>
-        <w:ind w:right="300"/>
-        <w:rPr>
-          <w:sz w:val="20"/>
-          <w:szCs w:val="20"/>
-          <w:lang w:val="es-ES_tradnl"/>
-        </w:rPr>
-      </w:pPr>
-      <w:r>
-        <w:rPr>
-          <w:sz w:val="20"/>
-          <w:szCs w:val="20"/>
-          <w:lang w:val="es-ES_tradnl"/>
-        </w:rPr>
-        <w:t>El ciudadano recibe el código de seguimiento para consultar el estado de su caso CU-03.</w:t>
-      </w:r>
-    </w:p>
-    <w:p>
-      <w:pPr>
-        <w:pStyle w:val="NormalWeb"/>
-        <w:numPr>
-          <w:ilvl w:val="0"/>
-          <w:numId w:val="7"/>
-        </w:numPr>
-        <w:spacing w:line="360" w:lineRule="auto"/>
-        <w:ind w:right="300"/>
-        <w:rPr>
-          <w:b/>
-          <w:bCs/>
-          <w:sz w:val="27"/>
-          <w:szCs w:val="27"/>
-          <w:lang w:val="es-ES_tradnl"/>
-        </w:rPr>
-      </w:pPr>
-      <w:r>
-        <w:rPr>
-          <w:b/>
-          <w:bCs/>
-          <w:sz w:val="27"/>
-          <w:szCs w:val="27"/>
-          <w:lang w:val="es-ES_tradnl"/>
-        </w:rPr>
-        <w:t xml:space="preserve">Requerimientos </w:t>
-      </w:r>
-      <w:r>
-        <w:rPr>
-          <w:b/>
-          <w:bCs/>
-          <w:sz w:val="27"/>
-          <w:szCs w:val="27"/>
-          <w:lang w:val="es-ES_tradnl"/>
-        </w:rPr>
-        <w:t xml:space="preserve">Suplementarios o no </w:t>
-      </w:r>
-      <w:r>
-        <w:rPr>
-          <w:b/>
-          <w:bCs/>
-          <w:sz w:val="27"/>
-          <w:szCs w:val="27"/>
-          <w:lang w:val="es-ES_tradnl"/>
-        </w:rPr>
-        <w:t>Funcionales</w:t>
-      </w:r>
-    </w:p>
-    <w:p>
-      <w:pPr>
-        <w:pStyle w:val="NormalWeb"/>
-        <w:numPr>
-          <w:ilvl w:val="1"/>
-          <w:numId w:val="7"/>
-        </w:numPr>
-        <w:spacing w:line="360" w:lineRule="auto"/>
-        <w:ind w:right="300"/>
-        <w:rPr>
-          <w:sz w:val="20"/>
-          <w:szCs w:val="20"/>
-          <w:lang w:val="es-ES_tradnl"/>
-        </w:rPr>
-      </w:pPr>
-      <w:r>
-        <w:rPr>
-          <w:sz w:val="20"/>
-          <w:szCs w:val="20"/>
-          <w:lang w:val="es-ES_tradnl"/>
-        </w:rPr>
-        <w:t>El formulario deberá utilizar conexión segura HTTPS.</w:t>
-      </w:r>
-    </w:p>
-    <w:p>
-      <w:pPr>
-        <w:pStyle w:val="NormalWeb"/>
-        <w:numPr>
-          <w:ilvl w:val="1"/>
-          <w:numId w:val="7"/>
-        </w:numPr>
-        <w:spacing w:line="360" w:lineRule="auto"/>
-        <w:ind w:right="300"/>
-        <w:rPr>
-          <w:sz w:val="20"/>
-          <w:szCs w:val="20"/>
-          <w:lang w:val="es-ES_tradnl"/>
-        </w:rPr>
-      </w:pPr>
-      <w:r>
-        <w:rPr>
-          <w:sz w:val="20"/>
-          <w:szCs w:val="20"/>
-          <w:lang w:val="es-ES_tradnl"/>
-        </w:rPr>
-        <w:t>El registro no deberá requerir que el ciudadano cree una cuenta (ver RN-GLOBAL-04).</w:t>
-      </w:r>
-    </w:p>
-    <w:p>
-      <w:pPr>
-        <w:pStyle w:val="NormalWeb"/>
-        <w:numPr>
-          <w:ilvl w:val="1"/>
-          <w:numId w:val="7"/>
-        </w:numPr>
-        <w:spacing w:line="360" w:lineRule="auto"/>
-        <w:ind w:right="300"/>
-        <w:rPr>
-          <w:sz w:val="20"/>
-          <w:szCs w:val="20"/>
-          <w:lang w:val="es-ES_tradnl"/>
-        </w:rPr>
-      </w:pPr>
-      <w:r>
-        <w:rPr>
-          <w:sz w:val="20"/>
-          <w:szCs w:val="20"/>
-          <w:lang w:val="es-ES_tradnl"/>
-        </w:rPr>
-        <w:t>Los catálogos utilizados en el formulario deberán consultarse desde memoria caché, sin afectar el tiempo de respuesta del registro (ver RN-CU02-01).</w:t>
-      </w:r>
-    </w:p>
-    <w:p>
-      <w:pPr>
-        <w:pStyle w:val="NormalWeb"/>
-        <w:numPr>
-          <w:ilvl w:val="1"/>
-          <w:numId w:val="7"/>
-        </w:numPr>
-        <w:spacing w:line="360" w:lineRule="auto"/>
-        <w:ind w:right="300"/>
-        <w:rPr>
-          <w:sz w:val="20"/>
-          <w:szCs w:val="20"/>
-          <w:lang w:val="es-ES_tradnl"/>
-        </w:rPr>
-      </w:pPr>
-      <w:r>
-        <w:rPr>
-          <w:sz w:val="20"/>
-          <w:szCs w:val="20"/>
-          <w:lang w:val="es-ES_tradnl"/>
-        </w:rPr>
-        <w:t>El sistema deberá ser accesible desde dispositivos móviles.</w:t>
-      </w:r>
-    </w:p>
-    <w:p>
-      <w:pPr>
-        <w:pStyle w:val="NormalWeb"/>
-        <w:numPr>
-          <w:ilvl w:val="0"/>
-          <w:numId w:val="7"/>
-        </w:numPr>
-        <w:spacing w:line="360" w:lineRule="auto"/>
-        <w:ind w:right="300"/>
-        <w:rPr>
-          <w:b/>
-          <w:bCs/>
-          <w:sz w:val="27"/>
-          <w:szCs w:val="27"/>
-          <w:lang w:val="es-ES_tradnl"/>
-        </w:rPr>
-      </w:pPr>
-      <w:r>
-        <w:rPr>
-          <w:b/>
-          <w:bCs/>
-          <w:sz w:val="27"/>
-          <w:szCs w:val="27"/>
+        <w:rPr>
+          <w:sz w:val="28"/>
+          <w:szCs w:val="28"/>
+          <w:lang w:val="es-ES_tradnl"/>
+        </w:rPr>
+      </w:pPr>
+      <w:r>
+        <w:rPr>
+          <w:sz w:val="28"/>
+          <w:szCs w:val="28"/>
           <w:lang w:val="es-ES_tradnl"/>
         </w:rPr>
         <w:t>Firmas Necesarias</w:t>
@@ -3053,7 +2663,7 @@
 </file>
 
 <file path=word/endnotes.xml><?xml version="1.0" encoding="utf-8"?>
-<w:endnotes xmlns:wpc="http://schemas.microsoft.com/office/word/2010/wordprocessingCanvas" xmlns:cx="http://schemas.microsoft.com/office/drawing/2014/chartex" xmlns:cx1="http://schemas.microsoft.com/office/drawing/2015/9/8/chartex" xmlns:cx2="http://schemas.microsoft.com/office/drawing/2015/10/21/chartex" xmlns:cx3="http://schemas.microsoft.com/office/drawing/2016/5/9/chartex" xmlns:cx4="http://schemas.microsoft.com/office/drawing/2016/5/10/chartex" xmlns:cx5="http://schemas.microsoft.com/office/drawing/2016/5/11/chartex" xmlns:cx6="http://schemas.microsoft.com/office/drawing/2016/5/12/chartex" xmlns:cx7="http://schemas.microsoft.com/office/drawing/2016/5/13/chartex" xmlns:cx8="http://schemas.microsoft.com/office/drawing/2016/5/14/chartex" xmlns:mc="http://schemas.openxmlformats.org/markup-compatibility/2006" xmlns:aink="http://schemas.microsoft.com/office/drawing/2016/ink" xmlns:am3d="http://schemas.microsoft.com/office/drawing/2017/model3d" xmlns:o="urn:schemas-microsoft-com:office:office" xmlns:oel="http://schemas.microsoft.com/office/2019/extlst" xmlns:r="http://schemas.openxmlformats.org/officeDocument/2006/relationships" xmlns:m="http://schemas.openxmlformats.org/officeDocument/2006/math" xmlns:v="urn:schemas-microsoft-com:vml" xmlns:wp14="http://schemas.microsoft.com/office/word/2010/wordprocessingDrawing" xmlns:wp="http://schemas.openxmlformats.org/drawingml/2006/wordprocessingDrawing" xmlns:w10="urn:schemas-microsoft-com:office:word" xmlns:w="http://schemas.openxmlformats.org/wordprocessingml/2006/main" xmlns:w14="http://schemas.microsoft.com/office/word/2010/wordml" xmlns:w15="http://schemas.microsoft.com/office/word/2012/wordml" xmlns:w16cei="http://schemas.microsoft.com/office/word/2026/wordml/cei" xmlns:w16cex="http://schemas.microsoft.com/office/word/2018/wordml/cex" xmlns:w16cid="http://schemas.microsoft.com/office/word/2016/wordml/cid" xmlns:w16="http://schemas.microsoft.com/office/word/2018/wordml" xmlns:w16du="http://schemas.microsoft.com/office/word/2023/wordml/word16du" xmlns:w16sdtdh="http://schemas.microsoft.com/office/word/2020/wordml/sdtdatahash" xmlns:w16sdtfl="http://schemas.microsoft.com/office/word/2024/wordml/sdtformatlock" xmlns:w16se="http://schemas.microsoft.com/office/word/2015/wordml/symex" xmlns:wpg="http://schemas.microsoft.com/office/word/2010/wordprocessingGroup" xmlns:wpi="http://schemas.microsoft.com/office/word/2010/wordprocessingInk" xmlns:wne="http://schemas.microsoft.com/office/word/2006/wordml" xmlns:wps="http://schemas.microsoft.com/office/word/2010/wordprocessingShape" mc:Ignorable="w14 w15 w16se w16cid w16 w16cex w16sdtdh w16sdtfl w16du wp14">
+<w:endnotes xmlns:wpc="http://schemas.microsoft.com/office/word/2010/wordprocessingCanvas" xmlns:cx="http://schemas.microsoft.com/office/drawing/2014/chartex" xmlns:cx1="http://schemas.microsoft.com/office/drawing/2015/9/8/chartex" xmlns:cx2="http://schemas.microsoft.com/office/drawing/2015/10/21/chartex" xmlns:cx3="http://schemas.microsoft.com/office/drawing/2016/5/9/chartex" xmlns:cx4="http://schemas.microsoft.com/office/drawing/2016/5/10/chartex" xmlns:cx5="http://schemas.microsoft.com/office/drawing/2016/5/11/chartex" xmlns:cx6="http://schemas.microsoft.com/office/drawing/2016/5/12/chartex" xmlns:cx7="http://schemas.microsoft.com/office/drawing/2016/5/13/chartex" xmlns:cx8="http://schemas.microsoft.com/office/drawing/2016/5/14/chartex" xmlns:mc="http://schemas.openxmlformats.org/markup-compatibility/2006" xmlns:aink="http://schemas.microsoft.com/office/drawing/2016/ink" xmlns:am3d="http://schemas.microsoft.com/office/drawing/2017/model3d" xmlns:o="urn:schemas-microsoft-com:office:office" xmlns:oel="http://schemas.microsoft.com/office/2019/extlst" xmlns:r="http://schemas.openxmlformats.org/officeDocument/2006/relationships" xmlns:m="http://schemas.openxmlformats.org/officeDocument/2006/math" xmlns:v="urn:schemas-microsoft-com:vml" xmlns:wp14="http://schemas.microsoft.com/office/word/2010/wordprocessingDrawing" xmlns:wp="http://schemas.openxmlformats.org/drawingml/2006/wordprocessingDrawing" xmlns:w10="urn:schemas-microsoft-com:office:word" xmlns:w="http://schemas.openxmlformats.org/wordprocessingml/2006/main" xmlns:w14="http://schemas.microsoft.com/office/word/2010/wordml" xmlns:w15="http://schemas.microsoft.com/office/word/2012/wordml" xmlns:w16cex="http://schemas.microsoft.com/office/word/2018/wordml/cex" xmlns:w16cid="http://schemas.microsoft.com/office/word/2016/wordml/cid" xmlns:w16="http://schemas.microsoft.com/office/word/2018/wordml" xmlns:w16du="http://schemas.microsoft.com/office/word/2023/wordml/word16du" xmlns:w16sdtdh="http://schemas.microsoft.com/office/word/2020/wordml/sdtdatahash" xmlns:w16sdtfl="http://schemas.microsoft.com/office/word/2024/wordml/sdtformatlock" xmlns:w16se="http://schemas.microsoft.com/office/word/2015/wordml/symex" xmlns:wpg="http://schemas.microsoft.com/office/word/2010/wordprocessingGroup" xmlns:wpi="http://schemas.microsoft.com/office/word/2010/wordprocessingInk" xmlns:wne="http://schemas.microsoft.com/office/word/2006/wordml" xmlns:wps="http://schemas.microsoft.com/office/word/2010/wordprocessingShape" mc:Ignorable="w14 w15 w16se w16cid w16 w16cex w16sdtdh w16sdtfl w16du wp14">
   <w:endnote w:type="separator" w:id="-1">
     <w:p>
       <w:r>
@@ -3072,7 +2682,7 @@
 </file>
 
 <file path=word/footnotes.xml><?xml version="1.0" encoding="utf-8"?>
-<w:footnotes xmlns:wpc="http://schemas.microsoft.com/office/word/2010/wordprocessingCanvas" xmlns:cx="http://schemas.microsoft.com/office/drawing/2014/chartex" xmlns:cx1="http://schemas.microsoft.com/office/drawing/2015/9/8/chartex" xmlns:cx2="http://schemas.microsoft.com/office/drawing/2015/10/21/chartex" xmlns:cx3="http://schemas.microsoft.com/office/drawing/2016/5/9/chartex" xmlns:cx4="http://schemas.microsoft.com/office/drawing/2016/5/10/chartex" xmlns:cx5="http://schemas.microsoft.com/office/drawing/2016/5/11/chartex" xmlns:cx6="http://schemas.microsoft.com/office/drawing/2016/5/12/chartex" xmlns:cx7="http://schemas.microsoft.com/office/drawing/2016/5/13/chartex" xmlns:cx8="http://schemas.microsoft.com/office/drawing/2016/5/14/chartex" xmlns:mc="http://schemas.openxmlformats.org/markup-compatibility/2006" xmlns:aink="http://schemas.microsoft.com/office/drawing/2016/ink" xmlns:am3d="http://schemas.microsoft.com/office/drawing/2017/model3d" xmlns:o="urn:schemas-microsoft-com:office:office" xmlns:oel="http://schemas.microsoft.com/office/2019/extlst" xmlns:r="http://schemas.openxmlformats.org/officeDocument/2006/relationships" xmlns:m="http://schemas.openxmlformats.org/officeDocument/2006/math" xmlns:v="urn:schemas-microsoft-com:vml" xmlns:wp14="http://schemas.microsoft.com/office/word/2010/wordprocessingDrawing" xmlns:wp="http://schemas.openxmlformats.org/drawingml/2006/wordprocessingDrawing" xmlns:w10="urn:schemas-microsoft-com:office:word" xmlns:w="http://schemas.openxmlformats.org/wordprocessingml/2006/main" xmlns:w14="http://schemas.microsoft.com/office/word/2010/wordml" xmlns:w15="http://schemas.microsoft.com/office/word/2012/wordml" xmlns:w16cei="http://schemas.microsoft.com/office/word/2026/wordml/cei" xmlns:w16cex="http://schemas.microsoft.com/office/word/2018/wordml/cex" xmlns:w16cid="http://schemas.microsoft.com/office/word/2016/wordml/cid" xmlns:w16="http://schemas.microsoft.com/office/word/2018/wordml" xmlns:w16du="http://schemas.microsoft.com/office/word/2023/wordml/word16du" xmlns:w16sdtdh="http://schemas.microsoft.com/office/word/2020/wordml/sdtdatahash" xmlns:w16sdtfl="http://schemas.microsoft.com/office/word/2024/wordml/sdtformatlock" xmlns:w16se="http://schemas.microsoft.com/office/word/2015/wordml/symex" xmlns:wpg="http://schemas.microsoft.com/office/word/2010/wordprocessingGroup" xmlns:wpi="http://schemas.microsoft.com/office/word/2010/wordprocessingInk" xmlns:wne="http://schemas.microsoft.com/office/word/2006/wordml" xmlns:wps="http://schemas.microsoft.com/office/word/2010/wordprocessingShape" mc:Ignorable="w14 w15 w16se w16cid w16 w16cex w16sdtdh w16sdtfl w16du wp14">
+<w:footnotes xmlns:wpc="http://schemas.microsoft.com/office/word/2010/wordprocessingCanvas" xmlns:cx="http://schemas.microsoft.com/office/drawing/2014/chartex" xmlns:cx1="http://schemas.microsoft.com/office/drawing/2015/9/8/chartex" xmlns:cx2="http://schemas.microsoft.com/office/drawing/2015/10/21/chartex" xmlns:cx3="http://schemas.microsoft.com/office/drawing/2016/5/9/chartex" xmlns:cx4="http://schemas.microsoft.com/office/drawing/2016/5/10/chartex" xmlns:cx5="http://schemas.microsoft.com/office/drawing/2016/5/11/chartex" xmlns:cx6="http://schemas.microsoft.com/office/drawing/2016/5/12/chartex" xmlns:cx7="http://schemas.microsoft.com/office/drawing/2016/5/13/chartex" xmlns:cx8="http://schemas.microsoft.com/office/drawing/2016/5/14/chartex" xmlns:mc="http://schemas.openxmlformats.org/markup-compatibility/2006" xmlns:aink="http://schemas.microsoft.com/office/drawing/2016/ink" xmlns:am3d="http://schemas.microsoft.com/office/drawing/2017/model3d" xmlns:o="urn:schemas-microsoft-com:office:office" xmlns:oel="http://schemas.microsoft.com/office/2019/extlst" xmlns:r="http://schemas.openxmlformats.org/officeDocument/2006/relationships" xmlns:m="http://schemas.openxmlformats.org/officeDocument/2006/math" xmlns:v="urn:schemas-microsoft-com:vml" xmlns:wp14="http://schemas.microsoft.com/office/word/2010/wordprocessingDrawing" xmlns:wp="http://schemas.openxmlformats.org/drawingml/2006/wordprocessingDrawing" xmlns:w10="urn:schemas-microsoft-com:office:word" xmlns:w="http://schemas.openxmlformats.org/wordprocessingml/2006/main" xmlns:w14="http://schemas.microsoft.com/office/word/2010/wordml" xmlns:w15="http://schemas.microsoft.com/office/word/2012/wordml" xmlns:w16cex="http://schemas.microsoft.com/office/word/2018/wordml/cex" xmlns:w16cid="http://schemas.microsoft.com/office/word/2016/wordml/cid" xmlns:w16="http://schemas.microsoft.com/office/word/2018/wordml" xmlns:w16du="http://schemas.microsoft.com/office/word/2023/wordml/word16du" xmlns:w16sdtdh="http://schemas.microsoft.com/office/word/2020/wordml/sdtdatahash" xmlns:w16sdtfl="http://schemas.microsoft.com/office/word/2024/wordml/sdtformatlock" xmlns:w16se="http://schemas.microsoft.com/office/word/2015/wordml/symex" xmlns:wpg="http://schemas.microsoft.com/office/word/2010/wordprocessingGroup" xmlns:wpi="http://schemas.microsoft.com/office/word/2010/wordprocessingInk" xmlns:wne="http://schemas.microsoft.com/office/word/2006/wordml" xmlns:wps="http://schemas.microsoft.com/office/word/2010/wordprocessingShape" mc:Ignorable="w14 w15 w16se w16cid w16 w16cex w16sdtdh w16sdtfl w16du wp14">
   <w:footnote w:type="separator" w:id="-1">
     <w:p>
       <w:r>
@@ -3091,7 +2701,7 @@
 </file>
 
 <file path=word/numbering.xml><?xml version="1.0" encoding="utf-8"?>
-<w:numbering xmlns:wpc="http://schemas.microsoft.com/office/word/2010/wordprocessingCanvas" xmlns:cx="http://schemas.microsoft.com/office/drawing/2014/chartex" xmlns:cx1="http://schemas.microsoft.com/office/drawing/2015/9/8/chartex" xmlns:cx2="http://schemas.microsoft.com/office/drawing/2015/10/21/chartex" xmlns:cx3="http://schemas.microsoft.com/office/drawing/2016/5/9/chartex" xmlns:cx4="http://schemas.microsoft.com/office/drawing/2016/5/10/chartex" xmlns:cx5="http://schemas.microsoft.com/office/drawing/2016/5/11/chartex" xmlns:cx6="http://schemas.microsoft.com/office/drawing/2016/5/12/chartex" xmlns:cx7="http://schemas.microsoft.com/office/drawing/2016/5/13/chartex" xmlns:cx8="http://schemas.microsoft.com/office/drawing/2016/5/14/chartex" xmlns:mc="http://schemas.openxmlformats.org/markup-compatibility/2006" xmlns:aink="http://schemas.microsoft.com/office/drawing/2016/ink" xmlns:am3d="http://schemas.microsoft.com/office/drawing/2017/model3d" xmlns:o="urn:schemas-microsoft-com:office:office" xmlns:oel="http://schemas.microsoft.com/office/2019/extlst" xmlns:r="http://schemas.openxmlformats.org/officeDocument/2006/relationships" xmlns:m="http://schemas.openxmlformats.org/officeDocument/2006/math" xmlns:v="urn:schemas-microsoft-com:vml" xmlns:wp14="http://schemas.microsoft.com/office/word/2010/wordprocessingDrawing" xmlns:wp="http://schemas.openxmlformats.org/drawingml/2006/wordprocessingDrawing" xmlns:w10="urn:schemas-microsoft-com:office:word" xmlns:w="http://schemas.openxmlformats.org/wordprocessingml/2006/main" xmlns:w14="http://schemas.microsoft.com/office/word/2010/wordml" xmlns:w15="http://schemas.microsoft.com/office/word/2012/wordml" xmlns:w16cei="http://schemas.microsoft.com/office/word/2026/wordml/cei" xmlns:w16cex="http://schemas.microsoft.com/office/word/2018/wordml/cex" xmlns:w16cid="http://schemas.microsoft.com/office/word/2016/wordml/cid" xmlns:w16="http://schemas.microsoft.com/office/word/2018/wordml" xmlns:w16du="http://schemas.microsoft.com/office/word/2023/wordml/word16du" xmlns:w16sdtdh="http://schemas.microsoft.com/office/word/2020/wordml/sdtdatahash" xmlns:w16sdtfl="http://schemas.microsoft.com/office/word/2024/wordml/sdtformatlock" xmlns:w16se="http://schemas.microsoft.com/office/word/2015/wordml/symex" xmlns:wpg="http://schemas.microsoft.com/office/word/2010/wordprocessingGroup" xmlns:wpi="http://schemas.microsoft.com/office/word/2010/wordprocessingInk" xmlns:wne="http://schemas.microsoft.com/office/word/2006/wordml" xmlns:wps="http://schemas.microsoft.com/office/word/2010/wordprocessingShape" mc:Ignorable="w14 w15 w16se w16cid w16 w16cex w16sdtdh w16sdtfl w16du wp14">
+<w:numbering xmlns:wpc="http://schemas.microsoft.com/office/word/2010/wordprocessingCanvas" xmlns:cx="http://schemas.microsoft.com/office/drawing/2014/chartex" xmlns:cx1="http://schemas.microsoft.com/office/drawing/2015/9/8/chartex" xmlns:cx2="http://schemas.microsoft.com/office/drawing/2015/10/21/chartex" xmlns:cx3="http://schemas.microsoft.com/office/drawing/2016/5/9/chartex" xmlns:cx4="http://schemas.microsoft.com/office/drawing/2016/5/10/chartex" xmlns:cx5="http://schemas.microsoft.com/office/drawing/2016/5/11/chartex" xmlns:cx6="http://schemas.microsoft.com/office/drawing/2016/5/12/chartex" xmlns:cx7="http://schemas.microsoft.com/office/drawing/2016/5/13/chartex" xmlns:cx8="http://schemas.microsoft.com/office/drawing/2016/5/14/chartex" xmlns:mc="http://schemas.openxmlformats.org/markup-compatibility/2006" xmlns:aink="http://schemas.microsoft.com/office/drawing/2016/ink" xmlns:am3d="http://schemas.microsoft.com/office/drawing/2017/model3d" xmlns:o="urn:schemas-microsoft-com:office:office" xmlns:oel="http://schemas.microsoft.com/office/2019/extlst" xmlns:r="http://schemas.openxmlformats.org/officeDocument/2006/relationships" xmlns:m="http://schemas.openxmlformats.org/officeDocument/2006/math" xmlns:v="urn:schemas-microsoft-com:vml" xmlns:wp14="http://schemas.microsoft.com/office/word/2010/wordprocessingDrawing" xmlns:wp="http://schemas.openxmlformats.org/drawingml/2006/wordprocessingDrawing" xmlns:w10="urn:schemas-microsoft-com:office:word" xmlns:w="http://schemas.openxmlformats.org/wordprocessingml/2006/main" xmlns:w14="http://schemas.microsoft.com/office/word/2010/wordml" xmlns:w15="http://schemas.microsoft.com/office/word/2012/wordml" xmlns:w16cex="http://schemas.microsoft.com/office/word/2018/wordml/cex" xmlns:w16cid="http://schemas.microsoft.com/office/word/2016/wordml/cid" xmlns:w16="http://schemas.microsoft.com/office/word/2018/wordml" xmlns:w16du="http://schemas.microsoft.com/office/word/2023/wordml/word16du" xmlns:w16sdtdh="http://schemas.microsoft.com/office/word/2020/wordml/sdtdatahash" xmlns:w16sdtfl="http://schemas.microsoft.com/office/word/2024/wordml/sdtformatlock" xmlns:w16se="http://schemas.microsoft.com/office/word/2015/wordml/symex" xmlns:wpg="http://schemas.microsoft.com/office/word/2010/wordprocessingGroup" xmlns:wpi="http://schemas.microsoft.com/office/word/2010/wordprocessingInk" xmlns:wne="http://schemas.microsoft.com/office/word/2006/wordml" xmlns:wps="http://schemas.microsoft.com/office/word/2010/wordprocessingShape" mc:Ignorable="w14 w15 w16se w16cid w16 w16cex w16sdtdh w16sdtfl w16du wp14">
   <w:abstractNum w:abstractNumId="0" w15:restartNumberingAfterBreak="0">
     <w:nsid w:val="02F81A67"/>
     <w:multiLevelType w:val="multilevel"/>
@@ -3355,6 +2965,92 @@
     </w:lvl>
   </w:abstractNum>
   <w:abstractNum w:abstractNumId="2" w15:restartNumberingAfterBreak="0">
+    <w:nsid w:val="0D2D17C5"/>
+    <w:multiLevelType w:val="hybridMultilevel"/>
+    <w:tmpl w:val="1FF8E2B4"/>
+    <w:lvl w:ilvl="0" w:tplc="100A000F">
+      <w:start w:val="1"/>
+      <w:numFmt w:val="decimal"/>
+      <w:lvlText w:val="%1."/>
+      <w:lvlJc w:val="left"/>
+      <w:pPr>
+        <w:ind w:left="720" w:hanging="360"/>
+      </w:pPr>
+    </w:lvl>
+    <w:lvl w:ilvl="1" w:tplc="100A0019" w:tentative="1">
+      <w:start w:val="1"/>
+      <w:numFmt w:val="lowerLetter"/>
+      <w:lvlText w:val="%2."/>
+      <w:lvlJc w:val="left"/>
+      <w:pPr>
+        <w:ind w:left="1440" w:hanging="360"/>
+      </w:pPr>
+    </w:lvl>
+    <w:lvl w:ilvl="2" w:tplc="100A001B" w:tentative="1">
+      <w:start w:val="1"/>
+      <w:numFmt w:val="lowerRoman"/>
+      <w:lvlText w:val="%3."/>
+      <w:lvlJc w:val="right"/>
+      <w:pPr>
+        <w:ind w:left="2160" w:hanging="180"/>
+      </w:pPr>
+    </w:lvl>
+    <w:lvl w:ilvl="3" w:tplc="100A000F" w:tentative="1">
+      <w:start w:val="1"/>
+      <w:numFmt w:val="decimal"/>
+      <w:lvlText w:val="%4."/>
+      <w:lvlJc w:val="left"/>
+      <w:pPr>
+        <w:ind w:left="2880" w:hanging="360"/>
+      </w:pPr>
+    </w:lvl>
+    <w:lvl w:ilvl="4" w:tplc="100A0019" w:tentative="1">
+      <w:start w:val="1"/>
+      <w:numFmt w:val="lowerLetter"/>
+      <w:lvlText w:val="%5."/>
+      <w:lvlJc w:val="left"/>
+      <w:pPr>
+        <w:ind w:left="3600" w:hanging="360"/>
+      </w:pPr>
+    </w:lvl>
+    <w:lvl w:ilvl="5" w:tplc="100A001B" w:tentative="1">
+      <w:start w:val="1"/>
+      <w:numFmt w:val="lowerRoman"/>
+      <w:lvlText w:val="%6."/>
+      <w:lvlJc w:val="right"/>
+      <w:pPr>
+        <w:ind w:left="4320" w:hanging="180"/>
+      </w:pPr>
+    </w:lvl>
+    <w:lvl w:ilvl="6" w:tplc="100A000F" w:tentative="1">
+      <w:start w:val="1"/>
+      <w:numFmt w:val="decimal"/>
+      <w:lvlText w:val="%7."/>
+      <w:lvlJc w:val="left"/>
+      <w:pPr>
+        <w:ind w:left="5040" w:hanging="360"/>
+      </w:pPr>
+    </w:lvl>
+    <w:lvl w:ilvl="7" w:tplc="100A0019" w:tentative="1">
+      <w:start w:val="1"/>
+      <w:numFmt w:val="lowerLetter"/>
+      <w:lvlText w:val="%8."/>
+      <w:lvlJc w:val="left"/>
+      <w:pPr>
+        <w:ind w:left="5760" w:hanging="360"/>
+      </w:pPr>
+    </w:lvl>
+    <w:lvl w:ilvl="8" w:tplc="100A001B" w:tentative="1">
+      <w:start w:val="1"/>
+      <w:numFmt w:val="lowerRoman"/>
+      <w:lvlText w:val="%9."/>
+      <w:lvlJc w:val="right"/>
+      <w:pPr>
+        <w:ind w:left="6480" w:hanging="180"/>
+      </w:pPr>
+    </w:lvl>
+  </w:abstractNum>
+  <w:abstractNum w:abstractNumId="3" w15:restartNumberingAfterBreak="0">
     <w:nsid w:val="1081640C"/>
     <w:multiLevelType w:val="hybridMultilevel"/>
     <w:tmpl w:val="B79095BA"/>
@@ -3443,7 +3139,7 @@
       </w:pPr>
     </w:lvl>
   </w:abstractNum>
-  <w:abstractNum w:abstractNumId="3" w15:restartNumberingAfterBreak="0">
+  <w:abstractNum w:abstractNumId="4" w15:restartNumberingAfterBreak="0">
     <w:nsid w:val="14EA0875"/>
     <w:multiLevelType w:val="multilevel"/>
     <w:tmpl w:val="100A001F"/>
@@ -3529,7 +3225,7 @@
       </w:pPr>
     </w:lvl>
   </w:abstractNum>
-  <w:abstractNum w:abstractNumId="4" w15:restartNumberingAfterBreak="0">
+  <w:abstractNum w:abstractNumId="5" w15:restartNumberingAfterBreak="0">
     <w:nsid w:val="18F6400A"/>
     <w:multiLevelType w:val="hybridMultilevel"/>
     <w:tmpl w:val="E342E38E"/>
@@ -3615,7 +3311,7 @@
       </w:pPr>
     </w:lvl>
   </w:abstractNum>
-  <w:abstractNum w:abstractNumId="5" w15:restartNumberingAfterBreak="0">
+  <w:abstractNum w:abstractNumId="6" w15:restartNumberingAfterBreak="0">
     <w:nsid w:val="1F390D10"/>
     <w:multiLevelType w:val="singleLevel"/>
     <w:tmpl w:val="4D90F492"/>
@@ -3630,7 +3326,96 @@
       </w:pPr>
     </w:lvl>
   </w:abstractNum>
-  <w:abstractNum w:abstractNumId="6" w15:restartNumberingAfterBreak="0">
+  <w:abstractNum w:abstractNumId="7" w15:restartNumberingAfterBreak="0">
+    <w:nsid w:val="208D0935"/>
+    <w:multiLevelType w:val="hybridMultilevel"/>
+    <w:tmpl w:val="B79095BA"/>
+    <w:lvl w:ilvl="0" w:tplc="FFFFFFFF">
+      <w:start w:val="1"/>
+      <w:numFmt w:val="decimal"/>
+      <w:lvlText w:val="%1."/>
+      <w:lvlJc w:val="left"/>
+      <w:pPr>
+        <w:ind w:left="1068" w:hanging="360"/>
+      </w:pPr>
+      <w:rPr>
+        <w:rFonts w:hint="default"/>
+      </w:rPr>
+    </w:lvl>
+    <w:lvl w:ilvl="1" w:tplc="FFFFFFFF" w:tentative="1">
+      <w:start w:val="1"/>
+      <w:numFmt w:val="lowerLetter"/>
+      <w:lvlText w:val="%2."/>
+      <w:lvlJc w:val="left"/>
+      <w:pPr>
+        <w:ind w:left="1788" w:hanging="360"/>
+      </w:pPr>
+    </w:lvl>
+    <w:lvl w:ilvl="2" w:tplc="FFFFFFFF" w:tentative="1">
+      <w:start w:val="1"/>
+      <w:numFmt w:val="lowerRoman"/>
+      <w:lvlText w:val="%3."/>
+      <w:lvlJc w:val="right"/>
+      <w:pPr>
+        <w:ind w:left="2508" w:hanging="180"/>
+      </w:pPr>
+    </w:lvl>
+    <w:lvl w:ilvl="3" w:tplc="FFFFFFFF" w:tentative="1">
+      <w:start w:val="1"/>
+      <w:numFmt w:val="decimal"/>
+      <w:lvlText w:val="%4."/>
+      <w:lvlJc w:val="left"/>
+      <w:pPr>
+        <w:ind w:left="3228" w:hanging="360"/>
+      </w:pPr>
+    </w:lvl>
+    <w:lvl w:ilvl="4" w:tplc="FFFFFFFF" w:tentative="1">
+      <w:start w:val="1"/>
+      <w:numFmt w:val="lowerLetter"/>
+      <w:lvlText w:val="%5."/>
+      <w:lvlJc w:val="left"/>
+      <w:pPr>
+        <w:ind w:left="3948" w:hanging="360"/>
+      </w:pPr>
+    </w:lvl>
+    <w:lvl w:ilvl="5" w:tplc="FFFFFFFF" w:tentative="1">
+      <w:start w:val="1"/>
+      <w:numFmt w:val="lowerRoman"/>
+      <w:lvlText w:val="%6."/>
+      <w:lvlJc w:val="right"/>
+      <w:pPr>
+        <w:ind w:left="4668" w:hanging="180"/>
+      </w:pPr>
+    </w:lvl>
+    <w:lvl w:ilvl="6" w:tplc="FFFFFFFF" w:tentative="1">
+      <w:start w:val="1"/>
+      <w:numFmt w:val="decimal"/>
+      <w:lvlText w:val="%7."/>
+      <w:lvlJc w:val="left"/>
+      <w:pPr>
+        <w:ind w:left="5388" w:hanging="360"/>
+      </w:pPr>
+    </w:lvl>
+    <w:lvl w:ilvl="7" w:tplc="FFFFFFFF" w:tentative="1">
+      <w:start w:val="1"/>
+      <w:numFmt w:val="lowerLetter"/>
+      <w:lvlText w:val="%8."/>
+      <w:lvlJc w:val="left"/>
+      <w:pPr>
+        <w:ind w:left="6108" w:hanging="360"/>
+      </w:pPr>
+    </w:lvl>
+    <w:lvl w:ilvl="8" w:tplc="FFFFFFFF" w:tentative="1">
+      <w:start w:val="1"/>
+      <w:numFmt w:val="lowerRoman"/>
+      <w:lvlText w:val="%9."/>
+      <w:lvlJc w:val="right"/>
+      <w:pPr>
+        <w:ind w:left="6828" w:hanging="180"/>
+      </w:pPr>
+    </w:lvl>
+  </w:abstractNum>
+  <w:abstractNum w:abstractNumId="8" w15:restartNumberingAfterBreak="0">
     <w:nsid w:val="25322F1F"/>
     <w:multiLevelType w:val="hybridMultilevel"/>
     <w:tmpl w:val="D1EAACB4"/>
@@ -3719,7 +3504,7 @@
       </w:pPr>
     </w:lvl>
   </w:abstractNum>
-  <w:abstractNum w:abstractNumId="7" w15:restartNumberingAfterBreak="0">
+  <w:abstractNum w:abstractNumId="9" w15:restartNumberingAfterBreak="0">
     <w:nsid w:val="299B591D"/>
     <w:multiLevelType w:val="hybridMultilevel"/>
     <w:tmpl w:val="B79095BA"/>
@@ -3808,7 +3593,7 @@
       </w:pPr>
     </w:lvl>
   </w:abstractNum>
-  <w:abstractNum w:abstractNumId="8" w15:restartNumberingAfterBreak="0">
+  <w:abstractNum w:abstractNumId="10" w15:restartNumberingAfterBreak="0">
     <w:nsid w:val="2EAD69B2"/>
     <w:multiLevelType w:val="singleLevel"/>
     <w:tmpl w:val="4D90F492"/>
@@ -3823,7 +3608,7 @@
       </w:pPr>
     </w:lvl>
   </w:abstractNum>
-  <w:abstractNum w:abstractNumId="9" w15:restartNumberingAfterBreak="0">
+  <w:abstractNum w:abstractNumId="11" w15:restartNumberingAfterBreak="0">
     <w:nsid w:val="35BA63B1"/>
     <w:multiLevelType w:val="hybridMultilevel"/>
     <w:tmpl w:val="EEC4712A"/>
@@ -3912,7 +3697,7 @@
       </w:pPr>
     </w:lvl>
   </w:abstractNum>
-  <w:abstractNum w:abstractNumId="10" w15:restartNumberingAfterBreak="0">
+  <w:abstractNum w:abstractNumId="12" w15:restartNumberingAfterBreak="0">
     <w:nsid w:val="36A10E7F"/>
     <w:multiLevelType w:val="multilevel"/>
     <w:tmpl w:val="100A001F"/>
@@ -3998,7 +3783,7 @@
       </w:pPr>
     </w:lvl>
   </w:abstractNum>
-  <w:abstractNum w:abstractNumId="11" w15:restartNumberingAfterBreak="0">
+  <w:abstractNum w:abstractNumId="13" w15:restartNumberingAfterBreak="0">
     <w:nsid w:val="3D1D5239"/>
     <w:multiLevelType w:val="multilevel"/>
     <w:tmpl w:val="100A001F"/>
@@ -4084,7 +3869,7 @@
       </w:pPr>
     </w:lvl>
   </w:abstractNum>
-  <w:abstractNum w:abstractNumId="12" w15:restartNumberingAfterBreak="0">
+  <w:abstractNum w:abstractNumId="14" w15:restartNumberingAfterBreak="0">
     <w:nsid w:val="3D441E1C"/>
     <w:multiLevelType w:val="multilevel"/>
     <w:tmpl w:val="0409001F"/>
@@ -4173,7 +3958,7 @@
       </w:pPr>
     </w:lvl>
   </w:abstractNum>
-  <w:abstractNum w:abstractNumId="13" w15:restartNumberingAfterBreak="0">
+  <w:abstractNum w:abstractNumId="15" w15:restartNumberingAfterBreak="0">
     <w:nsid w:val="468E7701"/>
     <w:multiLevelType w:val="multilevel"/>
     <w:tmpl w:val="85A0DEC6"/>
@@ -4322,7 +4107,7 @@
       </w:rPr>
     </w:lvl>
   </w:abstractNum>
-  <w:abstractNum w:abstractNumId="14" w15:restartNumberingAfterBreak="0">
+  <w:abstractNum w:abstractNumId="16" w15:restartNumberingAfterBreak="0">
     <w:nsid w:val="48E424CF"/>
     <w:multiLevelType w:val="hybridMultilevel"/>
     <w:tmpl w:val="AE86E7B0"/>
@@ -4408,7 +4193,179 @@
       </w:pPr>
     </w:lvl>
   </w:abstractNum>
-  <w:abstractNum w:abstractNumId="15" w15:restartNumberingAfterBreak="0">
+  <w:abstractNum w:abstractNumId="17" w15:restartNumberingAfterBreak="0">
+    <w:nsid w:val="496F5E1A"/>
+    <w:multiLevelType w:val="hybridMultilevel"/>
+    <w:tmpl w:val="B2341BDC"/>
+    <w:lvl w:ilvl="0" w:tplc="100A000F">
+      <w:start w:val="1"/>
+      <w:numFmt w:val="decimal"/>
+      <w:lvlText w:val="%1."/>
+      <w:lvlJc w:val="left"/>
+      <w:pPr>
+        <w:ind w:left="720" w:hanging="360"/>
+      </w:pPr>
+    </w:lvl>
+    <w:lvl w:ilvl="1" w:tplc="100A0019" w:tentative="1">
+      <w:start w:val="1"/>
+      <w:numFmt w:val="lowerLetter"/>
+      <w:lvlText w:val="%2."/>
+      <w:lvlJc w:val="left"/>
+      <w:pPr>
+        <w:ind w:left="1440" w:hanging="360"/>
+      </w:pPr>
+    </w:lvl>
+    <w:lvl w:ilvl="2" w:tplc="100A001B" w:tentative="1">
+      <w:start w:val="1"/>
+      <w:numFmt w:val="lowerRoman"/>
+      <w:lvlText w:val="%3."/>
+      <w:lvlJc w:val="right"/>
+      <w:pPr>
+        <w:ind w:left="2160" w:hanging="180"/>
+      </w:pPr>
+    </w:lvl>
+    <w:lvl w:ilvl="3" w:tplc="100A000F" w:tentative="1">
+      <w:start w:val="1"/>
+      <w:numFmt w:val="decimal"/>
+      <w:lvlText w:val="%4."/>
+      <w:lvlJc w:val="left"/>
+      <w:pPr>
+        <w:ind w:left="2880" w:hanging="360"/>
+      </w:pPr>
+    </w:lvl>
+    <w:lvl w:ilvl="4" w:tplc="100A0019" w:tentative="1">
+      <w:start w:val="1"/>
+      <w:numFmt w:val="lowerLetter"/>
+      <w:lvlText w:val="%5."/>
+      <w:lvlJc w:val="left"/>
+      <w:pPr>
+        <w:ind w:left="3600" w:hanging="360"/>
+      </w:pPr>
+    </w:lvl>
+    <w:lvl w:ilvl="5" w:tplc="100A001B" w:tentative="1">
+      <w:start w:val="1"/>
+      <w:numFmt w:val="lowerRoman"/>
+      <w:lvlText w:val="%6."/>
+      <w:lvlJc w:val="right"/>
+      <w:pPr>
+        <w:ind w:left="4320" w:hanging="180"/>
+      </w:pPr>
+    </w:lvl>
+    <w:lvl w:ilvl="6" w:tplc="100A000F" w:tentative="1">
+      <w:start w:val="1"/>
+      <w:numFmt w:val="decimal"/>
+      <w:lvlText w:val="%7."/>
+      <w:lvlJc w:val="left"/>
+      <w:pPr>
+        <w:ind w:left="5040" w:hanging="360"/>
+      </w:pPr>
+    </w:lvl>
+    <w:lvl w:ilvl="7" w:tplc="100A0019" w:tentative="1">
+      <w:start w:val="1"/>
+      <w:numFmt w:val="lowerLetter"/>
+      <w:lvlText w:val="%8."/>
+      <w:lvlJc w:val="left"/>
+      <w:pPr>
+        <w:ind w:left="5760" w:hanging="360"/>
+      </w:pPr>
+    </w:lvl>
+    <w:lvl w:ilvl="8" w:tplc="100A001B" w:tentative="1">
+      <w:start w:val="1"/>
+      <w:numFmt w:val="lowerRoman"/>
+      <w:lvlText w:val="%9."/>
+      <w:lvlJc w:val="right"/>
+      <w:pPr>
+        <w:ind w:left="6480" w:hanging="180"/>
+      </w:pPr>
+    </w:lvl>
+  </w:abstractNum>
+  <w:abstractNum w:abstractNumId="18" w15:restartNumberingAfterBreak="0">
+    <w:nsid w:val="4A6C600E"/>
+    <w:multiLevelType w:val="hybridMultilevel"/>
+    <w:tmpl w:val="7D1E4B22"/>
+    <w:lvl w:ilvl="0" w:tplc="100A000F">
+      <w:start w:val="1"/>
+      <w:numFmt w:val="decimal"/>
+      <w:lvlText w:val="%1."/>
+      <w:lvlJc w:val="left"/>
+      <w:pPr>
+        <w:ind w:left="720" w:hanging="360"/>
+      </w:pPr>
+    </w:lvl>
+    <w:lvl w:ilvl="1" w:tplc="100A0019" w:tentative="1">
+      <w:start w:val="1"/>
+      <w:numFmt w:val="lowerLetter"/>
+      <w:lvlText w:val="%2."/>
+      <w:lvlJc w:val="left"/>
+      <w:pPr>
+        <w:ind w:left="1440" w:hanging="360"/>
+      </w:pPr>
+    </w:lvl>
+    <w:lvl w:ilvl="2" w:tplc="100A001B" w:tentative="1">
+      <w:start w:val="1"/>
+      <w:numFmt w:val="lowerRoman"/>
+      <w:lvlText w:val="%3."/>
+      <w:lvlJc w:val="right"/>
+      <w:pPr>
+        <w:ind w:left="2160" w:hanging="180"/>
+      </w:pPr>
+    </w:lvl>
+    <w:lvl w:ilvl="3" w:tplc="100A000F" w:tentative="1">
+      <w:start w:val="1"/>
+      <w:numFmt w:val="decimal"/>
+      <w:lvlText w:val="%4."/>
+      <w:lvlJc w:val="left"/>
+      <w:pPr>
+        <w:ind w:left="2880" w:hanging="360"/>
+      </w:pPr>
+    </w:lvl>
+    <w:lvl w:ilvl="4" w:tplc="100A0019" w:tentative="1">
+      <w:start w:val="1"/>
+      <w:numFmt w:val="lowerLetter"/>
+      <w:lvlText w:val="%5."/>
+      <w:lvlJc w:val="left"/>
+      <w:pPr>
+        <w:ind w:left="3600" w:hanging="360"/>
+      </w:pPr>
+    </w:lvl>
+    <w:lvl w:ilvl="5" w:tplc="100A001B" w:tentative="1">
+      <w:start w:val="1"/>
+      <w:numFmt w:val="lowerRoman"/>
+      <w:lvlText w:val="%6."/>
+      <w:lvlJc w:val="right"/>
+      <w:pPr>
+        <w:ind w:left="4320" w:hanging="180"/>
+      </w:pPr>
+    </w:lvl>
+    <w:lvl w:ilvl="6" w:tplc="100A000F" w:tentative="1">
+      <w:start w:val="1"/>
+      <w:numFmt w:val="decimal"/>
+      <w:lvlText w:val="%7."/>
+      <w:lvlJc w:val="left"/>
+      <w:pPr>
+        <w:ind w:left="5040" w:hanging="360"/>
+      </w:pPr>
+    </w:lvl>
+    <w:lvl w:ilvl="7" w:tplc="100A0019" w:tentative="1">
+      <w:start w:val="1"/>
+      <w:numFmt w:val="lowerLetter"/>
+      <w:lvlText w:val="%8."/>
+      <w:lvlJc w:val="left"/>
+      <w:pPr>
+        <w:ind w:left="5760" w:hanging="360"/>
+      </w:pPr>
+    </w:lvl>
+    <w:lvl w:ilvl="8" w:tplc="100A001B" w:tentative="1">
+      <w:start w:val="1"/>
+      <w:numFmt w:val="lowerRoman"/>
+      <w:lvlText w:val="%9."/>
+      <w:lvlJc w:val="right"/>
+      <w:pPr>
+        <w:ind w:left="6480" w:hanging="180"/>
+      </w:pPr>
+    </w:lvl>
+  </w:abstractNum>
+  <w:abstractNum w:abstractNumId="19" w15:restartNumberingAfterBreak="0">
     <w:nsid w:val="52526A3A"/>
     <w:multiLevelType w:val="hybridMultilevel"/>
     <w:tmpl w:val="BA7CCF6C"/>
@@ -4497,7 +4454,7 @@
       </w:pPr>
     </w:lvl>
   </w:abstractNum>
-  <w:abstractNum w:abstractNumId="16" w15:restartNumberingAfterBreak="0">
+  <w:abstractNum w:abstractNumId="20" w15:restartNumberingAfterBreak="0">
     <w:nsid w:val="55A97412"/>
     <w:multiLevelType w:val="hybridMultilevel"/>
     <w:tmpl w:val="63C8589A"/>
@@ -4583,7 +4540,7 @@
       </w:pPr>
     </w:lvl>
   </w:abstractNum>
-  <w:abstractNum w:abstractNumId="17" w15:restartNumberingAfterBreak="0">
+  <w:abstractNum w:abstractNumId="21" w15:restartNumberingAfterBreak="0">
     <w:nsid w:val="575232F7"/>
     <w:multiLevelType w:val="hybridMultilevel"/>
     <w:tmpl w:val="B79095BA"/>
@@ -4672,7 +4629,93 @@
       </w:pPr>
     </w:lvl>
   </w:abstractNum>
-  <w:abstractNum w:abstractNumId="18" w15:restartNumberingAfterBreak="0">
+  <w:abstractNum w:abstractNumId="22" w15:restartNumberingAfterBreak="0">
+    <w:nsid w:val="5B940F31"/>
+    <w:multiLevelType w:val="hybridMultilevel"/>
+    <w:tmpl w:val="F6E69FD4"/>
+    <w:lvl w:ilvl="0" w:tplc="100A000F">
+      <w:start w:val="1"/>
+      <w:numFmt w:val="decimal"/>
+      <w:lvlText w:val="%1."/>
+      <w:lvlJc w:val="left"/>
+      <w:pPr>
+        <w:ind w:left="720" w:hanging="360"/>
+      </w:pPr>
+    </w:lvl>
+    <w:lvl w:ilvl="1" w:tplc="100A0019" w:tentative="1">
+      <w:start w:val="1"/>
+      <w:numFmt w:val="lowerLetter"/>
+      <w:lvlText w:val="%2."/>
+      <w:lvlJc w:val="left"/>
+      <w:pPr>
+        <w:ind w:left="1440" w:hanging="360"/>
+      </w:pPr>
+    </w:lvl>
+    <w:lvl w:ilvl="2" w:tplc="100A001B" w:tentative="1">
+      <w:start w:val="1"/>
+      <w:numFmt w:val="lowerRoman"/>
+      <w:lvlText w:val="%3."/>
+      <w:lvlJc w:val="right"/>
+      <w:pPr>
+        <w:ind w:left="2160" w:hanging="180"/>
+      </w:pPr>
+    </w:lvl>
+    <w:lvl w:ilvl="3" w:tplc="100A000F" w:tentative="1">
+      <w:start w:val="1"/>
+      <w:numFmt w:val="decimal"/>
+      <w:lvlText w:val="%4."/>
+      <w:lvlJc w:val="left"/>
+      <w:pPr>
+        <w:ind w:left="2880" w:hanging="360"/>
+      </w:pPr>
+    </w:lvl>
+    <w:lvl w:ilvl="4" w:tplc="100A0019" w:tentative="1">
+      <w:start w:val="1"/>
+      <w:numFmt w:val="lowerLetter"/>
+      <w:lvlText w:val="%5."/>
+      <w:lvlJc w:val="left"/>
+      <w:pPr>
+        <w:ind w:left="3600" w:hanging="360"/>
+      </w:pPr>
+    </w:lvl>
+    <w:lvl w:ilvl="5" w:tplc="100A001B" w:tentative="1">
+      <w:start w:val="1"/>
+      <w:numFmt w:val="lowerRoman"/>
+      <w:lvlText w:val="%6."/>
+      <w:lvlJc w:val="right"/>
+      <w:pPr>
+        <w:ind w:left="4320" w:hanging="180"/>
+      </w:pPr>
+    </w:lvl>
+    <w:lvl w:ilvl="6" w:tplc="100A000F" w:tentative="1">
+      <w:start w:val="1"/>
+      <w:numFmt w:val="decimal"/>
+      <w:lvlText w:val="%7."/>
+      <w:lvlJc w:val="left"/>
+      <w:pPr>
+        <w:ind w:left="5040" w:hanging="360"/>
+      </w:pPr>
+    </w:lvl>
+    <w:lvl w:ilvl="7" w:tplc="100A0019" w:tentative="1">
+      <w:start w:val="1"/>
+      <w:numFmt w:val="lowerLetter"/>
+      <w:lvlText w:val="%8."/>
+      <w:lvlJc w:val="left"/>
+      <w:pPr>
+        <w:ind w:left="5760" w:hanging="360"/>
+      </w:pPr>
+    </w:lvl>
+    <w:lvl w:ilvl="8" w:tplc="100A001B" w:tentative="1">
+      <w:start w:val="1"/>
+      <w:numFmt w:val="lowerRoman"/>
+      <w:lvlText w:val="%9."/>
+      <w:lvlJc w:val="right"/>
+      <w:pPr>
+        <w:ind w:left="6480" w:hanging="180"/>
+      </w:pPr>
+    </w:lvl>
+  </w:abstractNum>
+  <w:abstractNum w:abstractNumId="23" w15:restartNumberingAfterBreak="0">
     <w:nsid w:val="5BB27A70"/>
     <w:multiLevelType w:val="hybridMultilevel"/>
     <w:tmpl w:val="BF606EEA"/>
@@ -4758,7 +4801,93 @@
       </w:pPr>
     </w:lvl>
   </w:abstractNum>
-  <w:abstractNum w:abstractNumId="19" w15:restartNumberingAfterBreak="0">
+  <w:abstractNum w:abstractNumId="24" w15:restartNumberingAfterBreak="0">
+    <w:nsid w:val="60975B71"/>
+    <w:multiLevelType w:val="hybridMultilevel"/>
+    <w:tmpl w:val="89108E90"/>
+    <w:lvl w:ilvl="0" w:tplc="100A000F">
+      <w:start w:val="1"/>
+      <w:numFmt w:val="decimal"/>
+      <w:lvlText w:val="%1."/>
+      <w:lvlJc w:val="left"/>
+      <w:pPr>
+        <w:ind w:left="720" w:hanging="360"/>
+      </w:pPr>
+    </w:lvl>
+    <w:lvl w:ilvl="1" w:tplc="100A0019">
+      <w:start w:val="1"/>
+      <w:numFmt w:val="lowerLetter"/>
+      <w:lvlText w:val="%2."/>
+      <w:lvlJc w:val="left"/>
+      <w:pPr>
+        <w:ind w:left="1440" w:hanging="360"/>
+      </w:pPr>
+    </w:lvl>
+    <w:lvl w:ilvl="2" w:tplc="100A001B" w:tentative="1">
+      <w:start w:val="1"/>
+      <w:numFmt w:val="lowerRoman"/>
+      <w:lvlText w:val="%3."/>
+      <w:lvlJc w:val="right"/>
+      <w:pPr>
+        <w:ind w:left="2160" w:hanging="180"/>
+      </w:pPr>
+    </w:lvl>
+    <w:lvl w:ilvl="3" w:tplc="100A000F" w:tentative="1">
+      <w:start w:val="1"/>
+      <w:numFmt w:val="decimal"/>
+      <w:lvlText w:val="%4."/>
+      <w:lvlJc w:val="left"/>
+      <w:pPr>
+        <w:ind w:left="2880" w:hanging="360"/>
+      </w:pPr>
+    </w:lvl>
+    <w:lvl w:ilvl="4" w:tplc="100A0019" w:tentative="1">
+      <w:start w:val="1"/>
+      <w:numFmt w:val="lowerLetter"/>
+      <w:lvlText w:val="%5."/>
+      <w:lvlJc w:val="left"/>
+      <w:pPr>
+        <w:ind w:left="3600" w:hanging="360"/>
+      </w:pPr>
+    </w:lvl>
+    <w:lvl w:ilvl="5" w:tplc="100A001B" w:tentative="1">
+      <w:start w:val="1"/>
+      <w:numFmt w:val="lowerRoman"/>
+      <w:lvlText w:val="%6."/>
+      <w:lvlJc w:val="right"/>
+      <w:pPr>
+        <w:ind w:left="4320" w:hanging="180"/>
+      </w:pPr>
+    </w:lvl>
+    <w:lvl w:ilvl="6" w:tplc="100A000F" w:tentative="1">
+      <w:start w:val="1"/>
+      <w:numFmt w:val="decimal"/>
+      <w:lvlText w:val="%7."/>
+      <w:lvlJc w:val="left"/>
+      <w:pPr>
+        <w:ind w:left="5040" w:hanging="360"/>
+      </w:pPr>
+    </w:lvl>
+    <w:lvl w:ilvl="7" w:tplc="100A0019" w:tentative="1">
+      <w:start w:val="1"/>
+      <w:numFmt w:val="lowerLetter"/>
+      <w:lvlText w:val="%8."/>
+      <w:lvlJc w:val="left"/>
+      <w:pPr>
+        <w:ind w:left="5760" w:hanging="360"/>
+      </w:pPr>
+    </w:lvl>
+    <w:lvl w:ilvl="8" w:tplc="100A001B" w:tentative="1">
+      <w:start w:val="1"/>
+      <w:numFmt w:val="lowerRoman"/>
+      <w:lvlText w:val="%9."/>
+      <w:lvlJc w:val="right"/>
+      <w:pPr>
+        <w:ind w:left="6480" w:hanging="180"/>
+      </w:pPr>
+    </w:lvl>
+  </w:abstractNum>
+  <w:abstractNum w:abstractNumId="25" w15:restartNumberingAfterBreak="0">
     <w:nsid w:val="62FF188C"/>
     <w:multiLevelType w:val="hybridMultilevel"/>
     <w:tmpl w:val="B79095BA"/>
@@ -4847,7 +4976,93 @@
       </w:pPr>
     </w:lvl>
   </w:abstractNum>
-  <w:abstractNum w:abstractNumId="20" w15:restartNumberingAfterBreak="0">
+  <w:abstractNum w:abstractNumId="26" w15:restartNumberingAfterBreak="0">
+    <w:nsid w:val="675D26F5"/>
+    <w:multiLevelType w:val="multilevel"/>
+    <w:tmpl w:val="100A001F"/>
+    <w:lvl w:ilvl="0">
+      <w:start w:val="1"/>
+      <w:numFmt w:val="decimal"/>
+      <w:lvlText w:val="%1."/>
+      <w:lvlJc w:val="left"/>
+      <w:pPr>
+        <w:ind w:left="360" w:hanging="360"/>
+      </w:pPr>
+    </w:lvl>
+    <w:lvl w:ilvl="1">
+      <w:start w:val="1"/>
+      <w:numFmt w:val="decimal"/>
+      <w:lvlText w:val="%1.%2."/>
+      <w:lvlJc w:val="left"/>
+      <w:pPr>
+        <w:ind w:left="792" w:hanging="432"/>
+      </w:pPr>
+    </w:lvl>
+    <w:lvl w:ilvl="2">
+      <w:start w:val="1"/>
+      <w:numFmt w:val="decimal"/>
+      <w:lvlText w:val="%1.%2.%3."/>
+      <w:lvlJc w:val="left"/>
+      <w:pPr>
+        <w:ind w:left="1224" w:hanging="504"/>
+      </w:pPr>
+    </w:lvl>
+    <w:lvl w:ilvl="3">
+      <w:start w:val="1"/>
+      <w:numFmt w:val="decimal"/>
+      <w:lvlText w:val="%1.%2.%3.%4."/>
+      <w:lvlJc w:val="left"/>
+      <w:pPr>
+        <w:ind w:left="1728" w:hanging="648"/>
+      </w:pPr>
+    </w:lvl>
+    <w:lvl w:ilvl="4">
+      <w:start w:val="1"/>
+      <w:numFmt w:val="decimal"/>
+      <w:lvlText w:val="%1.%2.%3.%4.%5."/>
+      <w:lvlJc w:val="left"/>
+      <w:pPr>
+        <w:ind w:left="2232" w:hanging="792"/>
+      </w:pPr>
+    </w:lvl>
+    <w:lvl w:ilvl="5">
+      <w:start w:val="1"/>
+      <w:numFmt w:val="decimal"/>
+      <w:lvlText w:val="%1.%2.%3.%4.%5.%6."/>
+      <w:lvlJc w:val="left"/>
+      <w:pPr>
+        <w:ind w:left="2736" w:hanging="936"/>
+      </w:pPr>
+    </w:lvl>
+    <w:lvl w:ilvl="6">
+      <w:start w:val="1"/>
+      <w:numFmt w:val="decimal"/>
+      <w:lvlText w:val="%1.%2.%3.%4.%5.%6.%7."/>
+      <w:lvlJc w:val="left"/>
+      <w:pPr>
+        <w:ind w:left="3240" w:hanging="1080"/>
+      </w:pPr>
+    </w:lvl>
+    <w:lvl w:ilvl="7">
+      <w:start w:val="1"/>
+      <w:numFmt w:val="decimal"/>
+      <w:lvlText w:val="%1.%2.%3.%4.%5.%6.%7.%8."/>
+      <w:lvlJc w:val="left"/>
+      <w:pPr>
+        <w:ind w:left="3744" w:hanging="1224"/>
+      </w:pPr>
+    </w:lvl>
+    <w:lvl w:ilvl="8">
+      <w:start w:val="1"/>
+      <w:numFmt w:val="decimal"/>
+      <w:lvlText w:val="%1.%2.%3.%4.%5.%6.%7.%8.%9."/>
+      <w:lvlJc w:val="left"/>
+      <w:pPr>
+        <w:ind w:left="4320" w:hanging="1440"/>
+      </w:pPr>
+    </w:lvl>
+  </w:abstractNum>
+  <w:abstractNum w:abstractNumId="27" w15:restartNumberingAfterBreak="0">
     <w:nsid w:val="676024BB"/>
     <w:multiLevelType w:val="hybridMultilevel"/>
     <w:tmpl w:val="48C05D68"/>
@@ -4936,7 +5151,93 @@
       </w:pPr>
     </w:lvl>
   </w:abstractNum>
-  <w:abstractNum w:abstractNumId="21" w15:restartNumberingAfterBreak="0">
+  <w:abstractNum w:abstractNumId="28" w15:restartNumberingAfterBreak="0">
+    <w:nsid w:val="69361975"/>
+    <w:multiLevelType w:val="hybridMultilevel"/>
+    <w:tmpl w:val="B5B8F1FC"/>
+    <w:lvl w:ilvl="0" w:tplc="100A000F">
+      <w:start w:val="1"/>
+      <w:numFmt w:val="decimal"/>
+      <w:lvlText w:val="%1."/>
+      <w:lvlJc w:val="left"/>
+      <w:pPr>
+        <w:ind w:left="720" w:hanging="360"/>
+      </w:pPr>
+    </w:lvl>
+    <w:lvl w:ilvl="1" w:tplc="100A0019" w:tentative="1">
+      <w:start w:val="1"/>
+      <w:numFmt w:val="lowerLetter"/>
+      <w:lvlText w:val="%2."/>
+      <w:lvlJc w:val="left"/>
+      <w:pPr>
+        <w:ind w:left="1440" w:hanging="360"/>
+      </w:pPr>
+    </w:lvl>
+    <w:lvl w:ilvl="2" w:tplc="100A001B" w:tentative="1">
+      <w:start w:val="1"/>
+      <w:numFmt w:val="lowerRoman"/>
+      <w:lvlText w:val="%3."/>
+      <w:lvlJc w:val="right"/>
+      <w:pPr>
+        <w:ind w:left="2160" w:hanging="180"/>
+      </w:pPr>
+    </w:lvl>
+    <w:lvl w:ilvl="3" w:tplc="100A000F" w:tentative="1">
+      <w:start w:val="1"/>
+      <w:numFmt w:val="decimal"/>
+      <w:lvlText w:val="%4."/>
+      <w:lvlJc w:val="left"/>
+      <w:pPr>
+        <w:ind w:left="2880" w:hanging="360"/>
+      </w:pPr>
+    </w:lvl>
+    <w:lvl w:ilvl="4" w:tplc="100A0019" w:tentative="1">
+      <w:start w:val="1"/>
+      <w:numFmt w:val="lowerLetter"/>
+      <w:lvlText w:val="%5."/>
+      <w:lvlJc w:val="left"/>
+      <w:pPr>
+        <w:ind w:left="3600" w:hanging="360"/>
+      </w:pPr>
+    </w:lvl>
+    <w:lvl w:ilvl="5" w:tplc="100A001B" w:tentative="1">
+      <w:start w:val="1"/>
+      <w:numFmt w:val="lowerRoman"/>
+      <w:lvlText w:val="%6."/>
+      <w:lvlJc w:val="right"/>
+      <w:pPr>
+        <w:ind w:left="4320" w:hanging="180"/>
+      </w:pPr>
+    </w:lvl>
+    <w:lvl w:ilvl="6" w:tplc="100A000F" w:tentative="1">
+      <w:start w:val="1"/>
+      <w:numFmt w:val="decimal"/>
+      <w:lvlText w:val="%7."/>
+      <w:lvlJc w:val="left"/>
+      <w:pPr>
+        <w:ind w:left="5040" w:hanging="360"/>
+      </w:pPr>
+    </w:lvl>
+    <w:lvl w:ilvl="7" w:tplc="100A0019" w:tentative="1">
+      <w:start w:val="1"/>
+      <w:numFmt w:val="lowerLetter"/>
+      <w:lvlText w:val="%8."/>
+      <w:lvlJc w:val="left"/>
+      <w:pPr>
+        <w:ind w:left="5760" w:hanging="360"/>
+      </w:pPr>
+    </w:lvl>
+    <w:lvl w:ilvl="8" w:tplc="100A001B" w:tentative="1">
+      <w:start w:val="1"/>
+      <w:numFmt w:val="lowerRoman"/>
+      <w:lvlText w:val="%9."/>
+      <w:lvlJc w:val="right"/>
+      <w:pPr>
+        <w:ind w:left="6480" w:hanging="180"/>
+      </w:pPr>
+    </w:lvl>
+  </w:abstractNum>
+  <w:abstractNum w:abstractNumId="29" w15:restartNumberingAfterBreak="0">
     <w:nsid w:val="7F3851DA"/>
     <w:multiLevelType w:val="hybridMultilevel"/>
     <w:tmpl w:val="B79095BA"/>
@@ -5026,7 +5327,7 @@
     </w:lvl>
   </w:abstractNum>
   <w:num w:numId="1" w16cid:durableId="92675463">
-    <w:abstractNumId w:val="13"/>
+    <w:abstractNumId w:val="15"/>
   </w:num>
   <w:num w:numId="2" w16cid:durableId="9646972">
     <w:abstractNumId w:val="1"/>
@@ -5035,61 +5336,85 @@
     <w:abstractNumId w:val="0"/>
   </w:num>
   <w:num w:numId="4" w16cid:durableId="868878119">
+    <w:abstractNumId w:val="14"/>
+  </w:num>
+  <w:num w:numId="5" w16cid:durableId="317073932">
+    <w:abstractNumId w:val="10"/>
+  </w:num>
+  <w:num w:numId="6" w16cid:durableId="1314991140">
+    <w:abstractNumId w:val="6"/>
+  </w:num>
+  <w:num w:numId="7" w16cid:durableId="1803644919">
+    <w:abstractNumId w:val="4"/>
+  </w:num>
+  <w:num w:numId="8" w16cid:durableId="1285306350">
+    <w:abstractNumId w:val="20"/>
+  </w:num>
+  <w:num w:numId="9" w16cid:durableId="1608852186">
     <w:abstractNumId w:val="12"/>
   </w:num>
-  <w:num w:numId="5" w16cid:durableId="317073932">
+  <w:num w:numId="10" w16cid:durableId="318776908">
+    <w:abstractNumId w:val="3"/>
+  </w:num>
+  <w:num w:numId="11" w16cid:durableId="942229777">
+    <w:abstractNumId w:val="16"/>
+  </w:num>
+  <w:num w:numId="12" w16cid:durableId="1584804162">
+    <w:abstractNumId w:val="19"/>
+  </w:num>
+  <w:num w:numId="13" w16cid:durableId="1070425762">
+    <w:abstractNumId w:val="5"/>
+  </w:num>
+  <w:num w:numId="14" w16cid:durableId="869076511">
+    <w:abstractNumId w:val="11"/>
+  </w:num>
+  <w:num w:numId="15" w16cid:durableId="829365271">
+    <w:abstractNumId w:val="23"/>
+  </w:num>
+  <w:num w:numId="16" w16cid:durableId="71590705">
+    <w:abstractNumId w:val="27"/>
+  </w:num>
+  <w:num w:numId="17" w16cid:durableId="2040163226">
+    <w:abstractNumId w:val="13"/>
+  </w:num>
+  <w:num w:numId="18" w16cid:durableId="86076378">
     <w:abstractNumId w:val="8"/>
   </w:num>
-  <w:num w:numId="6" w16cid:durableId="1314991140">
-    <w:abstractNumId w:val="5"/>
+  <w:num w:numId="19" w16cid:durableId="1497067419">
+    <w:abstractNumId w:val="21"/>
   </w:num>
-  <w:num w:numId="7" w16cid:durableId="1803644919">
-    <w:abstractNumId w:val="3"/>
+  <w:num w:numId="20" w16cid:durableId="2015573296">
+    <w:abstractNumId w:val="25"/>
   </w:num>
-  <w:num w:numId="8" w16cid:durableId="1285306350">
-    <w:abstractNumId w:val="16"/>
+  <w:num w:numId="21" w16cid:durableId="1746338517">
+    <w:abstractNumId w:val="9"/>
   </w:num>
-  <w:num w:numId="9" w16cid:durableId="1608852186">
-    <w:abstractNumId w:val="10"/>
+  <w:num w:numId="22" w16cid:durableId="1273784354">
+    <w:abstractNumId w:val="29"/>
   </w:num>
-  <w:num w:numId="10" w16cid:durableId="318776908">
+  <w:num w:numId="23" w16cid:durableId="1807972318">
+    <w:abstractNumId w:val="7"/>
+  </w:num>
+  <w:num w:numId="24" w16cid:durableId="862672917">
+    <w:abstractNumId w:val="26"/>
+  </w:num>
+  <w:num w:numId="25" w16cid:durableId="1020621747">
+    <w:abstractNumId w:val="28"/>
+  </w:num>
+  <w:num w:numId="26" w16cid:durableId="559022995">
+    <w:abstractNumId w:val="24"/>
+  </w:num>
+  <w:num w:numId="27" w16cid:durableId="1691906828">
+    <w:abstractNumId w:val="22"/>
+  </w:num>
+  <w:num w:numId="28" w16cid:durableId="1168522303">
     <w:abstractNumId w:val="2"/>
   </w:num>
-  <w:num w:numId="11" w16cid:durableId="942229777">
-    <w:abstractNumId w:val="14"/>
-  </w:num>
-  <w:num w:numId="12" w16cid:durableId="1584804162">
-    <w:abstractNumId w:val="15"/>
-  </w:num>
-  <w:num w:numId="13" w16cid:durableId="1070425762">
-    <w:abstractNumId w:val="4"/>
-  </w:num>
-  <w:num w:numId="14" w16cid:durableId="869076511">
-    <w:abstractNumId w:val="9"/>
-  </w:num>
-  <w:num w:numId="15" w16cid:durableId="829365271">
+  <w:num w:numId="29" w16cid:durableId="765341727">
     <w:abstractNumId w:val="18"/>
   </w:num>
-  <w:num w:numId="16" w16cid:durableId="71590705">
-    <w:abstractNumId w:val="20"/>
-  </w:num>
-  <w:num w:numId="17" w16cid:durableId="2040163226">
-    <w:abstractNumId w:val="11"/>
-  </w:num>
-  <w:num w:numId="18" w16cid:durableId="86076378">
-    <w:abstractNumId w:val="6"/>
-  </w:num>
-  <w:num w:numId="19" w16cid:durableId="1497067419">
+  <w:num w:numId="30" w16cid:durableId="1560437231">
     <w:abstractNumId w:val="17"/>
-  </w:num>
-  <w:num w:numId="20" w16cid:durableId="2015573296">
-    <w:abstractNumId w:val="19"/>
-  </w:num>
-  <w:num w:numId="21" w16cid:durableId="1746338517">
-    <w:abstractNumId w:val="7"/>
-  </w:num>
-  <w:num w:numId="22" w16cid:durableId="1273784354">
-    <w:abstractNumId w:val="21"/>
   </w:num>
 </w:numbering>
 </file>
@@ -5100,7 +5425,7 @@
     <w:rPrDefault>
       <w:rPr>
         <w:rFonts w:ascii="Times New Roman" w:eastAsia="Times New Roman" w:hAnsi="Times New Roman" w:cs="Times New Roman"/>
-        <w:lang w:val="es-MX" w:eastAsia="es-MX" w:bidi="ar-SA"/>
+        <w:lang w:val="es-GT" w:eastAsia="es-GT" w:bidi="ar-SA"/>
       </w:rPr>
     </w:rPrDefault>
     <w:pPrDefault/>

</xml_diff>